<commit_message>
test+docs: Onboarding-Tour aufnehmen — Tests + Word-Doku-Section
</commit_message>
<xml_diff>
--- a/Yoga-mit-Sarah-Anwendungsfaelle.docx
+++ b/Yoga-mit-Sarah-Anwendungsfaelle.docx
@@ -1993,6 +1993,647 @@
           <w:szCs w:val="22"/>
         </w:rPr>
         <w:t xml:space="preserve">Genauer Wortlaut des AGB-Update-Dialogs ist im Code an mehreren Stellen unterschiedlich formuliert. Bitte einmal final festlegen.</w:t>
+      </w:r>
+    </w:p>
+    <w:p>
+      <w:pPr>
+        <w:pBdr>
+          <w:top w:val="single" w:color="cccccc" w:sz="4"/>
+        </w:pBdr>
+        <w:spacing w:after="240" w:before="120"/>
+      </w:pPr>
+      <w:sdt>
+        <w:sdtPr>
+          <w:alias w:val="Verhalten OK"/>
+          <w14:checkbox>
+            <w14:checked w14:val="0"/>
+            <w14:checkedState w14:val="2612" w14:font="MS Gothic"/>
+            <w14:uncheckedState w14:val="2610" w14:font="MS Gothic"/>
+          </w14:checkbox>
+        </w:sdtPr>
+        <w:sdtContent>
+          <w:r>
+            <w:sym w:char="2610" w:font="MS Gothic"/>
+          </w:r>
+        </w:sdtContent>
+      </w:sdt>
+      <w:r>
+        <w:rPr>
+          <w:rFonts w:ascii="Arial" w:cs="Arial" w:eastAsia="Arial" w:hAnsi="Arial"/>
+          <w:sz w:val="22"/>
+          <w:szCs w:val="22"/>
+        </w:rPr>
+        <w:t xml:space="preserve"> Verhalten entspricht meiner Vorstellung     </w:t>
+      </w:r>
+      <w:sdt>
+        <w:sdtPr>
+          <w:alias w:val="Anpassung"/>
+          <w14:checkbox>
+            <w14:checked w14:val="0"/>
+            <w14:checkedState w14:val="2612" w14:font="MS Gothic"/>
+            <w14:uncheckedState w14:val="2610" w14:font="MS Gothic"/>
+          </w14:checkbox>
+        </w:sdtPr>
+        <w:sdtContent>
+          <w:r>
+            <w:sym w:char="2610" w:font="MS Gothic"/>
+          </w:r>
+        </w:sdtContent>
+      </w:sdt>
+      <w:r>
+        <w:rPr>
+          <w:rFonts w:ascii="Arial" w:cs="Arial" w:eastAsia="Arial" w:hAnsi="Arial"/>
+          <w:sz w:val="22"/>
+          <w:szCs w:val="22"/>
+        </w:rPr>
+        <w:t xml:space="preserve"> Anpassung nötig: ___________________________</w:t>
+      </w:r>
+    </w:p>
+    <w:p>
+      <w:pPr>
+        <w:pStyle w:val="Heading2"/>
+        <w:spacing w:after="100" w:before="240"/>
+      </w:pPr>
+      <w:r>
+        <w:rPr>
+          <w:rFonts w:ascii="Arial" w:cs="Arial" w:eastAsia="Arial" w:hAnsi="Arial"/>
+          <w:b/>
+          <w:bCs/>
+          <w:color w:val="8a6020"/>
+          <w:sz w:val="26"/>
+          <w:szCs w:val="26"/>
+        </w:rPr>
+        <w:t xml:space="preserve">Onboarding-Tour (erste Anmeldung)</w:t>
+      </w:r>
+    </w:p>
+    <w:tbl>
+      <w:tblPr>
+        <w:tblW w:type="pct" w:w="100%"/>
+        <w:tblBorders>
+          <w:top w:val="single" w:color="auto" w:sz="4"/>
+          <w:left w:val="single" w:color="auto" w:sz="4"/>
+          <w:bottom w:val="single" w:color="auto" w:sz="4"/>
+          <w:right w:val="single" w:color="auto" w:sz="4"/>
+          <w:insideH w:val="single" w:color="auto" w:sz="4"/>
+          <w:insideV w:val="single" w:color="auto" w:sz="4"/>
+        </w:tblBorders>
+      </w:tblPr>
+      <w:tblGrid>
+        <w:gridCol w:w="100"/>
+        <w:gridCol w:w="100"/>
+      </w:tblGrid>
+      <w:tr>
+        <w:tc>
+          <w:tcPr>
+            <w:tcW w:type="pct" w:w="28%"/>
+            <w:shd w:fill="f5f2f0" w:color="f5f2f0" w:val="solid"/>
+          </w:tcPr>
+          <w:p>
+            <w:r>
+              <w:rPr>
+                <w:rFonts w:ascii="Arial" w:cs="Arial" w:eastAsia="Arial" w:hAnsi="Arial"/>
+                <w:b/>
+                <w:bCs/>
+                <w:sz w:val="22"/>
+                <w:szCs w:val="22"/>
+              </w:rPr>
+              <w:t xml:space="preserve">Was</w:t>
+            </w:r>
+          </w:p>
+        </w:tc>
+        <w:tc>
+          <w:tcPr>
+            <w:tcW w:type="pct" w:w="72%"/>
+          </w:tcPr>
+          <w:p>
+            <w:r>
+              <w:rPr>
+                <w:rFonts w:ascii="Arial" w:cs="Arial" w:eastAsia="Arial" w:hAnsi="Arial"/>
+                <w:sz w:val="22"/>
+                <w:szCs w:val="22"/>
+              </w:rPr>
+              <w:t xml:space="preserve">Nach Registrierung und AGB-Akzeptanz erscheint beim ersten Aufruf der Wochenübersicht eine 5-stufige Tour, die dem neuen Yogi die App-Struktur erklärt. Wird einmalig gezeigt — danach nie wieder.</w:t>
+            </w:r>
+          </w:p>
+        </w:tc>
+      </w:tr>
+      <w:tr>
+        <w:tc>
+          <w:tcPr>
+            <w:tcW w:type="pct" w:w="28%"/>
+            <w:shd w:fill="f5f2f0" w:color="f5f2f0" w:val="solid"/>
+          </w:tcPr>
+          <w:p>
+            <w:r>
+              <w:rPr>
+                <w:rFonts w:ascii="Arial" w:cs="Arial" w:eastAsia="Arial" w:hAnsi="Arial"/>
+                <w:b/>
+                <w:bCs/>
+                <w:sz w:val="22"/>
+                <w:szCs w:val="22"/>
+              </w:rPr>
+              <w:t xml:space="preserve">Wer</w:t>
+            </w:r>
+          </w:p>
+        </w:tc>
+        <w:tc>
+          <w:tcPr>
+            <w:tcW w:type="pct" w:w="72%"/>
+          </w:tcPr>
+          <w:p>
+            <w:r>
+              <w:rPr>
+                <w:rFonts w:ascii="Arial" w:cs="Arial" w:eastAsia="Arial" w:hAnsi="Arial"/>
+                <w:sz w:val="22"/>
+                <w:szCs w:val="22"/>
+              </w:rPr>
+              <w:t xml:space="preserve">Yogi (frisch registriert, kein Admin)</w:t>
+            </w:r>
+          </w:p>
+        </w:tc>
+      </w:tr>
+    </w:tbl>
+    <w:p>
+      <w:pPr>
+        <w:spacing w:after="80"/>
+      </w:pPr>
+      <w:r>
+        <w:rPr>
+          <w:rFonts w:ascii="Arial" w:cs="Arial" w:eastAsia="Arial" w:hAnsi="Arial"/>
+          <w:b/>
+          <w:bCs/>
+          <w:sz w:val="22"/>
+          <w:szCs w:val="22"/>
+        </w:rPr>
+        <w:t xml:space="preserve">Ablauf: </w:t>
+      </w:r>
+      <w:r>
+        <w:rPr>
+          <w:rFonts w:ascii="Arial" w:cs="Arial" w:eastAsia="Arial" w:hAnsi="Arial"/>
+          <w:sz w:val="22"/>
+          <w:szCs w:val="22"/>
+        </w:rPr>
+        <w:t xml:space="preserve"/>
+      </w:r>
+    </w:p>
+    <w:p>
+      <w:pPr>
+        <w:pStyle w:val="ListParagraph"/>
+        <w:numPr>
+          <w:ilvl w:val="0"/>
+          <w:numId w:val="1"/>
+        </w:numPr>
+        <w:spacing w:after="40"/>
+      </w:pPr>
+      <w:r>
+        <w:rPr>
+          <w:rFonts w:ascii="Arial" w:cs="Arial" w:eastAsia="Arial" w:hAnsi="Arial"/>
+          <w:sz w:val="22"/>
+          <w:szCs w:val="22"/>
+        </w:rPr>
+        <w:t xml:space="preserve">Yogi loggt sich nach Einladung/Registrierung das erste Mal ein und landet auf der Wochenübersicht (/kurse).</w:t>
+      </w:r>
+    </w:p>
+    <w:p>
+      <w:pPr>
+        <w:pStyle w:val="ListParagraph"/>
+        <w:numPr>
+          <w:ilvl w:val="0"/>
+          <w:numId w:val="1"/>
+        </w:numPr>
+        <w:spacing w:after="40"/>
+      </w:pPr>
+      <w:r>
+        <w:rPr>
+          <w:rFonts w:ascii="Arial" w:cs="Arial" w:eastAsia="Arial" w:hAnsi="Arial"/>
+          <w:sz w:val="22"/>
+          <w:szCs w:val="22"/>
+        </w:rPr>
+        <w:t xml:space="preserve">Wenn im Profil onboarding_completed = false (Default fuer neue Yogis) und Yogi kein Admin ist: Overlay mit 5 Slides erscheint.</w:t>
+      </w:r>
+    </w:p>
+    <w:p>
+      <w:pPr>
+        <w:pStyle w:val="ListParagraph"/>
+        <w:numPr>
+          <w:ilvl w:val="0"/>
+          <w:numId w:val="1"/>
+        </w:numPr>
+        <w:spacing w:after="40"/>
+      </w:pPr>
+      <w:r>
+        <w:rPr>
+          <w:rFonts w:ascii="Arial" w:cs="Arial" w:eastAsia="Arial" w:hAnsi="Arial"/>
+          <w:sz w:val="22"/>
+          <w:szCs w:val="22"/>
+        </w:rPr>
+        <w:t xml:space="preserve">Oben: Schritt-Indikator (z.B. „Schritt 1 von 5") + „Überspringen"-Link rechts. Darunter Fortschritts-Punkte.</w:t>
+      </w:r>
+    </w:p>
+    <w:p>
+      <w:pPr>
+        <w:pStyle w:val="ListParagraph"/>
+        <w:numPr>
+          <w:ilvl w:val="0"/>
+          <w:numId w:val="1"/>
+        </w:numPr>
+        <w:spacing w:after="40"/>
+      </w:pPr>
+      <w:r>
+        <w:rPr>
+          <w:rFonts w:ascii="Arial" w:cs="Arial" w:eastAsia="Arial" w:hAnsi="Arial"/>
+          <w:sz w:val="22"/>
+          <w:szCs w:val="22"/>
+        </w:rPr>
+        <w:t xml:space="preserve">Mitte: Icon, Titel, kleine gelbe Tab-Hinweis-Pille, Beschreibungstext.</w:t>
+      </w:r>
+    </w:p>
+    <w:p>
+      <w:pPr>
+        <w:pStyle w:val="ListParagraph"/>
+        <w:numPr>
+          <w:ilvl w:val="0"/>
+          <w:numId w:val="1"/>
+        </w:numPr>
+        <w:spacing w:after="40"/>
+      </w:pPr>
+      <w:r>
+        <w:rPr>
+          <w:rFonts w:ascii="Arial" w:cs="Arial" w:eastAsia="Arial" w:hAnsi="Arial"/>
+          <w:sz w:val="22"/>
+          <w:szCs w:val="22"/>
+        </w:rPr>
+        <w:t xml:space="preserve">Unten: ab Slide 2 Zurück- und Weiter-Button (gleich breit, nebeneinander). Auf Slide 5 statt Weiter der grüne „Los geht’s!"-Button.</w:t>
+      </w:r>
+    </w:p>
+    <w:p>
+      <w:pPr>
+        <w:pStyle w:val="ListParagraph"/>
+        <w:numPr>
+          <w:ilvl w:val="0"/>
+          <w:numId w:val="1"/>
+        </w:numPr>
+        <w:spacing w:after="40"/>
+      </w:pPr>
+      <w:r>
+        <w:rPr>
+          <w:rFonts w:ascii="Arial" w:cs="Arial" w:eastAsia="Arial" w:hAnsi="Arial"/>
+          <w:sz w:val="22"/>
+          <w:szCs w:val="22"/>
+        </w:rPr>
+        <w:t xml:space="preserve">Klick auf „Los geht’s!" oder „Überspringen": profiles.onboarding_completed wird auf true gesetzt, Overlay schließt.</w:t>
+      </w:r>
+    </w:p>
+    <w:p>
+      <w:pPr>
+        <w:spacing w:after="80"/>
+      </w:pPr>
+      <w:r>
+        <w:rPr>
+          <w:rFonts w:ascii="Arial" w:cs="Arial" w:eastAsia="Arial" w:hAnsi="Arial"/>
+          <w:b/>
+          <w:bCs/>
+          <w:sz w:val="22"/>
+          <w:szCs w:val="22"/>
+        </w:rPr>
+        <w:t xml:space="preserve">Regeln &amp; Grenzen: </w:t>
+      </w:r>
+      <w:r>
+        <w:rPr>
+          <w:rFonts w:ascii="Arial" w:cs="Arial" w:eastAsia="Arial" w:hAnsi="Arial"/>
+          <w:sz w:val="22"/>
+          <w:szCs w:val="22"/>
+        </w:rPr>
+        <w:t xml:space="preserve"/>
+      </w:r>
+    </w:p>
+    <w:p>
+      <w:pPr>
+        <w:pStyle w:val="ListParagraph"/>
+        <w:numPr>
+          <w:ilvl w:val="0"/>
+          <w:numId w:val="1"/>
+        </w:numPr>
+        <w:spacing w:after="40"/>
+      </w:pPr>
+      <w:r>
+        <w:rPr>
+          <w:rFonts w:ascii="Arial" w:cs="Arial" w:eastAsia="Arial" w:hAnsi="Arial"/>
+          <w:sz w:val="22"/>
+          <w:szCs w:val="22"/>
+        </w:rPr>
+        <w:t xml:space="preserve">Tour erscheint NUR fuer Yogis (nicht fuer Admin/Sarah).</w:t>
+      </w:r>
+    </w:p>
+    <w:p>
+      <w:pPr>
+        <w:pStyle w:val="ListParagraph"/>
+        <w:numPr>
+          <w:ilvl w:val="0"/>
+          <w:numId w:val="1"/>
+        </w:numPr>
+        <w:spacing w:after="40"/>
+      </w:pPr>
+      <w:r>
+        <w:rPr>
+          <w:rFonts w:ascii="Arial" w:cs="Arial" w:eastAsia="Arial" w:hAnsi="Arial"/>
+          <w:sz w:val="22"/>
+          <w:szCs w:val="22"/>
+        </w:rPr>
+        <w:t xml:space="preserve">Tour erscheint genau einmal — nach „Los geht’s!" oder „Überspringen" nie wieder automatisch.</w:t>
+      </w:r>
+    </w:p>
+    <w:p>
+      <w:pPr>
+        <w:pStyle w:val="ListParagraph"/>
+        <w:numPr>
+          <w:ilvl w:val="0"/>
+          <w:numId w:val="1"/>
+        </w:numPr>
+        <w:spacing w:after="40"/>
+      </w:pPr>
+      <w:r>
+        <w:rPr>
+          <w:rFonts w:ascii="Arial" w:cs="Arial" w:eastAsia="Arial" w:hAnsi="Arial"/>
+          <w:sz w:val="22"/>
+          <w:szCs w:val="22"/>
+        </w:rPr>
+        <w:t xml:space="preserve">Wenn der Yogi mitten in der Tour die Seite verlaesst (Reload, Tab schliesst): beim naechsten /kurse-Aufruf erscheint sie wieder — solange onboarding_completed = false.</w:t>
+      </w:r>
+    </w:p>
+    <w:p>
+      <w:pPr>
+        <w:pStyle w:val="ListParagraph"/>
+        <w:numPr>
+          <w:ilvl w:val="0"/>
+          <w:numId w:val="1"/>
+        </w:numPr>
+        <w:spacing w:after="40"/>
+      </w:pPr>
+      <w:r>
+        <w:rPr>
+          <w:rFonts w:ascii="Arial" w:cs="Arial" w:eastAsia="Arial" w:hAnsi="Arial"/>
+          <w:sz w:val="22"/>
+          <w:szCs w:val="22"/>
+        </w:rPr>
+        <w:t xml:space="preserve">Tour kann beliebig per „Zurück" / „Weiter" durchlaufen werden, ohne dass etwas gespeichert wird, bis am Ende ein Klick erfolgt.</w:t>
+      </w:r>
+    </w:p>
+    <w:p>
+      <w:pPr>
+        <w:spacing w:after="80"/>
+      </w:pPr>
+      <w:r>
+        <w:rPr>
+          <w:rFonts w:ascii="Arial" w:cs="Arial" w:eastAsia="Arial" w:hAnsi="Arial"/>
+          <w:b/>
+          <w:bCs/>
+          <w:sz w:val="22"/>
+          <w:szCs w:val="22"/>
+        </w:rPr>
+        <w:t xml:space="preserve">Angezeigte Texte: </w:t>
+      </w:r>
+      <w:r>
+        <w:rPr>
+          <w:rFonts w:ascii="Arial" w:cs="Arial" w:eastAsia="Arial" w:hAnsi="Arial"/>
+          <w:sz w:val="22"/>
+          <w:szCs w:val="22"/>
+        </w:rPr>
+        <w:t xml:space="preserve"/>
+      </w:r>
+    </w:p>
+    <w:p>
+      <w:pPr>
+        <w:spacing w:after="60"/>
+        <w:ind w:left="288"/>
+      </w:pPr>
+      <w:r>
+        <w:rPr>
+          <w:rFonts w:ascii="Arial" w:cs="Arial" w:eastAsia="Arial" w:hAnsi="Arial"/>
+          <w:i/>
+          <w:iCs/>
+          <w:color w:val="555555"/>
+          <w:sz w:val="22"/>
+          <w:szCs w:val="22"/>
+        </w:rPr>
+        <w:t xml:space="preserve">„Schritt 1 von 5"</w:t>
+      </w:r>
+    </w:p>
+    <w:p>
+      <w:pPr>
+        <w:spacing w:after="60"/>
+        <w:ind w:left="288"/>
+      </w:pPr>
+      <w:r>
+        <w:rPr>
+          <w:rFonts w:ascii="Arial" w:cs="Arial" w:eastAsia="Arial" w:hAnsi="Arial"/>
+          <w:i/>
+          <w:iCs/>
+          <w:color w:val="555555"/>
+          <w:sz w:val="22"/>
+          <w:szCs w:val="22"/>
+        </w:rPr>
+        <w:t xml:space="preserve">„Überspringen"</w:t>
+      </w:r>
+    </w:p>
+    <w:p>
+      <w:pPr>
+        <w:spacing w:after="60"/>
+        <w:ind w:left="288"/>
+      </w:pPr>
+      <w:r>
+        <w:rPr>
+          <w:rFonts w:ascii="Arial" w:cs="Arial" w:eastAsia="Arial" w:hAnsi="Arial"/>
+          <w:i/>
+          <w:iCs/>
+          <w:color w:val="555555"/>
+          <w:sz w:val="22"/>
+          <w:szCs w:val="22"/>
+        </w:rPr>
+        <w:t xml:space="preserve">„Zurück"</w:t>
+      </w:r>
+    </w:p>
+    <w:p>
+      <w:pPr>
+        <w:spacing w:after="60"/>
+        <w:ind w:left="288"/>
+      </w:pPr>
+      <w:r>
+        <w:rPr>
+          <w:rFonts w:ascii="Arial" w:cs="Arial" w:eastAsia="Arial" w:hAnsi="Arial"/>
+          <w:i/>
+          <w:iCs/>
+          <w:color w:val="555555"/>
+          <w:sz w:val="22"/>
+          <w:szCs w:val="22"/>
+        </w:rPr>
+        <w:t xml:space="preserve">„Weiter"</w:t>
+      </w:r>
+    </w:p>
+    <w:p>
+      <w:pPr>
+        <w:spacing w:after="60"/>
+        <w:ind w:left="288"/>
+      </w:pPr>
+      <w:r>
+        <w:rPr>
+          <w:rFonts w:ascii="Arial" w:cs="Arial" w:eastAsia="Arial" w:hAnsi="Arial"/>
+          <w:i/>
+          <w:iCs/>
+          <w:color w:val="555555"/>
+          <w:sz w:val="22"/>
+          <w:szCs w:val="22"/>
+        </w:rPr>
+        <w:t xml:space="preserve">„Los geht’s!"</w:t>
+      </w:r>
+    </w:p>
+    <w:p>
+      <w:pPr>
+        <w:spacing w:after="80"/>
+      </w:pPr>
+      <w:r>
+        <w:rPr>
+          <w:rFonts w:ascii="Arial" w:cs="Arial" w:eastAsia="Arial" w:hAnsi="Arial"/>
+          <w:b/>
+          <w:bCs/>
+          <w:sz w:val="22"/>
+          <w:szCs w:val="22"/>
+        </w:rPr>
+        <w:t xml:space="preserve">Sonderfälle &amp; Ausnahmen: </w:t>
+      </w:r>
+      <w:r>
+        <w:rPr>
+          <w:rFonts w:ascii="Arial" w:cs="Arial" w:eastAsia="Arial" w:hAnsi="Arial"/>
+          <w:sz w:val="22"/>
+          <w:szCs w:val="22"/>
+        </w:rPr>
+        <w:t xml:space="preserve"/>
+      </w:r>
+    </w:p>
+    <w:p>
+      <w:pPr>
+        <w:pStyle w:val="ListParagraph"/>
+        <w:numPr>
+          <w:ilvl w:val="0"/>
+          <w:numId w:val="1"/>
+        </w:numPr>
+        <w:spacing w:after="40"/>
+      </w:pPr>
+      <w:r>
+        <w:rPr>
+          <w:rFonts w:ascii="Arial" w:cs="Arial" w:eastAsia="Arial" w:hAnsi="Arial"/>
+          <w:sz w:val="22"/>
+          <w:szCs w:val="22"/>
+        </w:rPr>
+        <w:t xml:space="preserve">Slide 1 — Titel: „Wochenübersicht". Tab-Hinweis: „Tab „Kurse“ — unten links". Text: „Hier siehst du alle Stunden in einer Wochenübersicht. Mit den Pfeilen oder dem Datum oben wechselst du die Woche. Stunden in denen du angemeldet bist haben einen grünen Rahmen."</w:t>
+      </w:r>
+    </w:p>
+    <w:p>
+      <w:pPr>
+        <w:pStyle w:val="ListParagraph"/>
+        <w:numPr>
+          <w:ilvl w:val="0"/>
+          <w:numId w:val="1"/>
+        </w:numPr>
+        <w:spacing w:after="40"/>
+      </w:pPr>
+      <w:r>
+        <w:rPr>
+          <w:rFonts w:ascii="Arial" w:cs="Arial" w:eastAsia="Arial" w:hAnsi="Arial"/>
+          <w:sz w:val="22"/>
+          <w:szCs w:val="22"/>
+        </w:rPr>
+        <w:t xml:space="preserve">Slide 2 — Titel: „Deine Buchungen — und wie Credits entstehen". Tab-Hinweis: „Tab „Meine“ — dritter Tab unten". Text: „Unter „Meine“ findest du alle deine Kurse auf die Sarah dich eingetragen hat und deine Einzelstunden die du gebucht hast. Wenn du eine rechtzeitig (bis 3h vorher) absagst, bekommst du einen Credit zum Nachholen — den kannst du dann für eine andere Stunde nutzen."</w:t>
+      </w:r>
+    </w:p>
+    <w:p>
+      <w:pPr>
+        <w:pStyle w:val="ListParagraph"/>
+        <w:numPr>
+          <w:ilvl w:val="0"/>
+          <w:numId w:val="1"/>
+        </w:numPr>
+        <w:spacing w:after="40"/>
+      </w:pPr>
+      <w:r>
+        <w:rPr>
+          <w:rFonts w:ascii="Arial" w:cs="Arial" w:eastAsia="Arial" w:hAnsi="Arial"/>
+          <w:sz w:val="22"/>
+          <w:szCs w:val="22"/>
+        </w:rPr>
+        <w:t xml:space="preserve">Slide 3 — Titel: „Stunde buchen". Tab-Hinweis: „In „Kurse“ auf eine freie Stunde tippen". Text: „Klick einfach auf eine freie Stunde und wähle „Buchen“. Ein Credit wird automatisch verrechnet — du musst nichts weiter tun."</w:t>
+      </w:r>
+    </w:p>
+    <w:p>
+      <w:pPr>
+        <w:pStyle w:val="ListParagraph"/>
+        <w:numPr>
+          <w:ilvl w:val="0"/>
+          <w:numId w:val="1"/>
+        </w:numPr>
+        <w:spacing w:after="40"/>
+      </w:pPr>
+      <w:r>
+        <w:rPr>
+          <w:rFonts w:ascii="Arial" w:cs="Arial" w:eastAsia="Arial" w:hAnsi="Arial"/>
+          <w:sz w:val="22"/>
+          <w:szCs w:val="22"/>
+        </w:rPr>
+        <w:t xml:space="preserve">Slide 4 — Titel: „Volle Stunde? Kein Problem". Tab-Hinweis: „Tab „Warteliste“ — zweiter Tab unten". Text: „Trag dich auf die Warteliste ein — du wirst automatisch nachgerückt sobald ein Platz frei wird. Oder lass dich einfach nur benachrichtigen und entscheide dann ob du kommen willst."</w:t>
+      </w:r>
+    </w:p>
+    <w:p>
+      <w:pPr>
+        <w:pStyle w:val="ListParagraph"/>
+        <w:numPr>
+          <w:ilvl w:val="0"/>
+          <w:numId w:val="1"/>
+        </w:numPr>
+        <w:spacing w:after="40"/>
+      </w:pPr>
+      <w:r>
+        <w:rPr>
+          <w:rFonts w:ascii="Arial" w:cs="Arial" w:eastAsia="Arial" w:hAnsi="Arial"/>
+          <w:sz w:val="22"/>
+          <w:szCs w:val="22"/>
+        </w:rPr>
+        <w:t xml:space="preserve">Slide 5 — Titel: „App auf den Startbildschirm". Tab-Hinweis: „Profil → „Anleitung anzeigen“". Text: „Damit du die App wie eine echte App auf dem Handy hast: Wenn unten ein kleines „Installieren“-Fenster aufpoppt, einfach drauftippen. Falls nicht: geh in dein Profil und klick auf „Anleitung anzeigen“ — da steht für iPhone und Android wie es geht."</w:t>
+      </w:r>
+    </w:p>
+    <w:p>
+      <w:pPr>
+        <w:pStyle w:val="ListParagraph"/>
+        <w:numPr>
+          <w:ilvl w:val="0"/>
+          <w:numId w:val="1"/>
+        </w:numPr>
+        <w:spacing w:after="40"/>
+      </w:pPr>
+      <w:r>
+        <w:rPr>
+          <w:rFonts w:ascii="Arial" w:cs="Arial" w:eastAsia="Arial" w:hAnsi="Arial"/>
+          <w:sz w:val="22"/>
+          <w:szCs w:val="22"/>
+        </w:rPr>
+        <w:t xml:space="preserve">DB-Effekt: profiles.onboarding_completed wird auf true gesetzt sobald „Los geht’s!" oder „Überspringen" geklickt wird. Danach kein Re-Trigger mehr.</w:t>
+      </w:r>
+    </w:p>
+    <w:p>
+      <w:pPr>
+        <w:pStyle w:val="ListParagraph"/>
+        <w:numPr>
+          <w:ilvl w:val="0"/>
+          <w:numId w:val="1"/>
+        </w:numPr>
+        <w:spacing w:after="40"/>
+      </w:pPr>
+      <w:r>
+        <w:rPr>
+          <w:rFonts w:ascii="Arial" w:cs="Arial" w:eastAsia="Arial" w:hAnsi="Arial"/>
+          <w:sz w:val="22"/>
+          <w:szCs w:val="22"/>
+        </w:rPr>
+        <w:t xml:space="preserve">Re-Trigger fuer Tests: Admin kann das Flag manuell in der DB auf false setzen — beim naechsten /kurse-Aufruf erscheint die Tour wieder.</w:t>
       </w:r>
     </w:p>
     <w:p>

</xml_diff>

<commit_message>
feat(Welle G): Krankheits-Austragung mit Guthaben
Neuer Admin-Workflow: Yogi krankheitsbedingt aus Kurs austragen,
Guthaben ueber Reststunden ab Attest-Datum.

- DB: credits.source + enrollments.end_date/end_reason
- UI: Admin Yogi-Detail Button 'Wegen Krankheit austragen' + Modal
- Storniert zukuenftige Kurs-Bookings + Vorhol-Buchungen
- Vergibt Guthaben (10 Monate gueltig, NUR source='illness')
- Kursabbruch-Guthaben bleibt bei 2 Jahren (unveraendert)
- Email-Template illness_credit (Edge Function send-email v55)
- /meine: source-spezifische Labels + Restzeit-Anzeige
- 13 neue E2E-Smoke-Tests + Word-Doku ergaenzt

Co-Authored-By: Claude Opus 4.7 <noreply@anthropic.com>
</commit_message>
<xml_diff>
--- a/Yoga-mit-Sarah-Anwendungsfaelle.docx
+++ b/Yoga-mit-Sarah-Anwendungsfaelle.docx
@@ -30190,6 +30190,935 @@
           <w:sz w:val="32"/>
           <w:szCs w:val="32"/>
         </w:rPr>
+        <w:t xml:space="preserve">Welle G: Krankheits-Austragung mit Guthaben</w:t>
+      </w:r>
+    </w:p>
+    <w:p>
+      <w:pPr>
+        <w:pStyle w:val="Heading2"/>
+        <w:spacing w:after="100" w:before="240"/>
+      </w:pPr>
+      <w:r>
+        <w:rPr>
+          <w:rFonts w:ascii="Arial" w:cs="Arial" w:eastAsia="Arial" w:hAnsi="Arial"/>
+          <w:b/>
+          <w:bCs/>
+          <w:color w:val="8a6020"/>
+          <w:sz w:val="26"/>
+          <w:szCs w:val="26"/>
+        </w:rPr>
+        <w:t xml:space="preserve">Krankheits-Austragung: Yogi mit Attest aus Kurs nehmen</w:t>
+      </w:r>
+    </w:p>
+    <w:tbl>
+      <w:tblPr>
+        <w:tblW w:type="pct" w:w="100%"/>
+        <w:tblBorders>
+          <w:top w:val="single" w:color="auto" w:sz="4"/>
+          <w:left w:val="single" w:color="auto" w:sz="4"/>
+          <w:bottom w:val="single" w:color="auto" w:sz="4"/>
+          <w:right w:val="single" w:color="auto" w:sz="4"/>
+          <w:insideH w:val="single" w:color="auto" w:sz="4"/>
+          <w:insideV w:val="single" w:color="auto" w:sz="4"/>
+        </w:tblBorders>
+      </w:tblPr>
+      <w:tblGrid>
+        <w:gridCol w:w="100"/>
+        <w:gridCol w:w="100"/>
+      </w:tblGrid>
+      <w:tr>
+        <w:tc>
+          <w:tcPr>
+            <w:tcW w:type="pct" w:w="28%"/>
+            <w:shd w:fill="f5f2f0" w:color="f5f2f0" w:val="solid"/>
+          </w:tcPr>
+          <w:p>
+            <w:r>
+              <w:rPr>
+                <w:rFonts w:ascii="Arial" w:cs="Arial" w:eastAsia="Arial" w:hAnsi="Arial"/>
+                <w:b/>
+                <w:bCs/>
+                <w:sz w:val="22"/>
+                <w:szCs w:val="22"/>
+              </w:rPr>
+              <w:t xml:space="preserve">Was</w:t>
+            </w:r>
+          </w:p>
+        </w:tc>
+        <w:tc>
+          <w:tcPr>
+            <w:tcW w:type="pct" w:w="72%"/>
+          </w:tcPr>
+          <w:p>
+            <w:r>
+              <w:rPr>
+                <w:rFonts w:ascii="Arial" w:cs="Arial" w:eastAsia="Arial" w:hAnsi="Arial"/>
+                <w:sz w:val="22"/>
+                <w:szCs w:val="22"/>
+              </w:rPr>
+              <w:t xml:space="preserve">Sarah trägt einen Yogi krankheitsbedingt aus einem laufenden Kurs aus und vergibt ihm Guthaben über die noch ausstehenden Stunden ab dem Attest-Datum. Beispiel: Anna im Kurs „Body &amp; Mind" (10 Stunden), bringt Attest am 25.05. — ab dann werden ihr 5 Reststunden gutgeschrieben.</w:t>
+            </w:r>
+          </w:p>
+        </w:tc>
+      </w:tr>
+      <w:tr>
+        <w:tc>
+          <w:tcPr>
+            <w:tcW w:type="pct" w:w="28%"/>
+            <w:shd w:fill="f5f2f0" w:color="f5f2f0" w:val="solid"/>
+          </w:tcPr>
+          <w:p>
+            <w:r>
+              <w:rPr>
+                <w:rFonts w:ascii="Arial" w:cs="Arial" w:eastAsia="Arial" w:hAnsi="Arial"/>
+                <w:b/>
+                <w:bCs/>
+                <w:sz w:val="22"/>
+                <w:szCs w:val="22"/>
+              </w:rPr>
+              <w:t xml:space="preserve">Wer</w:t>
+            </w:r>
+          </w:p>
+        </w:tc>
+        <w:tc>
+          <w:tcPr>
+            <w:tcW w:type="pct" w:w="72%"/>
+          </w:tcPr>
+          <w:p>
+            <w:r>
+              <w:rPr>
+                <w:rFonts w:ascii="Arial" w:cs="Arial" w:eastAsia="Arial" w:hAnsi="Arial"/>
+                <w:sz w:val="22"/>
+                <w:szCs w:val="22"/>
+              </w:rPr>
+              <w:t xml:space="preserve">Admin (Sarah)</w:t>
+            </w:r>
+          </w:p>
+        </w:tc>
+      </w:tr>
+    </w:tbl>
+    <w:p>
+      <w:pPr>
+        <w:spacing w:after="80"/>
+      </w:pPr>
+      <w:r>
+        <w:rPr>
+          <w:rFonts w:ascii="Arial" w:cs="Arial" w:eastAsia="Arial" w:hAnsi="Arial"/>
+          <w:b/>
+          <w:bCs/>
+          <w:sz w:val="22"/>
+          <w:szCs w:val="22"/>
+        </w:rPr>
+        <w:t xml:space="preserve">Ablauf: </w:t>
+      </w:r>
+      <w:r>
+        <w:rPr>
+          <w:rFonts w:ascii="Arial" w:cs="Arial" w:eastAsia="Arial" w:hAnsi="Arial"/>
+          <w:sz w:val="22"/>
+          <w:szCs w:val="22"/>
+        </w:rPr>
+        <w:t xml:space="preserve"/>
+      </w:r>
+    </w:p>
+    <w:p>
+      <w:pPr>
+        <w:pStyle w:val="ListParagraph"/>
+        <w:numPr>
+          <w:ilvl w:val="0"/>
+          <w:numId w:val="1"/>
+        </w:numPr>
+        <w:spacing w:after="40"/>
+      </w:pPr>
+      <w:r>
+        <w:rPr>
+          <w:rFonts w:ascii="Arial" w:cs="Arial" w:eastAsia="Arial" w:hAnsi="Arial"/>
+          <w:sz w:val="22"/>
+          <w:szCs w:val="22"/>
+        </w:rPr>
+        <w:t xml:space="preserve">Sarah öffnet /admin/yogis/[id] und sieht im Block „Eingebuchte Kurse" pro aktivem Enrollment den Button „Wegen Krankheit austragen" (amber/medizinisches Kreuz-Icon).</w:t>
+      </w:r>
+    </w:p>
+    <w:p>
+      <w:pPr>
+        <w:pStyle w:val="ListParagraph"/>
+        <w:numPr>
+          <w:ilvl w:val="0"/>
+          <w:numId w:val="1"/>
+        </w:numPr>
+        <w:spacing w:after="40"/>
+      </w:pPr>
+      <w:r>
+        <w:rPr>
+          <w:rFonts w:ascii="Arial" w:cs="Arial" w:eastAsia="Arial" w:hAnsi="Arial"/>
+          <w:sz w:val="22"/>
+          <w:szCs w:val="22"/>
+        </w:rPr>
+        <w:t xml:space="preserve">Klick öffnet ein Modal mit Datum-Picker („Ab welchem Datum gilt das Attest?", Default: heute).</w:t>
+      </w:r>
+    </w:p>
+    <w:p>
+      <w:pPr>
+        <w:pStyle w:val="ListParagraph"/>
+        <w:numPr>
+          <w:ilvl w:val="0"/>
+          <w:numId w:val="1"/>
+        </w:numPr>
+        <w:spacing w:after="40"/>
+      </w:pPr>
+      <w:r>
+        <w:rPr>
+          <w:rFonts w:ascii="Arial" w:cs="Arial" w:eastAsia="Arial" w:hAnsi="Arial"/>
+          <w:sz w:val="22"/>
+          <w:szCs w:val="22"/>
+        </w:rPr>
+        <w:t xml:space="preserve">Sobald das Datum gewählt ist, wird live berechnet: „Es werden N Reststunden gutgeschrieben (Termine: …). Plus M offene Vorhol-/Nachholbuchungen werden storniert und verfallen ersatzlos."</w:t>
+      </w:r>
+    </w:p>
+    <w:p>
+      <w:pPr>
+        <w:pStyle w:val="ListParagraph"/>
+        <w:numPr>
+          <w:ilvl w:val="0"/>
+          <w:numId w:val="1"/>
+        </w:numPr>
+        <w:spacing w:after="40"/>
+      </w:pPr>
+      <w:r>
+        <w:rPr>
+          <w:rFonts w:ascii="Arial" w:cs="Arial" w:eastAsia="Arial" w:hAnsi="Arial"/>
+          <w:sz w:val="22"/>
+          <w:szCs w:val="22"/>
+        </w:rPr>
+        <w:t xml:space="preserve">Wenn Reststunden &lt; 4: weicher Warnhinweis „Achtung: weniger als 4 Stunden — AGB sieht 4-Stunden-Mindestgrenze vor. Trotzdem ausführen?" (lässt aber durch).</w:t>
+      </w:r>
+    </w:p>
+    <w:p>
+      <w:pPr>
+        <w:pStyle w:val="ListParagraph"/>
+        <w:numPr>
+          <w:ilvl w:val="0"/>
+          <w:numId w:val="1"/>
+        </w:numPr>
+        <w:spacing w:after="40"/>
+      </w:pPr>
+      <w:r>
+        <w:rPr>
+          <w:rFonts w:ascii="Arial" w:cs="Arial" w:eastAsia="Arial" w:hAnsi="Arial"/>
+          <w:sz w:val="22"/>
+          <w:szCs w:val="22"/>
+        </w:rPr>
+        <w:t xml:space="preserve">Pflicht-Checkbox: „Yogi hat Attest vorgelegt (ich habe es gesehen)" — sonst ist der Submit-Button deaktiviert.</w:t>
+      </w:r>
+    </w:p>
+    <w:p>
+      <w:pPr>
+        <w:pStyle w:val="ListParagraph"/>
+        <w:numPr>
+          <w:ilvl w:val="0"/>
+          <w:numId w:val="1"/>
+        </w:numPr>
+        <w:spacing w:after="40"/>
+      </w:pPr>
+      <w:r>
+        <w:rPr>
+          <w:rFonts w:ascii="Arial" w:cs="Arial" w:eastAsia="Arial" w:hAnsi="Arial"/>
+          <w:sz w:val="22"/>
+          <w:szCs w:val="22"/>
+        </w:rPr>
+        <w:t xml:space="preserve">Klick auf „Austragen + Guthaben vergeben" → System storniert alle zukünftigen Kurs-Bookings ab Attest-Datum (cancel_late=false), storniert alle offenen Vorhol-/Nachhol-Buchungen (cancel_late=true, ersatzlos), promotet Wartelisten für freigewordene Sessions, setzt enrollments.end_date + end_reason=„illness", legt neuen Credit an (model=„guthaben", source=„illness", total=N Reststunden, expires_at=Attest-Datum+10 Monate).</w:t>
+      </w:r>
+    </w:p>
+    <w:p>
+      <w:pPr>
+        <w:pStyle w:val="ListParagraph"/>
+        <w:numPr>
+          <w:ilvl w:val="0"/>
+          <w:numId w:val="1"/>
+        </w:numPr>
+        <w:spacing w:after="40"/>
+      </w:pPr>
+      <w:r>
+        <w:rPr>
+          <w:rFonts w:ascii="Arial" w:cs="Arial" w:eastAsia="Arial" w:hAnsi="Arial"/>
+          <w:sz w:val="22"/>
+          <w:szCs w:val="22"/>
+        </w:rPr>
+        <w:t xml:space="preserve">Audit-Log mit action=„admin_illness_credit" wird angelegt.</w:t>
+      </w:r>
+    </w:p>
+    <w:p>
+      <w:pPr>
+        <w:pStyle w:val="ListParagraph"/>
+        <w:numPr>
+          <w:ilvl w:val="0"/>
+          <w:numId w:val="1"/>
+        </w:numPr>
+        <w:spacing w:after="40"/>
+      </w:pPr>
+      <w:r>
+        <w:rPr>
+          <w:rFonts w:ascii="Arial" w:cs="Arial" w:eastAsia="Arial" w:hAnsi="Arial"/>
+          <w:sz w:val="22"/>
+          <w:szCs w:val="22"/>
+        </w:rPr>
+        <w:t xml:space="preserve">Email an Yogi (Template „illness_credit") wird versandt — keine separate Admin-Notification (nur Audit-Log).</w:t>
+      </w:r>
+    </w:p>
+    <w:p>
+      <w:pPr>
+        <w:spacing w:after="80"/>
+      </w:pPr>
+      <w:r>
+        <w:rPr>
+          <w:rFonts w:ascii="Arial" w:cs="Arial" w:eastAsia="Arial" w:hAnsi="Arial"/>
+          <w:b/>
+          <w:bCs/>
+          <w:sz w:val="22"/>
+          <w:szCs w:val="22"/>
+        </w:rPr>
+        <w:t xml:space="preserve">Regeln &amp; Grenzen: </w:t>
+      </w:r>
+      <w:r>
+        <w:rPr>
+          <w:rFonts w:ascii="Arial" w:cs="Arial" w:eastAsia="Arial" w:hAnsi="Arial"/>
+          <w:sz w:val="22"/>
+          <w:szCs w:val="22"/>
+        </w:rPr>
+        <w:t xml:space="preserve"/>
+      </w:r>
+    </w:p>
+    <w:p>
+      <w:pPr>
+        <w:pStyle w:val="ListParagraph"/>
+        <w:numPr>
+          <w:ilvl w:val="0"/>
+          <w:numId w:val="1"/>
+        </w:numPr>
+        <w:spacing w:after="40"/>
+      </w:pPr>
+      <w:r>
+        <w:rPr>
+          <w:rFonts w:ascii="Arial" w:cs="Arial" w:eastAsia="Arial" w:hAnsi="Arial"/>
+          <w:sz w:val="22"/>
+          <w:szCs w:val="22"/>
+        </w:rPr>
+        <w:t xml:space="preserve">Krankheits-Guthaben (source=„illness") ist 10 Monate ab Vergabe gültig.</w:t>
+      </w:r>
+    </w:p>
+    <w:p>
+      <w:pPr>
+        <w:pStyle w:val="ListParagraph"/>
+        <w:numPr>
+          <w:ilvl w:val="0"/>
+          <w:numId w:val="1"/>
+        </w:numPr>
+        <w:spacing w:after="40"/>
+      </w:pPr>
+      <w:r>
+        <w:rPr>
+          <w:rFonts w:ascii="Arial" w:cs="Arial" w:eastAsia="Arial" w:hAnsi="Arial"/>
+          <w:sz w:val="22"/>
+          <w:szCs w:val="22"/>
+        </w:rPr>
+        <w:t xml:space="preserve">Kursabbruch-Guthaben (source=„cancellation_choice" oder NULL) bleibt bei 2 Jahren — unverändert.</w:t>
+      </w:r>
+    </w:p>
+    <w:p>
+      <w:pPr>
+        <w:pStyle w:val="ListParagraph"/>
+        <w:numPr>
+          <w:ilvl w:val="0"/>
+          <w:numId w:val="1"/>
+        </w:numPr>
+        <w:spacing w:after="40"/>
+      </w:pPr>
+      <w:r>
+        <w:rPr>
+          <w:rFonts w:ascii="Arial" w:cs="Arial" w:eastAsia="Arial" w:hAnsi="Arial"/>
+          <w:sz w:val="22"/>
+          <w:szCs w:val="22"/>
+        </w:rPr>
+        <w:t xml:space="preserve">Bestehende Guthaben in der DB werden NICHT angefasst (Bestandsschutz).</w:t>
+      </w:r>
+    </w:p>
+    <w:p>
+      <w:pPr>
+        <w:pStyle w:val="ListParagraph"/>
+        <w:numPr>
+          <w:ilvl w:val="0"/>
+          <w:numId w:val="1"/>
+        </w:numPr>
+        <w:spacing w:after="40"/>
+      </w:pPr>
+      <w:r>
+        <w:rPr>
+          <w:rFonts w:ascii="Arial" w:cs="Arial" w:eastAsia="Arial" w:hAnsi="Arial"/>
+          <w:sz w:val="22"/>
+          <w:szCs w:val="22"/>
+        </w:rPr>
+        <w:t xml:space="preserve">Das Guthaben kann NUR mit der Buchung eines neuen Kurses verrechnet werden — keine Auszahlung in Geld, keine Verwendung für Einzelstunden.</w:t>
+      </w:r>
+    </w:p>
+    <w:p>
+      <w:pPr>
+        <w:pStyle w:val="ListParagraph"/>
+        <w:numPr>
+          <w:ilvl w:val="0"/>
+          <w:numId w:val="1"/>
+        </w:numPr>
+        <w:spacing w:after="40"/>
+      </w:pPr>
+      <w:r>
+        <w:rPr>
+          <w:rFonts w:ascii="Arial" w:cs="Arial" w:eastAsia="Arial" w:hAnsi="Arial"/>
+          <w:sz w:val="22"/>
+          <w:szCs w:val="22"/>
+        </w:rPr>
+        <w:t xml:space="preserve">Vorhol-/Nachholbuchungen werden ersatzlos beendet (cancel_late=true → kein Credit-Rückfluss).</w:t>
+      </w:r>
+    </w:p>
+    <w:p>
+      <w:pPr>
+        <w:pStyle w:val="ListParagraph"/>
+        <w:numPr>
+          <w:ilvl w:val="0"/>
+          <w:numId w:val="1"/>
+        </w:numPr>
+        <w:spacing w:after="40"/>
+      </w:pPr>
+      <w:r>
+        <w:rPr>
+          <w:rFonts w:ascii="Arial" w:cs="Arial" w:eastAsia="Arial" w:hAnsi="Arial"/>
+          <w:sz w:val="22"/>
+          <w:szCs w:val="22"/>
+        </w:rPr>
+        <w:t xml:space="preserve">AGB sieht eine 4-Stunden-Mindestgrenze vor. Der Workflow warnt darunter, blockiert aber nicht (Sarah entscheidet im Einzelfall).</w:t>
+      </w:r>
+    </w:p>
+    <w:p>
+      <w:pPr>
+        <w:spacing w:after="80"/>
+      </w:pPr>
+      <w:r>
+        <w:rPr>
+          <w:rFonts w:ascii="Arial" w:cs="Arial" w:eastAsia="Arial" w:hAnsi="Arial"/>
+          <w:b/>
+          <w:bCs/>
+          <w:sz w:val="22"/>
+          <w:szCs w:val="22"/>
+        </w:rPr>
+        <w:t xml:space="preserve">E-Mails: </w:t>
+      </w:r>
+      <w:r>
+        <w:rPr>
+          <w:rFonts w:ascii="Arial" w:cs="Arial" w:eastAsia="Arial" w:hAnsi="Arial"/>
+          <w:sz w:val="22"/>
+          <w:szCs w:val="22"/>
+        </w:rPr>
+        <w:t xml:space="preserve"/>
+      </w:r>
+    </w:p>
+    <w:p>
+      <w:pPr>
+        <w:spacing w:after="80"/>
+      </w:pPr>
+      <w:r>
+        <w:rPr>
+          <w:rFonts w:ascii="Arial" w:cs="Arial" w:eastAsia="Arial" w:hAnsi="Arial"/>
+          <w:b/>
+          <w:bCs/>
+          <w:sz w:val="22"/>
+          <w:szCs w:val="22"/>
+        </w:rPr>
+        <w:t xml:space="preserve">Betreff: </w:t>
+      </w:r>
+      <w:r>
+        <w:rPr>
+          <w:rFonts w:ascii="Arial" w:cs="Arial" w:eastAsia="Arial" w:hAnsi="Arial"/>
+          <w:i/>
+          <w:iCs/>
+          <w:sz w:val="22"/>
+          <w:szCs w:val="22"/>
+        </w:rPr>
+        <w:t xml:space="preserve">„Krankheits-Austragung: [Kursname]"</w:t>
+      </w:r>
+    </w:p>
+    <w:p>
+      <w:pPr>
+        <w:spacing w:after="80"/>
+      </w:pPr>
+      <w:r>
+        <w:rPr>
+          <w:rFonts w:ascii="Arial" w:cs="Arial" w:eastAsia="Arial" w:hAnsi="Arial"/>
+          <w:b/>
+          <w:bCs/>
+          <w:sz w:val="22"/>
+          <w:szCs w:val="22"/>
+        </w:rPr>
+        <w:t xml:space="preserve">Empfänger: </w:t>
+      </w:r>
+      <w:r>
+        <w:rPr>
+          <w:rFonts w:ascii="Arial" w:cs="Arial" w:eastAsia="Arial" w:hAnsi="Arial"/>
+          <w:sz w:val="22"/>
+          <w:szCs w:val="22"/>
+        </w:rPr>
+        <w:t xml:space="preserve">Yogi (echte Email, keine Dummy-User)</w:t>
+      </w:r>
+    </w:p>
+    <w:p>
+      <w:pPr>
+        <w:spacing w:after="80"/>
+      </w:pPr>
+      <w:r>
+        <w:rPr>
+          <w:rFonts w:ascii="Arial" w:cs="Arial" w:eastAsia="Arial" w:hAnsi="Arial"/>
+          <w:b/>
+          <w:bCs/>
+          <w:sz w:val="22"/>
+          <w:szCs w:val="22"/>
+        </w:rPr>
+        <w:t xml:space="preserve">Kernaussage: </w:t>
+      </w:r>
+      <w:r>
+        <w:rPr>
+          <w:rFonts w:ascii="Arial" w:cs="Arial" w:eastAsia="Arial" w:hAnsi="Arial"/>
+          <w:i/>
+          <w:iCs/>
+          <w:sz w:val="22"/>
+          <w:szCs w:val="22"/>
+        </w:rPr>
+        <w:t xml:space="preserve">„Gemäß deinem Attest habe ich dich aus dem Kurs ausgetragen. Du erhältst ein Guthaben über N Stunden (gültig bis [Datum + 10 Monate]). Vorhol-/Nachholbuchungen sind ersatzlos beendet. Guthaben nur für neuen Kurs einlösbar — keine Auszahlung."</w:t>
+      </w:r>
+    </w:p>
+    <w:p>
+      <w:pPr>
+        <w:spacing w:after="80"/>
+      </w:pPr>
+      <w:r>
+        <w:rPr>
+          <w:rFonts w:ascii="Arial" w:cs="Arial" w:eastAsia="Arial" w:hAnsi="Arial"/>
+          <w:b/>
+          <w:bCs/>
+          <w:sz w:val="22"/>
+          <w:szCs w:val="22"/>
+        </w:rPr>
+        <w:t xml:space="preserve">Sonderfälle &amp; Ausnahmen: </w:t>
+      </w:r>
+      <w:r>
+        <w:rPr>
+          <w:rFonts w:ascii="Arial" w:cs="Arial" w:eastAsia="Arial" w:hAnsi="Arial"/>
+          <w:sz w:val="22"/>
+          <w:szCs w:val="22"/>
+        </w:rPr>
+        <w:t xml:space="preserve"/>
+      </w:r>
+    </w:p>
+    <w:p>
+      <w:pPr>
+        <w:pStyle w:val="ListParagraph"/>
+        <w:numPr>
+          <w:ilvl w:val="0"/>
+          <w:numId w:val="1"/>
+        </w:numPr>
+        <w:spacing w:after="40"/>
+      </w:pPr>
+      <w:r>
+        <w:rPr>
+          <w:rFonts w:ascii="Arial" w:cs="Arial" w:eastAsia="Arial" w:hAnsi="Arial"/>
+          <w:sz w:val="22"/>
+          <w:szCs w:val="22"/>
+        </w:rPr>
+        <w:t xml:space="preserve">Wenn keine Reststunden ab Attest-Datum existieren (z.B. Yogi hat alles schon abgesagt oder Kurs ist bereits zu Ende), wird kein Guthaben angelegt — die Operation läuft trotzdem durch (enrollment wird beendet, Audit-Log geschrieben). Modal-Submit erfordert aber illnessPreview vorhanden.</w:t>
+      </w:r>
+    </w:p>
+    <w:p>
+      <w:pPr>
+        <w:pStyle w:val="ListParagraph"/>
+        <w:numPr>
+          <w:ilvl w:val="0"/>
+          <w:numId w:val="1"/>
+        </w:numPr>
+        <w:spacing w:after="40"/>
+      </w:pPr>
+      <w:r>
+        <w:rPr>
+          <w:rFonts w:ascii="Arial" w:cs="Arial" w:eastAsia="Arial" w:hAnsi="Arial"/>
+          <w:sz w:val="22"/>
+          <w:szCs w:val="22"/>
+        </w:rPr>
+        <w:t xml:space="preserve">Dummy-Yogis bekommen keine Email (wie überall sonst auch).</w:t>
+      </w:r>
+    </w:p>
+    <w:p>
+      <w:pPr>
+        <w:pStyle w:val="ListParagraph"/>
+        <w:numPr>
+          <w:ilvl w:val="0"/>
+          <w:numId w:val="1"/>
+        </w:numPr>
+        <w:spacing w:after="40"/>
+      </w:pPr>
+      <w:r>
+        <w:rPr>
+          <w:rFonts w:ascii="Arial" w:cs="Arial" w:eastAsia="Arial" w:hAnsi="Arial"/>
+          <w:sz w:val="22"/>
+          <w:szCs w:val="22"/>
+        </w:rPr>
+        <w:t xml:space="preserve">Wenn nur Vorhol/Nachhol storniert werden (keine Kurs-Reststunden), gibt es trotzdem kein Guthaben — nur die Stornierungen + Audit-Log.</w:t>
+      </w:r>
+    </w:p>
+    <w:p>
+      <w:pPr>
+        <w:spacing w:after="80"/>
+      </w:pPr>
+      <w:r>
+        <w:rPr>
+          <w:rFonts w:ascii="Arial" w:cs="Arial" w:eastAsia="Arial" w:hAnsi="Arial"/>
+          <w:b/>
+          <w:bCs/>
+          <w:color w:val="b8860b"/>
+          <w:sz w:val="22"/>
+          <w:szCs w:val="22"/>
+        </w:rPr>
+        <w:t xml:space="preserve">⚠️ KLÄREN: </w:t>
+      </w:r>
+      <w:r>
+        <w:rPr>
+          <w:rFonts w:ascii="Arial" w:cs="Arial" w:eastAsia="Arial" w:hAnsi="Arial"/>
+          <w:color w:val="b8860b"/>
+          <w:sz w:val="22"/>
+          <w:szCs w:val="22"/>
+        </w:rPr>
+        <w:t xml:space="preserve">Folge-TODO (Sarah): AGB-Versionierung muss separat aktualisiert werden — Krankheits-Klausel mit 10-Monats-Frist und „nur für neuen Kurs verrechenbar, keine Geld-Auszahlung" sollte explizit dokumentiert sein.</w:t>
+      </w:r>
+    </w:p>
+    <w:p>
+      <w:pPr>
+        <w:pBdr>
+          <w:top w:val="single" w:color="cccccc" w:sz="4"/>
+        </w:pBdr>
+        <w:spacing w:after="240" w:before="120"/>
+      </w:pPr>
+      <w:sdt>
+        <w:sdtPr>
+          <w:alias w:val="Verhalten OK"/>
+          <w14:checkbox>
+            <w14:checked w14:val="0"/>
+            <w14:checkedState w14:val="2612" w14:font="MS Gothic"/>
+            <w14:uncheckedState w14:val="2610" w14:font="MS Gothic"/>
+          </w14:checkbox>
+        </w:sdtPr>
+        <w:sdtContent>
+          <w:r>
+            <w:sym w:char="2610" w:font="MS Gothic"/>
+          </w:r>
+        </w:sdtContent>
+      </w:sdt>
+      <w:r>
+        <w:rPr>
+          <w:rFonts w:ascii="Arial" w:cs="Arial" w:eastAsia="Arial" w:hAnsi="Arial"/>
+          <w:sz w:val="22"/>
+          <w:szCs w:val="22"/>
+        </w:rPr>
+        <w:t xml:space="preserve"> Verhalten entspricht meiner Vorstellung     </w:t>
+      </w:r>
+      <w:sdt>
+        <w:sdtPr>
+          <w:alias w:val="Anpassung"/>
+          <w14:checkbox>
+            <w14:checked w14:val="0"/>
+            <w14:checkedState w14:val="2612" w14:font="MS Gothic"/>
+            <w14:uncheckedState w14:val="2610" w14:font="MS Gothic"/>
+          </w14:checkbox>
+        </w:sdtPr>
+        <w:sdtContent>
+          <w:r>
+            <w:sym w:char="2610" w:font="MS Gothic"/>
+          </w:r>
+        </w:sdtContent>
+      </w:sdt>
+      <w:r>
+        <w:rPr>
+          <w:rFonts w:ascii="Arial" w:cs="Arial" w:eastAsia="Arial" w:hAnsi="Arial"/>
+          <w:sz w:val="22"/>
+          <w:szCs w:val="22"/>
+        </w:rPr>
+        <w:t xml:space="preserve"> Anpassung nötig: ___________________________</w:t>
+      </w:r>
+    </w:p>
+    <w:p>
+      <w:pPr>
+        <w:pStyle w:val="Heading2"/>
+        <w:spacing w:after="100" w:before="240"/>
+      </w:pPr>
+      <w:r>
+        <w:rPr>
+          <w:rFonts w:ascii="Arial" w:cs="Arial" w:eastAsia="Arial" w:hAnsi="Arial"/>
+          <w:b/>
+          <w:bCs/>
+          <w:color w:val="8a6020"/>
+          <w:sz w:val="26"/>
+          <w:szCs w:val="26"/>
+        </w:rPr>
+        <w:t xml:space="preserve">Anzeige in /meine: Krankheits-Guthaben vs. Kurs-Guthaben</w:t>
+      </w:r>
+    </w:p>
+    <w:tbl>
+      <w:tblPr>
+        <w:tblW w:type="pct" w:w="100%"/>
+        <w:tblBorders>
+          <w:top w:val="single" w:color="auto" w:sz="4"/>
+          <w:left w:val="single" w:color="auto" w:sz="4"/>
+          <w:bottom w:val="single" w:color="auto" w:sz="4"/>
+          <w:right w:val="single" w:color="auto" w:sz="4"/>
+          <w:insideH w:val="single" w:color="auto" w:sz="4"/>
+          <w:insideV w:val="single" w:color="auto" w:sz="4"/>
+        </w:tblBorders>
+      </w:tblPr>
+      <w:tblGrid>
+        <w:gridCol w:w="100"/>
+        <w:gridCol w:w="100"/>
+      </w:tblGrid>
+      <w:tr>
+        <w:tc>
+          <w:tcPr>
+            <w:tcW w:type="pct" w:w="28%"/>
+            <w:shd w:fill="f5f2f0" w:color="f5f2f0" w:val="solid"/>
+          </w:tcPr>
+          <w:p>
+            <w:r>
+              <w:rPr>
+                <w:rFonts w:ascii="Arial" w:cs="Arial" w:eastAsia="Arial" w:hAnsi="Arial"/>
+                <w:b/>
+                <w:bCs/>
+                <w:sz w:val="22"/>
+                <w:szCs w:val="22"/>
+              </w:rPr>
+              <w:t xml:space="preserve">Was</w:t>
+            </w:r>
+          </w:p>
+        </w:tc>
+        <w:tc>
+          <w:tcPr>
+            <w:tcW w:type="pct" w:w="72%"/>
+          </w:tcPr>
+          <w:p>
+            <w:r>
+              <w:rPr>
+                <w:rFonts w:ascii="Arial" w:cs="Arial" w:eastAsia="Arial" w:hAnsi="Arial"/>
+                <w:sz w:val="22"/>
+                <w:szCs w:val="22"/>
+              </w:rPr>
+              <w:t xml:space="preserve">In der Yogi-Übersicht /meine werden Guthaben jetzt nach Herkunft unterschiedlich beschriftet — Krankheits-Guthaben mit eigenem Label und der korrekten 10-Monats-Frist, Kursabbruch-Guthaben weiterhin mit 2-Jahres-Frist.</w:t>
+            </w:r>
+          </w:p>
+        </w:tc>
+      </w:tr>
+      <w:tr>
+        <w:tc>
+          <w:tcPr>
+            <w:tcW w:type="pct" w:w="28%"/>
+            <w:shd w:fill="f5f2f0" w:color="f5f2f0" w:val="solid"/>
+          </w:tcPr>
+          <w:p>
+            <w:r>
+              <w:rPr>
+                <w:rFonts w:ascii="Arial" w:cs="Arial" w:eastAsia="Arial" w:hAnsi="Arial"/>
+                <w:b/>
+                <w:bCs/>
+                <w:sz w:val="22"/>
+                <w:szCs w:val="22"/>
+              </w:rPr>
+              <w:t xml:space="preserve">Wer</w:t>
+            </w:r>
+          </w:p>
+        </w:tc>
+        <w:tc>
+          <w:tcPr>
+            <w:tcW w:type="pct" w:w="72%"/>
+          </w:tcPr>
+          <w:p>
+            <w:r>
+              <w:rPr>
+                <w:rFonts w:ascii="Arial" w:cs="Arial" w:eastAsia="Arial" w:hAnsi="Arial"/>
+                <w:sz w:val="22"/>
+                <w:szCs w:val="22"/>
+              </w:rPr>
+              <w:t xml:space="preserve">Yogi</w:t>
+            </w:r>
+          </w:p>
+        </w:tc>
+      </w:tr>
+    </w:tbl>
+    <w:p>
+      <w:pPr>
+        <w:spacing w:after="80"/>
+      </w:pPr>
+      <w:r>
+        <w:rPr>
+          <w:rFonts w:ascii="Arial" w:cs="Arial" w:eastAsia="Arial" w:hAnsi="Arial"/>
+          <w:b/>
+          <w:bCs/>
+          <w:sz w:val="22"/>
+          <w:szCs w:val="22"/>
+        </w:rPr>
+        <w:t xml:space="preserve">Ablauf: </w:t>
+      </w:r>
+      <w:r>
+        <w:rPr>
+          <w:rFonts w:ascii="Arial" w:cs="Arial" w:eastAsia="Arial" w:hAnsi="Arial"/>
+          <w:sz w:val="22"/>
+          <w:szCs w:val="22"/>
+        </w:rPr>
+        <w:t xml:space="preserve"/>
+      </w:r>
+    </w:p>
+    <w:p>
+      <w:pPr>
+        <w:pStyle w:val="ListParagraph"/>
+        <w:numPr>
+          <w:ilvl w:val="0"/>
+          <w:numId w:val="1"/>
+        </w:numPr>
+        <w:spacing w:after="40"/>
+      </w:pPr>
+      <w:r>
+        <w:rPr>
+          <w:rFonts w:ascii="Arial" w:cs="Arial" w:eastAsia="Arial" w:hAnsi="Arial"/>
+          <w:sz w:val="22"/>
+          <w:szCs w:val="22"/>
+        </w:rPr>
+        <w:t xml:space="preserve">Yogi öffnet /meine — sieht im Block „Guthaben" pro Credit eine Karte.</w:t>
+      </w:r>
+    </w:p>
+    <w:p>
+      <w:pPr>
+        <w:pStyle w:val="ListParagraph"/>
+        <w:numPr>
+          <w:ilvl w:val="0"/>
+          <w:numId w:val="1"/>
+        </w:numPr>
+        <w:spacing w:after="40"/>
+      </w:pPr>
+      <w:r>
+        <w:rPr>
+          <w:rFonts w:ascii="Arial" w:cs="Arial" w:eastAsia="Arial" w:hAnsi="Arial"/>
+          <w:sz w:val="22"/>
+          <w:szCs w:val="22"/>
+        </w:rPr>
+        <w:t xml:space="preserve">Wenn credits.source=„illness": Label „Krankheits-Guthaben — gültig bis [Datum]".</w:t>
+      </w:r>
+    </w:p>
+    <w:p>
+      <w:pPr>
+        <w:pStyle w:val="ListParagraph"/>
+        <w:numPr>
+          <w:ilvl w:val="0"/>
+          <w:numId w:val="1"/>
+        </w:numPr>
+        <w:spacing w:after="40"/>
+      </w:pPr>
+      <w:r>
+        <w:rPr>
+          <w:rFonts w:ascii="Arial" w:cs="Arial" w:eastAsia="Arial" w:hAnsi="Arial"/>
+          <w:sz w:val="22"/>
+          <w:szCs w:val="22"/>
+        </w:rPr>
+        <w:t xml:space="preserve">Wenn credits.source=„cancellation_choice" oder NULL: Label „Kurs-Guthaben — gültig bis [Datum]".</w:t>
+      </w:r>
+    </w:p>
+    <w:p>
+      <w:pPr>
+        <w:pStyle w:val="ListParagraph"/>
+        <w:numPr>
+          <w:ilvl w:val="0"/>
+          <w:numId w:val="1"/>
+        </w:numPr>
+        <w:spacing w:after="40"/>
+      </w:pPr>
+      <w:r>
+        <w:rPr>
+          <w:rFonts w:ascii="Arial" w:cs="Arial" w:eastAsia="Arial" w:hAnsi="Arial"/>
+          <w:sz w:val="22"/>
+          <w:szCs w:val="22"/>
+        </w:rPr>
+        <w:t xml:space="preserve">Zusätzlich wird immer die Restzeit in Tagen angezeigt („Noch X Tage gültig").</w:t>
+      </w:r>
+    </w:p>
+    <w:p>
+      <w:pPr>
+        <w:pBdr>
+          <w:top w:val="single" w:color="cccccc" w:sz="4"/>
+        </w:pBdr>
+        <w:spacing w:after="240" w:before="120"/>
+      </w:pPr>
+      <w:sdt>
+        <w:sdtPr>
+          <w:alias w:val="Verhalten OK"/>
+          <w14:checkbox>
+            <w14:checked w14:val="0"/>
+            <w14:checkedState w14:val="2612" w14:font="MS Gothic"/>
+            <w14:uncheckedState w14:val="2610" w14:font="MS Gothic"/>
+          </w14:checkbox>
+        </w:sdtPr>
+        <w:sdtContent>
+          <w:r>
+            <w:sym w:char="2610" w:font="MS Gothic"/>
+          </w:r>
+        </w:sdtContent>
+      </w:sdt>
+      <w:r>
+        <w:rPr>
+          <w:rFonts w:ascii="Arial" w:cs="Arial" w:eastAsia="Arial" w:hAnsi="Arial"/>
+          <w:sz w:val="22"/>
+          <w:szCs w:val="22"/>
+        </w:rPr>
+        <w:t xml:space="preserve"> Verhalten entspricht meiner Vorstellung     </w:t>
+      </w:r>
+      <w:sdt>
+        <w:sdtPr>
+          <w:alias w:val="Anpassung"/>
+          <w14:checkbox>
+            <w14:checked w14:val="0"/>
+            <w14:checkedState w14:val="2612" w14:font="MS Gothic"/>
+            <w14:uncheckedState w14:val="2610" w14:font="MS Gothic"/>
+          </w14:checkbox>
+        </w:sdtPr>
+        <w:sdtContent>
+          <w:r>
+            <w:sym w:char="2610" w:font="MS Gothic"/>
+          </w:r>
+        </w:sdtContent>
+      </w:sdt>
+      <w:r>
+        <w:rPr>
+          <w:rFonts w:ascii="Arial" w:cs="Arial" w:eastAsia="Arial" w:hAnsi="Arial"/>
+          <w:sz w:val="22"/>
+          <w:szCs w:val="22"/>
+        </w:rPr>
+        <w:t xml:space="preserve"> Anpassung nötig: ___________________________</w:t>
+      </w:r>
+    </w:p>
+    <w:p>
+      <w:r>
+        <w:br w:type="page"/>
+      </w:r>
+    </w:p>
+    <w:p>
+      <w:pPr>
+        <w:pStyle w:val="Heading1"/>
+        <w:spacing w:after="160" w:before="360"/>
+      </w:pPr>
+      <w:r>
+        <w:rPr>
+          <w:rFonts w:ascii="Arial" w:cs="Arial" w:eastAsia="Arial" w:hAnsi="Arial"/>
+          <w:b/>
+          <w:bCs/>
+          <w:color w:val="3d3a39"/>
+          <w:sz w:val="32"/>
+          <w:szCs w:val="32"/>
+        </w:rPr>
         <w:t xml:space="preserve">Anhang: Begriffsklärung</w:t>
       </w:r>
     </w:p>
@@ -30674,6 +31603,75 @@
           <w:szCs w:val="22"/>
         </w:rPr>
         <w:t xml:space="preserve">90 Minuten vor Stundenbeginn — bis dahin läuft Auto-Promote, danach kommt der Late-Offer-Workflow (Mail an alle Wartelisten-Yogis).</w:t>
+      </w:r>
+    </w:p>
+    <w:p>
+      <w:pPr>
+        <w:spacing w:after="80"/>
+      </w:pPr>
+      <w:r>
+        <w:rPr>
+          <w:rFonts w:ascii="Arial" w:cs="Arial" w:eastAsia="Arial" w:hAnsi="Arial"/>
+          <w:b/>
+          <w:bCs/>
+          <w:sz w:val="22"/>
+          <w:szCs w:val="22"/>
+        </w:rPr>
+        <w:t xml:space="preserve">Krankheits-Guthaben (Welle G): </w:t>
+      </w:r>
+      <w:r>
+        <w:rPr>
+          <w:rFonts w:ascii="Arial" w:cs="Arial" w:eastAsia="Arial" w:hAnsi="Arial"/>
+          <w:sz w:val="22"/>
+          <w:szCs w:val="22"/>
+        </w:rPr>
+        <w:t xml:space="preserve">Guthaben mit credits.source=„illness", angelegt bei Krankheits-Austragung. 10 Monate ab Attest-Datum gültig. Nur verrechenbar mit neuem Kurs, keine Auszahlung in Geld.</w:t>
+      </w:r>
+    </w:p>
+    <w:p>
+      <w:pPr>
+        <w:spacing w:after="80"/>
+      </w:pPr>
+      <w:r>
+        <w:rPr>
+          <w:rFonts w:ascii="Arial" w:cs="Arial" w:eastAsia="Arial" w:hAnsi="Arial"/>
+          <w:b/>
+          <w:bCs/>
+          <w:sz w:val="22"/>
+          <w:szCs w:val="22"/>
+        </w:rPr>
+        <w:t xml:space="preserve">credits.source: </w:t>
+      </w:r>
+      <w:r>
+        <w:rPr>
+          <w:rFonts w:ascii="Arial" w:cs="Arial" w:eastAsia="Arial" w:hAnsi="Arial"/>
+          <w:sz w:val="22"/>
+          <w:szCs w:val="22"/>
+        </w:rPr>
+        <w:t xml:space="preserve">Spalte auf der credits-Tabelle (Welle G). Werte: NULL (Standard), „illness" (Krankheits-Austragung, 10 Mo), „cancellation_choice" (Kursabbruch-Wahl, 2 Jahre).</w:t>
+      </w:r>
+    </w:p>
+    <w:p>
+      <w:pPr>
+        <w:spacing w:after="80"/>
+      </w:pPr>
+      <w:r>
+        <w:rPr>
+          <w:rFonts w:ascii="Arial" w:cs="Arial" w:eastAsia="Arial" w:hAnsi="Arial"/>
+          <w:b/>
+          <w:bCs/>
+          <w:sz w:val="22"/>
+          <w:szCs w:val="22"/>
+        </w:rPr>
+        <w:t xml:space="preserve">enrollments.end_date / end_reason: </w:t>
+      </w:r>
+      <w:r>
+        <w:rPr>
+          <w:rFonts w:ascii="Arial" w:cs="Arial" w:eastAsia="Arial" w:hAnsi="Arial"/>
+          <w:sz w:val="22"/>
+          <w:szCs w:val="22"/>
+        </w:rPr>
+        <w:t xml:space="preserve">Spalten auf enrollments (Welle G). end_date = Tag, an dem die Teilnahme endet (z.B. Attest-Datum). end_reason = „illness" / „course_cancelled" / „admin_removed".</w:t>
       </w:r>
     </w:p>
     <w:sectPr>

</xml_diff>

<commit_message>
docs: Welle 4.5 — Anwendungsfaelle.docx ergaenzt um Abschnitt 16 (Events/Einzelstunden)
Vollstaendige technische Spec fuer die neuen Bereiche in 14 Unterabschnitten:

- 16.1-16.2: Admin Anlegen (Einzelstunde, Event event_free/event_paid)
- 16.3: Externe Teilnehmer +/-  Counter + audit_log
- 16.4: Yogi-zu-Event Credit-Safety (credit_id=NULL)
- 16.5-16.7: Yogi Self-Booking + Self-Cancel inkl. 7-Tage-Hardblock event_paid
- 16.8: Admin-Cancel-Override (jederzeit, kein 3h-Modal bei Events)
- 16.9: Admin sagt Event/Einzelstunde ab (session_type-aware Cancel-Form)
- 16.10: Audit-Log-Actions Tabelle (9 neue Actions)
- 16.11: BottomNav 'Kalender'
- 16.12: DB-Trigger enforce_session_max_spots COALESCE-Fix
- 16.13: DB-Trigger enforce_event_paid_7d_cancel_block (Welle 4.5)
- 16.14: Email-Differenzierung send-email v64

Vorher Hash 521592...75 (14.589 Woerter)
Nachher Hash c807d1...0f (15.696 Woerter, +1.107)

Co-Authored-By: Claude Opus 4.7 <noreply@anthropic.com>
</commit_message>
<xml_diff>
--- a/Yoga-mit-Sarah-Anwendungsfaelle.docx
+++ b/Yoga-mit-Sarah-Anwendungsfaelle.docx
@@ -39051,6 +39051,2069 @@
           <w:szCs w:val="22"/>
         </w:rPr>
         <w:t xml:space="preserve"> Anpassung nötig: ___________________________</w:t>
+      </w:r>
+    </w:p>
+    <w:p>
+      <w:r>
+        <w:br w:type="page"/>
+      </w:r>
+    </w:p>
+    <w:p>
+      <w:pPr>
+        <w:pStyle w:val="Heading1"/>
+      </w:pPr>
+      <w:r>
+        <w:rPr>
+          <w:rFonts w:ascii="Arial" w:cs="Arial" w:eastAsia="Arial" w:hAnsi="Arial"/>
+          <w:color w:val="2E74B5"/>
+          <w:sz w:val="32"/>
+          <w:szCs w:val="32"/>
+        </w:rPr>
+        <w:t xml:space="preserve">16. Welle 2 (Mai 2026): Einzelstunden &amp; Events — Detail-Spezifikation</w:t>
+      </w:r>
+    </w:p>
+    <w:p>
+      <w:pPr>
+        <w:spacing w:after="80"/>
+      </w:pPr>
+      <w:r>
+        <w:rPr>
+          <w:rFonts w:ascii="Arial" w:cs="Arial" w:eastAsia="Arial" w:hAnsi="Arial"/>
+          <w:sz w:val="22"/>
+          <w:szCs w:val="22"/>
+        </w:rPr>
+        <w:t xml:space="preserve">In Welle 2 (Mai 2026) wurden zwei neue Bereiche zusätzlich zu den Block-Kursen eingeführt. Dieser Abschnitt ergänzt Abschnitt 15 um die vollständige technische Spezifikation aus der Code-Basis (Stand 26.05.2026).</w:t>
+      </w:r>
+    </w:p>
+    <w:p>
+      <w:pPr>
+        <w:spacing w:after="40"/>
+        <w:ind w:left="360"/>
+      </w:pPr>
+      <w:r>
+        <w:rPr>
+          <w:rFonts w:ascii="Arial" w:cs="Arial" w:eastAsia="Arial" w:hAnsi="Arial"/>
+          <w:sz w:val="22"/>
+          <w:szCs w:val="22"/>
+        </w:rPr>
+        <w:t xml:space="preserve">• </w:t>
+      </w:r>
+      <w:r>
+        <w:rPr>
+          <w:rFonts w:ascii="Arial" w:cs="Arial" w:eastAsia="Arial" w:hAnsi="Arial"/>
+          <w:b/>
+          <w:bCs/>
+          <w:sz w:val="22"/>
+          <w:szCs w:val="22"/>
+        </w:rPr>
+        <w:t xml:space="preserve">Einzelstunden </w:t>
+      </w:r>
+      <w:r>
+        <w:rPr>
+          <w:rFonts w:ascii="Arial" w:cs="Arial" w:eastAsia="Arial" w:hAnsi="Arial"/>
+          <w:sz w:val="22"/>
+          <w:szCs w:val="22"/>
+        </w:rPr>
+        <w:t xml:space="preserve">(session_type = 'single'): Drop-in-Stunden außerhalb von Kursen. Verbrauchen 1 Credit aus dem Yogi-Guthaben.</w:t>
+      </w:r>
+    </w:p>
+    <w:p>
+      <w:pPr>
+        <w:spacing w:after="40"/>
+        <w:ind w:left="360"/>
+      </w:pPr>
+      <w:r>
+        <w:rPr>
+          <w:rFonts w:ascii="Arial" w:cs="Arial" w:eastAsia="Arial" w:hAnsi="Arial"/>
+          <w:sz w:val="22"/>
+          <w:szCs w:val="22"/>
+        </w:rPr>
+        <w:t xml:space="preserve">• </w:t>
+      </w:r>
+      <w:r>
+        <w:rPr>
+          <w:rFonts w:ascii="Arial" w:cs="Arial" w:eastAsia="Arial" w:hAnsi="Arial"/>
+          <w:b/>
+          <w:bCs/>
+          <w:sz w:val="22"/>
+          <w:szCs w:val="22"/>
+        </w:rPr>
+        <w:t xml:space="preserve">Events </w:t>
+      </w:r>
+      <w:r>
+        <w:rPr>
+          <w:rFonts w:ascii="Arial" w:cs="Arial" w:eastAsia="Arial" w:hAnsi="Arial"/>
+          <w:sz w:val="22"/>
+          <w:szCs w:val="22"/>
+        </w:rPr>
+        <w:t xml:space="preserve">(session_type = 'event_free' / 'event_paid'): Workshops, Specials, Charity-Stunden. KEIN Credit-System — bei event_paid läuft die Bezahlung extern (PayPal/Bar) direkt mit Sarah.</w:t>
+      </w:r>
+    </w:p>
+    <w:p>
+      <w:pPr>
+        <w:spacing w:after="80"/>
+      </w:pPr>
+      <w:r>
+        <w:rPr>
+          <w:rFonts w:ascii="Arial" w:cs="Arial" w:eastAsia="Arial" w:hAnsi="Arial"/>
+          <w:sz w:val="22"/>
+          <w:szCs w:val="22"/>
+        </w:rPr>
+        <w:t xml:space="preserve">Beide Bereiche laufen technisch über sogenannte SYS-Container-Kurse in der Datenbank (is_system_container=true), erscheinen aber als eigenständige Features in der UI.</w:t>
+      </w:r>
+    </w:p>
+    <w:p>
+      <w:pPr>
+        <w:pStyle w:val="Heading2"/>
+      </w:pPr>
+      <w:r>
+        <w:rPr>
+          <w:rFonts w:ascii="Arial" w:cs="Arial" w:eastAsia="Arial" w:hAnsi="Arial"/>
+          <w:color w:val="2E74B5"/>
+          <w:sz w:val="26"/>
+          <w:szCs w:val="26"/>
+        </w:rPr>
+        <w:t xml:space="preserve">16.1 Admin: Einzelstunde anlegen</w:t>
+      </w:r>
+    </w:p>
+    <w:p>
+      <w:pPr>
+        <w:spacing w:after="40"/>
+        <w:ind w:left="360"/>
+      </w:pPr>
+      <w:r>
+        <w:rPr>
+          <w:rFonts w:ascii="Arial" w:cs="Arial" w:eastAsia="Arial" w:hAnsi="Arial"/>
+          <w:sz w:val="22"/>
+          <w:szCs w:val="22"/>
+        </w:rPr>
+        <w:t xml:space="preserve">• /admin/kurse → Button "Einzelstunde anlegen" → Modal öffnet sich</w:t>
+      </w:r>
+    </w:p>
+    <w:p>
+      <w:pPr>
+        <w:spacing w:after="40"/>
+        <w:ind w:left="360"/>
+      </w:pPr>
+      <w:r>
+        <w:rPr>
+          <w:rFonts w:ascii="Arial" w:cs="Arial" w:eastAsia="Arial" w:hAnsi="Arial"/>
+          <w:sz w:val="22"/>
+          <w:szCs w:val="22"/>
+        </w:rPr>
+        <w:t xml:space="preserve">• Pflichtfelder: Name, Datum, Uhrzeit. Optional: Dauer, max. Teilnehmer, Ort, Beschreibung, Mitbringen, Schwierigkeitsgrad</w:t>
+      </w:r>
+    </w:p>
+    <w:p>
+      <w:pPr>
+        <w:spacing w:after="40"/>
+        <w:ind w:left="360"/>
+      </w:pPr>
+      <w:r>
+        <w:rPr>
+          <w:rFonts w:ascii="Arial" w:cs="Arial" w:eastAsia="Arial" w:hAnsi="Arial"/>
+          <w:sz w:val="22"/>
+          <w:szCs w:val="22"/>
+        </w:rPr>
+        <w:t xml:space="preserve">• Save → Eintrag in sessions-Tabelle mit session_type='single', is_open=true</w:t>
+      </w:r>
+    </w:p>
+    <w:p>
+      <w:pPr>
+        <w:spacing w:after="40"/>
+        <w:ind w:left="360"/>
+      </w:pPr>
+      <w:r>
+        <w:rPr>
+          <w:rFonts w:ascii="Arial" w:cs="Arial" w:eastAsia="Arial" w:hAnsi="Arial"/>
+          <w:sz w:val="22"/>
+          <w:szCs w:val="22"/>
+        </w:rPr>
+        <w:t xml:space="preserve">• Audit-Log: single_session_created</w:t>
+      </w:r>
+    </w:p>
+    <w:p>
+      <w:pPr>
+        <w:spacing w:after="40"/>
+        <w:ind w:left="360"/>
+      </w:pPr>
+      <w:r>
+        <w:rPr>
+          <w:rFonts w:ascii="Arial" w:cs="Arial" w:eastAsia="Arial" w:hAnsi="Arial"/>
+          <w:sz w:val="22"/>
+          <w:szCs w:val="22"/>
+        </w:rPr>
+        <w:t xml:space="preserve">• Karte erscheint in "Geplante Stunden &amp; Events" mit Badge "Einzelstunde"</w:t>
+      </w:r>
+    </w:p>
+    <w:p>
+      <w:pPr>
+        <w:spacing w:after="80"/>
+      </w:pPr>
+      <w:r>
+        <w:rPr>
+          <w:rFonts w:ascii="Arial" w:cs="Arial" w:eastAsia="Arial" w:hAnsi="Arial"/>
+          <w:b/>
+          <w:bCs/>
+          <w:sz w:val="22"/>
+          <w:szCs w:val="22"/>
+        </w:rPr>
+        <w:t xml:space="preserve">Bearbeiten: </w:t>
+      </w:r>
+      <w:r>
+        <w:rPr>
+          <w:rFonts w:ascii="Arial" w:cs="Arial" w:eastAsia="Arial" w:hAnsi="Arial"/>
+          <w:sz w:val="22"/>
+          <w:szCs w:val="22"/>
+        </w:rPr>
+        <w:t xml:space="preserve">Karten-Button "Bearbeiten" öffnet das gleiche Modal mit vorausgefüllten Daten. State editingSessionId markiert UPDATE statt INSERT. Audit-Log: single_session_updated.</w:t>
+      </w:r>
+    </w:p>
+    <w:p>
+      <w:pPr>
+        <w:pStyle w:val="Heading2"/>
+      </w:pPr>
+      <w:r>
+        <w:rPr>
+          <w:rFonts w:ascii="Arial" w:cs="Arial" w:eastAsia="Arial" w:hAnsi="Arial"/>
+          <w:color w:val="2E74B5"/>
+          <w:sz w:val="26"/>
+          <w:szCs w:val="26"/>
+        </w:rPr>
+        <w:t xml:space="preserve">16.2 Admin: Event anlegen</w:t>
+      </w:r>
+    </w:p>
+    <w:p>
+      <w:pPr>
+        <w:spacing w:after="40"/>
+        <w:ind w:left="360"/>
+      </w:pPr>
+      <w:r>
+        <w:rPr>
+          <w:rFonts w:ascii="Arial" w:cs="Arial" w:eastAsia="Arial" w:hAnsi="Arial"/>
+          <w:sz w:val="22"/>
+          <w:szCs w:val="22"/>
+        </w:rPr>
+        <w:t xml:space="preserve">• /admin/kurse → Button "Event anlegen" → Modal</w:t>
+      </w:r>
+    </w:p>
+    <w:p>
+      <w:pPr>
+        <w:spacing w:after="40"/>
+        <w:ind w:left="360"/>
+      </w:pPr>
+      <w:r>
+        <w:rPr>
+          <w:rFonts w:ascii="Arial" w:cs="Arial" w:eastAsia="Arial" w:hAnsi="Arial"/>
+          <w:sz w:val="22"/>
+          <w:szCs w:val="22"/>
+        </w:rPr>
+        <w:t xml:space="preserve">• Payment-Type-Wahl: "Kostenlos" (event_free) oder "Bezahlt" (event_paid). Bei "Bezahlt" ist price_eur Pflichtfeld</w:t>
+      </w:r>
+    </w:p>
+    <w:p>
+      <w:pPr>
+        <w:spacing w:after="40"/>
+        <w:ind w:left="360"/>
+      </w:pPr>
+      <w:r>
+        <w:rPr>
+          <w:rFonts w:ascii="Arial" w:cs="Arial" w:eastAsia="Arial" w:hAnsi="Arial"/>
+          <w:sz w:val="22"/>
+          <w:szCs w:val="22"/>
+        </w:rPr>
+        <w:t xml:space="preserve">• Optional: Foto-Upload (Storage), Beschreibung, max. Teilnehmer</w:t>
+      </w:r>
+    </w:p>
+    <w:p>
+      <w:pPr>
+        <w:spacing w:after="40"/>
+        <w:ind w:left="360"/>
+      </w:pPr>
+      <w:r>
+        <w:rPr>
+          <w:rFonts w:ascii="Arial" w:cs="Arial" w:eastAsia="Arial" w:hAnsi="Arial"/>
+          <w:sz w:val="22"/>
+          <w:szCs w:val="22"/>
+        </w:rPr>
+        <w:t xml:space="preserve">• Save → sessions-Insert mit entsprechendem session_type</w:t>
+      </w:r>
+    </w:p>
+    <w:p>
+      <w:pPr>
+        <w:spacing w:after="40"/>
+        <w:ind w:left="360"/>
+      </w:pPr>
+      <w:r>
+        <w:rPr>
+          <w:rFonts w:ascii="Arial" w:cs="Arial" w:eastAsia="Arial" w:hAnsi="Arial"/>
+          <w:sz w:val="22"/>
+          <w:szCs w:val="22"/>
+        </w:rPr>
+        <w:t xml:space="preserve">• Audit-Log: event_created mit payment_type + price_eur</w:t>
+      </w:r>
+    </w:p>
+    <w:p>
+      <w:pPr>
+        <w:spacing w:after="80"/>
+      </w:pPr>
+      <w:r>
+        <w:rPr>
+          <w:rFonts w:ascii="Arial" w:cs="Arial" w:eastAsia="Arial" w:hAnsi="Arial"/>
+          <w:b/>
+          <w:bCs/>
+          <w:sz w:val="22"/>
+          <w:szCs w:val="22"/>
+        </w:rPr>
+        <w:t xml:space="preserve">Wichtig: </w:t>
+      </w:r>
+      <w:r>
+        <w:rPr>
+          <w:rFonts w:ascii="Arial" w:cs="Arial" w:eastAsia="Arial" w:hAnsi="Arial"/>
+          <w:sz w:val="22"/>
+          <w:szCs w:val="22"/>
+        </w:rPr>
+        <w:t xml:space="preserve">Foto ist nur im Bearbeiten-Modal sichtbar, nicht auf der Karte (sauberes Layout).</w:t>
+      </w:r>
+    </w:p>
+    <w:p>
+      <w:pPr>
+        <w:pStyle w:val="Heading2"/>
+      </w:pPr>
+      <w:r>
+        <w:rPr>
+          <w:rFonts w:ascii="Arial" w:cs="Arial" w:eastAsia="Arial" w:hAnsi="Arial"/>
+          <w:color w:val="2E74B5"/>
+          <w:sz w:val="26"/>
+          <w:szCs w:val="26"/>
+        </w:rPr>
+        <w:t xml:space="preserve">16.3 Externe Teilnehmer +/- (Admin)</w:t>
+      </w:r>
+    </w:p>
+    <w:p>
+      <w:pPr>
+        <w:spacing w:after="80"/>
+      </w:pPr>
+      <w:r>
+        <w:rPr>
+          <w:rFonts w:ascii="Arial" w:cs="Arial" w:eastAsia="Arial" w:hAnsi="Arial"/>
+          <w:sz w:val="22"/>
+          <w:szCs w:val="22"/>
+        </w:rPr>
+        <w:t xml:space="preserve">Bei Events/Einzelstunden zählt Sarah oft externe Teilnehmer mit (z.B. Walk-Ins ohne App-Buchung). Diese werden über einen Counter auf der Karte / im Detail-Modal gepflegt:</w:t>
+      </w:r>
+    </w:p>
+    <w:p>
+      <w:pPr>
+        <w:spacing w:after="40"/>
+        <w:ind w:left="360"/>
+      </w:pPr>
+      <w:r>
+        <w:rPr>
+          <w:rFonts w:ascii="Arial" w:cs="Arial" w:eastAsia="Arial" w:hAnsi="Arial"/>
+          <w:sz w:val="22"/>
+          <w:szCs w:val="22"/>
+        </w:rPr>
+        <w:t xml:space="preserve">• /admin/kurse Karten-Inline: Buttons "−" und "+" direkt unter Teilnehmer-Zahl</w:t>
+      </w:r>
+    </w:p>
+    <w:p>
+      <w:pPr>
+        <w:spacing w:after="40"/>
+        <w:ind w:left="360"/>
+      </w:pPr>
+      <w:r>
+        <w:rPr>
+          <w:rFonts w:ascii="Arial" w:cs="Arial" w:eastAsia="Arial" w:hAnsi="Arial"/>
+          <w:sz w:val="22"/>
+          <w:szCs w:val="22"/>
+        </w:rPr>
+        <w:t xml:space="preserve">• /admin/kurse Teilnehmer-Modal: gleicher Counter inkl. Summary "X / Y Teilnehmer gesamt"</w:t>
+      </w:r>
+    </w:p>
+    <w:p>
+      <w:pPr>
+        <w:spacing w:after="40"/>
+        <w:ind w:left="360"/>
+      </w:pPr>
+      <w:r>
+        <w:rPr>
+          <w:rFonts w:ascii="Arial" w:cs="Arial" w:eastAsia="Arial" w:hAnsi="Arial"/>
+          <w:sz w:val="22"/>
+          <w:szCs w:val="22"/>
+        </w:rPr>
+        <w:t xml:space="preserve">• /admin/dashboard Session-Detail-Modal: gleicher Counter</w:t>
+      </w:r>
+    </w:p>
+    <w:p>
+      <w:pPr>
+        <w:spacing w:after="80"/>
+      </w:pPr>
+      <w:r>
+        <w:rPr>
+          <w:rFonts w:ascii="Arial" w:cs="Arial" w:eastAsia="Arial" w:hAnsi="Arial"/>
+          <w:sz w:val="22"/>
+          <w:szCs w:val="22"/>
+        </w:rPr>
+        <w:t xml:space="preserve">Audit-Log: external_participants_changed mit old_count/new_count.</w:t>
+      </w:r>
+    </w:p>
+    <w:p>
+      <w:pPr>
+        <w:spacing w:after="80"/>
+      </w:pPr>
+      <w:r>
+        <w:rPr>
+          <w:rFonts w:ascii="Arial" w:cs="Arial" w:eastAsia="Arial" w:hAnsi="Arial"/>
+          <w:b/>
+          <w:bCs/>
+          <w:sz w:val="22"/>
+          <w:szCs w:val="22"/>
+        </w:rPr>
+        <w:t xml:space="preserve">Pille auf der Wochenkarte </w:t>
+      </w:r>
+      <w:r>
+        <w:rPr>
+          <w:rFonts w:ascii="Arial" w:cs="Arial" w:eastAsia="Arial" w:hAnsi="Arial"/>
+          <w:sz w:val="22"/>
+          <w:szCs w:val="22"/>
+        </w:rPr>
+        <w:t xml:space="preserve">(/admin/dashboard) zeigt active_bookings + external_count als Summe. Die freien Plätze auf der Yogi-Wochenansicht ziehen die externen ebenfalls ab.</w:t>
+      </w:r>
+    </w:p>
+    <w:p>
+      <w:pPr>
+        <w:spacing w:after="80"/>
+      </w:pPr>
+      <w:r>
+        <w:rPr>
+          <w:rFonts w:ascii="Arial" w:cs="Arial" w:eastAsia="Arial" w:hAnsi="Arial"/>
+          <w:b/>
+          <w:bCs/>
+          <w:sz w:val="22"/>
+          <w:szCs w:val="22"/>
+        </w:rPr>
+        <w:t xml:space="preserve">Wichtige Plausi: </w:t>
+      </w:r>
+      <w:r>
+        <w:rPr>
+          <w:rFonts w:ascii="Arial" w:cs="Arial" w:eastAsia="Arial" w:hAnsi="Arial"/>
+          <w:sz w:val="22"/>
+          <w:szCs w:val="22"/>
+        </w:rPr>
+        <w:t xml:space="preserve">Der DB-Trigger enforce_session_max_spots zählt aber NUR aktive Bookings (kein Hard-Block für Externe). Sarah managed externe Plätze manuell.</w:t>
+      </w:r>
+    </w:p>
+    <w:p>
+      <w:pPr>
+        <w:pStyle w:val="Heading2"/>
+      </w:pPr>
+      <w:r>
+        <w:rPr>
+          <w:rFonts w:ascii="Arial" w:cs="Arial" w:eastAsia="Arial" w:hAnsi="Arial"/>
+          <w:color w:val="2E74B5"/>
+          <w:sz w:val="26"/>
+          <w:szCs w:val="26"/>
+        </w:rPr>
+        <w:t xml:space="preserve">16.4 Admin: Yogi zu Event hinzufügen (Credit-Safety)</w:t>
+      </w:r>
+    </w:p>
+    <w:p>
+      <w:pPr>
+        <w:spacing w:after="80"/>
+      </w:pPr>
+      <w:r>
+        <w:rPr>
+          <w:rFonts w:ascii="Arial" w:cs="Arial" w:eastAsia="Arial" w:hAnsi="Arial"/>
+          <w:sz w:val="22"/>
+          <w:szCs w:val="22"/>
+        </w:rPr>
+        <w:t xml:space="preserve">Wenn Sarah einen Yogi manuell zu einem Event hinzufügt:</w:t>
+      </w:r>
+    </w:p>
+    <w:p>
+      <w:pPr>
+        <w:spacing w:after="40"/>
+        <w:ind w:left="360"/>
+      </w:pPr>
+      <w:r>
+        <w:rPr>
+          <w:rFonts w:ascii="Arial" w:cs="Arial" w:eastAsia="Arial" w:hAnsi="Arial"/>
+          <w:sz w:val="22"/>
+          <w:szCs w:val="22"/>
+        </w:rPr>
+        <w:t xml:space="preserve">• session_type='event_free' oder 'event_paid' → selectCreditForBooking wird NICHT aufgerufen</w:t>
+      </w:r>
+    </w:p>
+    <w:p>
+      <w:pPr>
+        <w:spacing w:after="40"/>
+        <w:ind w:left="360"/>
+      </w:pPr>
+      <w:r>
+        <w:rPr>
+          <w:rFonts w:ascii="Arial" w:cs="Arial" w:eastAsia="Arial" w:hAnsi="Arial"/>
+          <w:sz w:val="22"/>
+          <w:szCs w:val="22"/>
+        </w:rPr>
+        <w:t xml:space="preserve">• bookings-Insert mit credit_id=NULL, type='single', kein origin_session_id</w:t>
+      </w:r>
+    </w:p>
+    <w:p>
+      <w:pPr>
+        <w:spacing w:after="40"/>
+        <w:ind w:left="360"/>
+      </w:pPr>
+      <w:r>
+        <w:rPr>
+          <w:rFonts w:ascii="Arial" w:cs="Arial" w:eastAsia="Arial" w:hAnsi="Arial"/>
+          <w:sz w:val="22"/>
+          <w:szCs w:val="22"/>
+        </w:rPr>
+        <w:t xml:space="preserve">• Der Trigger trg_sync_credit_used ignoriert Buchungen ohne credit_id → KEIN Credit-Abzug</w:t>
+      </w:r>
+    </w:p>
+    <w:p>
+      <w:pPr>
+        <w:spacing w:after="40"/>
+        <w:ind w:left="360"/>
+      </w:pPr>
+      <w:r>
+        <w:rPr>
+          <w:rFonts w:ascii="Arial" w:cs="Arial" w:eastAsia="Arial" w:hAnsi="Arial"/>
+          <w:sz w:val="22"/>
+          <w:szCs w:val="22"/>
+        </w:rPr>
+        <w:t xml:space="preserve">• Audit-Log: admin_added_yogi_to_event mit credit_used=false, price_eur (bei event_paid)</w:t>
+      </w:r>
+    </w:p>
+    <w:p>
+      <w:pPr>
+        <w:spacing w:after="40"/>
+        <w:ind w:left="360"/>
+      </w:pPr>
+      <w:r>
+        <w:rPr>
+          <w:rFonts w:ascii="Arial" w:cs="Arial" w:eastAsia="Arial" w:hAnsi="Arial"/>
+          <w:sz w:val="22"/>
+          <w:szCs w:val="22"/>
+        </w:rPr>
+        <w:t xml:space="preserve">• Yogi-Email: bookingConfirmed mit eventLabel (Name + Kostenlos- bzw. Preis-Marker)</w:t>
+      </w:r>
+    </w:p>
+    <w:p>
+      <w:pPr>
+        <w:spacing w:after="80"/>
+      </w:pPr>
+      <w:r>
+        <w:rPr>
+          <w:rFonts w:ascii="Arial" w:cs="Arial" w:eastAsia="Arial" w:hAnsi="Arial"/>
+          <w:sz w:val="22"/>
+          <w:szCs w:val="22"/>
+        </w:rPr>
+        <w:t xml:space="preserve">Bei session_type='single' oder 'course_session' bleibt der bisherige Credit-Pfad aktiv.</w:t>
+      </w:r>
+    </w:p>
+    <w:p>
+      <w:pPr>
+        <w:pStyle w:val="Heading2"/>
+      </w:pPr>
+      <w:r>
+        <w:rPr>
+          <w:rFonts w:ascii="Arial" w:cs="Arial" w:eastAsia="Arial" w:hAnsi="Arial"/>
+          <w:color w:val="2E74B5"/>
+          <w:sz w:val="26"/>
+          <w:szCs w:val="26"/>
+        </w:rPr>
+        <w:t xml:space="preserve">16.5 Yogi: Event-Buchung event_free</w:t>
+      </w:r>
+    </w:p>
+    <w:p>
+      <w:pPr>
+        <w:spacing w:after="40"/>
+        <w:ind w:left="360"/>
+      </w:pPr>
+      <w:r>
+        <w:rPr>
+          <w:rFonts w:ascii="Arial" w:cs="Arial" w:eastAsia="Arial" w:hAnsi="Arial"/>
+          <w:sz w:val="22"/>
+          <w:szCs w:val="22"/>
+        </w:rPr>
+        <w:t xml:space="preserve">• /kurse/[id] → Button "Jetzt anmelden" (NICHT "Verbindlich anmelden" — das wäre missverständlich)</w:t>
+      </w:r>
+    </w:p>
+    <w:p>
+      <w:pPr>
+        <w:spacing w:after="40"/>
+        <w:ind w:left="360"/>
+      </w:pPr>
+      <w:r>
+        <w:rPr>
+          <w:rFonts w:ascii="Arial" w:cs="Arial" w:eastAsia="Arial" w:hAnsi="Arial"/>
+          <w:sz w:val="22"/>
+          <w:szCs w:val="22"/>
+        </w:rPr>
+        <w:t xml:space="preserve">• Hinweis: "Kostenloses Event — einfach anmelden und teilnehmen."</w:t>
+      </w:r>
+    </w:p>
+    <w:p>
+      <w:pPr>
+        <w:spacing w:after="40"/>
+        <w:ind w:left="360"/>
+      </w:pPr>
+      <w:r>
+        <w:rPr>
+          <w:rFonts w:ascii="Arial" w:cs="Arial" w:eastAsia="Arial" w:hAnsi="Arial"/>
+          <w:sz w:val="22"/>
+          <w:szCs w:val="22"/>
+        </w:rPr>
+        <w:t xml:space="preserve">• handleBook: kein Credit, credit_id=null</w:t>
+      </w:r>
+    </w:p>
+    <w:p>
+      <w:pPr>
+        <w:spacing w:after="40"/>
+        <w:ind w:left="360"/>
+      </w:pPr>
+      <w:r>
+        <w:rPr>
+          <w:rFonts w:ascii="Arial" w:cs="Arial" w:eastAsia="Arial" w:hAnsi="Arial"/>
+          <w:sz w:val="22"/>
+          <w:szCs w:val="22"/>
+        </w:rPr>
+        <w:t xml:space="preserve">• Email booking_confirmed mit Block "Gut zu wissen" (kostenlos, jederzeit abmelden)</w:t>
+      </w:r>
+    </w:p>
+    <w:p>
+      <w:pPr>
+        <w:spacing w:after="40"/>
+        <w:ind w:left="360"/>
+      </w:pPr>
+      <w:r>
+        <w:rPr>
+          <w:rFonts w:ascii="Arial" w:cs="Arial" w:eastAsia="Arial" w:hAnsi="Arial"/>
+          <w:sz w:val="22"/>
+          <w:szCs w:val="22"/>
+        </w:rPr>
+        <w:t xml:space="preserve">• Storno jederzeit möglich</w:t>
+      </w:r>
+    </w:p>
+    <w:p>
+      <w:pPr>
+        <w:spacing w:after="40"/>
+        <w:ind w:left="360"/>
+      </w:pPr>
+      <w:r>
+        <w:rPr>
+          <w:rFonts w:ascii="Arial" w:cs="Arial" w:eastAsia="Arial" w:hAnsi="Arial"/>
+          <w:sz w:val="22"/>
+          <w:szCs w:val="22"/>
+        </w:rPr>
+        <w:t xml:space="preserve">• Email bei Abmeldung: "Vielleicht sehen wir uns beim nächsten Event!" — kein Credit-/3h-Text</w:t>
+      </w:r>
+    </w:p>
+    <w:p>
+      <w:pPr>
+        <w:pStyle w:val="Heading2"/>
+      </w:pPr>
+      <w:r>
+        <w:rPr>
+          <w:rFonts w:ascii="Arial" w:cs="Arial" w:eastAsia="Arial" w:hAnsi="Arial"/>
+          <w:color w:val="2E74B5"/>
+          <w:sz w:val="26"/>
+          <w:szCs w:val="26"/>
+        </w:rPr>
+        <w:t xml:space="preserve">16.6 Yogi: Event-Buchung event_paid</w:t>
+      </w:r>
+    </w:p>
+    <w:p>
+      <w:pPr>
+        <w:spacing w:after="40"/>
+        <w:ind w:left="360"/>
+      </w:pPr>
+      <w:r>
+        <w:rPr>
+          <w:rFonts w:ascii="Arial" w:cs="Arial" w:eastAsia="Arial" w:hAnsi="Arial"/>
+          <w:sz w:val="22"/>
+          <w:szCs w:val="22"/>
+        </w:rPr>
+        <w:t xml:space="preserve">• /kurse/[id] → Button "Verbindlich anmelden"</w:t>
+      </w:r>
+    </w:p>
+    <w:p>
+      <w:pPr>
+        <w:spacing w:after="40"/>
+        <w:ind w:left="360"/>
+      </w:pPr>
+      <w:r>
+        <w:rPr>
+          <w:rFonts w:ascii="Arial" w:cs="Arial" w:eastAsia="Arial" w:hAnsi="Arial"/>
+          <w:sz w:val="22"/>
+          <w:szCs w:val="22"/>
+        </w:rPr>
+        <w:t xml:space="preserve">• Hinweis-Box (gelb): "Schön, dass du dabei sein möchtest! Deine Anmeldung ist verbindlich — die Bezahlung läuft direkt mit Sarah (PayPal oder Bar). Bis 7 Tage vor dem Event kannst du dich kostenfrei wieder abmelden. Danach fällt die volle Gebühr an. Du kannst aber gerne einen Ersatzkandidaten benennen."</w:t>
+      </w:r>
+    </w:p>
+    <w:p>
+      <w:pPr>
+        <w:spacing w:after="40"/>
+        <w:ind w:left="360"/>
+      </w:pPr>
+      <w:r>
+        <w:rPr>
+          <w:rFonts w:ascii="Arial" w:cs="Arial" w:eastAsia="Arial" w:hAnsi="Arial"/>
+          <w:sz w:val="22"/>
+          <w:szCs w:val="22"/>
+        </w:rPr>
+        <w:t xml:space="preserve">• handleBook: skipCreditCheck=true, credit_id=null</w:t>
+      </w:r>
+    </w:p>
+    <w:p>
+      <w:pPr>
+        <w:spacing w:after="80"/>
+      </w:pPr>
+      <w:r>
+        <w:rPr>
+          <w:rFonts w:ascii="Arial" w:cs="Arial" w:eastAsia="Arial" w:hAnsi="Arial"/>
+          <w:sz w:val="22"/>
+          <w:szCs w:val="22"/>
+        </w:rPr>
+        <w:t xml:space="preserve">Email booking_confirmed mit Regeln-Block:</w:t>
+      </w:r>
+    </w:p>
+    <w:p>
+      <w:pPr>
+        <w:spacing w:after="40"/>
+        <w:ind w:left="360"/>
+      </w:pPr>
+      <w:r>
+        <w:rPr>
+          <w:rFonts w:ascii="Arial" w:cs="Arial" w:eastAsia="Arial" w:hAnsi="Arial"/>
+          <w:sz w:val="22"/>
+          <w:szCs w:val="22"/>
+        </w:rPr>
+        <w:t xml:space="preserve">• Verbindliche Anmeldung — Bezahlung extern</w:t>
+      </w:r>
+    </w:p>
+    <w:p>
+      <w:pPr>
+        <w:spacing w:after="40"/>
+        <w:ind w:left="360"/>
+      </w:pPr>
+      <w:r>
+        <w:rPr>
+          <w:rFonts w:ascii="Arial" w:cs="Arial" w:eastAsia="Arial" w:hAnsi="Arial"/>
+          <w:sz w:val="22"/>
+          <w:szCs w:val="22"/>
+        </w:rPr>
+        <w:t xml:space="preserve">• Stornofrist: 7 Tage vor dem Event kostenfrei</w:t>
+      </w:r>
+    </w:p>
+    <w:p>
+      <w:pPr>
+        <w:spacing w:after="40"/>
+        <w:ind w:left="360"/>
+      </w:pPr>
+      <w:r>
+        <w:rPr>
+          <w:rFonts w:ascii="Arial" w:cs="Arial" w:eastAsia="Arial" w:hAnsi="Arial"/>
+          <w:sz w:val="22"/>
+          <w:szCs w:val="22"/>
+        </w:rPr>
+        <w:t xml:space="preserve">• Bei späterer Abmeldung: volle Gebühr</w:t>
+      </w:r>
+    </w:p>
+    <w:p>
+      <w:pPr>
+        <w:spacing w:after="40"/>
+        <w:ind w:left="360"/>
+      </w:pPr>
+      <w:r>
+        <w:rPr>
+          <w:rFonts w:ascii="Arial" w:cs="Arial" w:eastAsia="Arial" w:hAnsi="Arial"/>
+          <w:sz w:val="22"/>
+          <w:szCs w:val="22"/>
+        </w:rPr>
+        <w:t xml:space="preserve">• Ersatzkandidaten-Option</w:t>
+      </w:r>
+    </w:p>
+    <w:p>
+      <w:pPr>
+        <w:pStyle w:val="Heading2"/>
+      </w:pPr>
+      <w:r>
+        <w:rPr>
+          <w:rFonts w:ascii="Arial" w:cs="Arial" w:eastAsia="Arial" w:hAnsi="Arial"/>
+          <w:color w:val="2E74B5"/>
+          <w:sz w:val="26"/>
+          <w:szCs w:val="26"/>
+        </w:rPr>
+        <w:t xml:space="preserve">16.7 Yogi: Self-Cancel event_paid (7-Tage-Hardblock)</w:t>
+      </w:r>
+    </w:p>
+    <w:p>
+      <w:pPr>
+        <w:spacing w:after="80"/>
+      </w:pPr>
+      <w:r>
+        <w:rPr>
+          <w:rFonts w:ascii="Arial" w:cs="Arial" w:eastAsia="Arial" w:hAnsi="Arial"/>
+          <w:b/>
+          <w:bCs/>
+          <w:sz w:val="22"/>
+          <w:szCs w:val="22"/>
+        </w:rPr>
+        <w:t xml:space="preserve">Vor der 7-Tage-Frist </w:t>
+      </w:r>
+      <w:r>
+        <w:rPr>
+          <w:rFonts w:ascii="Arial" w:cs="Arial" w:eastAsia="Arial" w:hAnsi="Arial"/>
+          <w:sz w:val="22"/>
+          <w:szCs w:val="22"/>
+        </w:rPr>
+        <w:t xml:space="preserve">(Event &gt; 7 Tage entfernt):</w:t>
+      </w:r>
+    </w:p>
+    <w:p>
+      <w:pPr>
+        <w:spacing w:after="40"/>
+        <w:ind w:left="360"/>
+      </w:pPr>
+      <w:r>
+        <w:rPr>
+          <w:rFonts w:ascii="Arial" w:cs="Arial" w:eastAsia="Arial" w:hAnsi="Arial"/>
+          <w:sz w:val="22"/>
+          <w:szCs w:val="22"/>
+        </w:rPr>
+        <w:t xml:space="preserve">• "Von dieser Stunde abmelden" → grüne Bestätigung "Rechtzeitige Abmeldung — kostenfrei"</w:t>
+      </w:r>
+    </w:p>
+    <w:p>
+      <w:pPr>
+        <w:spacing w:after="40"/>
+        <w:ind w:left="360"/>
+      </w:pPr>
+      <w:r>
+        <w:rPr>
+          <w:rFonts w:ascii="Arial" w:cs="Arial" w:eastAsia="Arial" w:hAnsi="Arial"/>
+          <w:sz w:val="22"/>
+          <w:szCs w:val="22"/>
+        </w:rPr>
+        <w:t xml:space="preserve">• bookings-Update status=cancelled</w:t>
+      </w:r>
+    </w:p>
+    <w:p>
+      <w:pPr>
+        <w:spacing w:after="40"/>
+        <w:ind w:left="360"/>
+      </w:pPr>
+      <w:r>
+        <w:rPr>
+          <w:rFonts w:ascii="Arial" w:cs="Arial" w:eastAsia="Arial" w:hAnsi="Arial"/>
+          <w:sz w:val="22"/>
+          <w:szCs w:val="22"/>
+        </w:rPr>
+        <w:t xml:space="preserve">• Email: "Deine Abmeldung war rechtzeitig (vor 7-Tage-Frist) und somit kostenfrei."</w:t>
+      </w:r>
+    </w:p>
+    <w:p>
+      <w:pPr>
+        <w:spacing w:after="80"/>
+      </w:pPr>
+      <w:r>
+        <w:rPr>
+          <w:rFonts w:ascii="Arial" w:cs="Arial" w:eastAsia="Arial" w:hAnsi="Arial"/>
+          <w:b/>
+          <w:bCs/>
+          <w:sz w:val="22"/>
+          <w:szCs w:val="22"/>
+        </w:rPr>
+        <w:t xml:space="preserve">Innerhalb der 7-Tage-Frist </w:t>
+      </w:r>
+      <w:r>
+        <w:rPr>
+          <w:rFonts w:ascii="Arial" w:cs="Arial" w:eastAsia="Arial" w:hAnsi="Arial"/>
+          <w:sz w:val="22"/>
+          <w:szCs w:val="22"/>
+        </w:rPr>
+        <w:t xml:space="preserve">(Event ≤ 7 Tage entfernt):</w:t>
+      </w:r>
+    </w:p>
+    <w:p>
+      <w:pPr>
+        <w:spacing w:after="40"/>
+        <w:ind w:left="360"/>
+      </w:pPr>
+      <w:r>
+        <w:rPr>
+          <w:rFonts w:ascii="Arial" w:cs="Arial" w:eastAsia="Arial" w:hAnsi="Arial"/>
+          <w:sz w:val="22"/>
+          <w:szCs w:val="22"/>
+        </w:rPr>
+        <w:t xml:space="preserve">• Bestätigung zeigt ROTEN Hardblock-Hinweis "Selbst-Abmeldung nicht mehr möglich. Volle Gebühr fällt an. Du kannst gerne einen Ersatzkandidaten benennen — wende dich dafür bitte direkt an Sarah."</w:t>
+      </w:r>
+    </w:p>
+    <w:p>
+      <w:pPr>
+        <w:spacing w:after="40"/>
+        <w:ind w:left="360"/>
+      </w:pPr>
+      <w:r>
+        <w:rPr>
+          <w:rFonts w:ascii="Arial" w:cs="Arial" w:eastAsia="Arial" w:hAnsi="Arial"/>
+          <w:sz w:val="22"/>
+          <w:szCs w:val="22"/>
+        </w:rPr>
+        <w:t xml:space="preserve">• KEIN "Ja, abmelden"-Button — nur "Zurück"</w:t>
+      </w:r>
+    </w:p>
+    <w:p>
+      <w:pPr>
+        <w:spacing w:after="40"/>
+        <w:ind w:left="360"/>
+      </w:pPr>
+      <w:r>
+        <w:rPr>
+          <w:rFonts w:ascii="Arial" w:cs="Arial" w:eastAsia="Arial" w:hAnsi="Arial"/>
+          <w:sz w:val="22"/>
+          <w:szCs w:val="22"/>
+        </w:rPr>
+        <w:t xml:space="preserve">• Defense-in-Depth: handleCancel() blockt zusätzlich via Alert</w:t>
+      </w:r>
+    </w:p>
+    <w:p>
+      <w:pPr>
+        <w:spacing w:after="40"/>
+        <w:ind w:left="360"/>
+      </w:pPr>
+      <w:r>
+        <w:rPr>
+          <w:rFonts w:ascii="Arial" w:cs="Arial" w:eastAsia="Arial" w:hAnsi="Arial"/>
+          <w:sz w:val="22"/>
+          <w:szCs w:val="22"/>
+        </w:rPr>
+        <w:t xml:space="preserve">• DB-Trigger (Welle 4.5) enforce_event_paid_7d_cancel_block blockt zusätzlich auf Datenbank-Ebene (auch bei direktem API-Aufruf)</w:t>
+      </w:r>
+    </w:p>
+    <w:p>
+      <w:pPr>
+        <w:pStyle w:val="Heading2"/>
+      </w:pPr>
+      <w:r>
+        <w:rPr>
+          <w:rFonts w:ascii="Arial" w:cs="Arial" w:eastAsia="Arial" w:hAnsi="Arial"/>
+          <w:color w:val="2E74B5"/>
+          <w:sz w:val="26"/>
+          <w:szCs w:val="26"/>
+        </w:rPr>
+        <w:t xml:space="preserve">16.8 Admin: Yogi aus Event entfernen (Override jederzeit)</w:t>
+      </w:r>
+    </w:p>
+    <w:p>
+      <w:pPr>
+        <w:spacing w:after="80"/>
+      </w:pPr>
+      <w:r>
+        <w:rPr>
+          <w:rFonts w:ascii="Arial" w:cs="Arial" w:eastAsia="Arial" w:hAnsi="Arial"/>
+          <w:sz w:val="22"/>
+          <w:szCs w:val="22"/>
+        </w:rPr>
+        <w:t xml:space="preserve">Sarahs-Wunsch: "Rest mach ich manuell". Admin hat keine Frist-Sperre:</w:t>
+      </w:r>
+    </w:p>
+    <w:p>
+      <w:pPr>
+        <w:spacing w:after="40"/>
+        <w:ind w:left="360"/>
+      </w:pPr>
+      <w:r>
+        <w:rPr>
+          <w:rFonts w:ascii="Arial" w:cs="Arial" w:eastAsia="Arial" w:hAnsi="Arial"/>
+          <w:sz w:val="22"/>
+          <w:szCs w:val="22"/>
+        </w:rPr>
+        <w:t xml:space="preserve">• /admin/sessions/[id] oder /admin/dashboard → Yogi-Liste → "Austragen"</w:t>
+      </w:r>
+    </w:p>
+    <w:p>
+      <w:pPr>
+        <w:spacing w:after="40"/>
+        <w:ind w:left="360"/>
+      </w:pPr>
+      <w:r>
+        <w:rPr>
+          <w:rFonts w:ascii="Arial" w:cs="Arial" w:eastAsia="Arial" w:hAnsi="Arial"/>
+          <w:sz w:val="22"/>
+          <w:szCs w:val="22"/>
+        </w:rPr>
+        <w:t xml:space="preserve">• cancelBookingForYogi prüft session_type — bei Events:</w:t>
+      </w:r>
+    </w:p>
+    <w:p>
+      <w:pPr>
+        <w:spacing w:after="40"/>
+        <w:ind w:left="360"/>
+      </w:pPr>
+      <w:r>
+        <w:rPr>
+          <w:rFonts w:ascii="Arial" w:cs="Arial" w:eastAsia="Arial" w:hAnsi="Arial"/>
+          <w:sz w:val="22"/>
+          <w:szCs w:val="22"/>
+        </w:rPr>
+        <w:t xml:space="preserve">•    KEIN 3h-Frist-Modal (Defense-in-Depth: das Modal wird gar nicht gerendert bei event_free/event_paid)</w:t>
+      </w:r>
+    </w:p>
+    <w:p>
+      <w:pPr>
+        <w:spacing w:after="40"/>
+        <w:ind w:left="360"/>
+      </w:pPr>
+      <w:r>
+        <w:rPr>
+          <w:rFonts w:ascii="Arial" w:cs="Arial" w:eastAsia="Arial" w:hAnsi="Arial"/>
+          <w:sz w:val="22"/>
+          <w:szCs w:val="22"/>
+        </w:rPr>
+        <w:t xml:space="preserve">•    Direkt-Confirm: "Yogi aus dem Event austragen?"</w:t>
+      </w:r>
+    </w:p>
+    <w:p>
+      <w:pPr>
+        <w:spacing w:after="40"/>
+        <w:ind w:left="360"/>
+      </w:pPr>
+      <w:r>
+        <w:rPr>
+          <w:rFonts w:ascii="Arial" w:cs="Arial" w:eastAsia="Arial" w:hAnsi="Arial"/>
+          <w:sz w:val="22"/>
+          <w:szCs w:val="22"/>
+        </w:rPr>
+        <w:t xml:space="preserve">•    Bei event_paid + within 7d: zusätzlicher Hinweis "Innerhalb der 7-Tage-Frist — Bezahlung musst du extern erstatten"</w:t>
+      </w:r>
+    </w:p>
+    <w:p>
+      <w:pPr>
+        <w:spacing w:after="40"/>
+        <w:ind w:left="360"/>
+      </w:pPr>
+      <w:r>
+        <w:rPr>
+          <w:rFonts w:ascii="Arial" w:cs="Arial" w:eastAsia="Arial" w:hAnsi="Arial"/>
+          <w:sz w:val="22"/>
+          <w:szCs w:val="22"/>
+        </w:rPr>
+        <w:t xml:space="preserve">• bookings-Update status=cancelled, credit_id war null → keine Credit-Aktion</w:t>
+      </w:r>
+    </w:p>
+    <w:p>
+      <w:pPr>
+        <w:spacing w:after="40"/>
+        <w:ind w:left="360"/>
+      </w:pPr>
+      <w:r>
+        <w:rPr>
+          <w:rFonts w:ascii="Arial" w:cs="Arial" w:eastAsia="Arial" w:hAnsi="Arial"/>
+          <w:sz w:val="22"/>
+          <w:szCs w:val="22"/>
+        </w:rPr>
+        <w:t xml:space="preserve">• DB-Trigger enforce_event_paid_7d_cancel_block lässt Admin durch (is_admin=true Bypass)</w:t>
+      </w:r>
+    </w:p>
+    <w:p>
+      <w:pPr>
+        <w:spacing w:after="40"/>
+        <w:ind w:left="360"/>
+      </w:pPr>
+      <w:r>
+        <w:rPr>
+          <w:rFonts w:ascii="Arial" w:cs="Arial" w:eastAsia="Arial" w:hAnsi="Arial"/>
+          <w:sz w:val="22"/>
+          <w:szCs w:val="22"/>
+        </w:rPr>
+        <w:t xml:space="preserve">• Audit-Log: booking_cancelled_by_admin mit session_type</w:t>
+      </w:r>
+    </w:p>
+    <w:p>
+      <w:pPr>
+        <w:pStyle w:val="Heading2"/>
+      </w:pPr>
+      <w:r>
+        <w:rPr>
+          <w:rFonts w:ascii="Arial" w:cs="Arial" w:eastAsia="Arial" w:hAnsi="Arial"/>
+          <w:color w:val="2E74B5"/>
+          <w:sz w:val="26"/>
+          <w:szCs w:val="26"/>
+        </w:rPr>
+        <w:t xml:space="preserve">16.9 Admin: Event/Einzelstunde absagen</w:t>
+      </w:r>
+    </w:p>
+    <w:p>
+      <w:pPr>
+        <w:spacing w:after="40"/>
+        <w:ind w:left="360"/>
+      </w:pPr>
+      <w:r>
+        <w:rPr>
+          <w:rFonts w:ascii="Arial" w:cs="Arial" w:eastAsia="Arial" w:hAnsi="Arial"/>
+          <w:sz w:val="22"/>
+          <w:szCs w:val="22"/>
+        </w:rPr>
+        <w:t xml:space="preserve">• /admin/kurse → Karte "Absagen"-Button → /admin/sessions/[id]?cancel=1</w:t>
+      </w:r>
+    </w:p>
+    <w:p>
+      <w:pPr>
+        <w:spacing w:after="40"/>
+        <w:ind w:left="360"/>
+      </w:pPr>
+      <w:r>
+        <w:rPr>
+          <w:rFonts w:ascii="Arial" w:cs="Arial" w:eastAsia="Arial" w:hAnsi="Arial"/>
+          <w:sz w:val="22"/>
+          <w:szCs w:val="22"/>
+        </w:rPr>
+        <w:t xml:space="preserve">• Cancel-Form ist session_type-aware:</w:t>
+      </w:r>
+    </w:p>
+    <w:p>
+      <w:pPr>
+        <w:spacing w:after="40"/>
+        <w:ind w:left="360"/>
+      </w:pPr>
+      <w:r>
+        <w:rPr>
+          <w:rFonts w:ascii="Arial" w:cs="Arial" w:eastAsia="Arial" w:hAnsi="Arial"/>
+          <w:sz w:val="22"/>
+          <w:szCs w:val="22"/>
+        </w:rPr>
+        <w:t xml:space="preserve">•    course_session: Ersatztermin-Option + Kurs-Einheiten-Hinweis</w:t>
+      </w:r>
+    </w:p>
+    <w:p>
+      <w:pPr>
+        <w:spacing w:after="40"/>
+        <w:ind w:left="360"/>
+      </w:pPr>
+      <w:r>
+        <w:rPr>
+          <w:rFonts w:ascii="Arial" w:cs="Arial" w:eastAsia="Arial" w:hAnsi="Arial"/>
+          <w:sz w:val="22"/>
+          <w:szCs w:val="22"/>
+        </w:rPr>
+        <w:t xml:space="preserve">•    event_paid: "Eine bereits geleistete Bezahlung erstatte ich extern (PayPal/Überweisung)"</w:t>
+      </w:r>
+    </w:p>
+    <w:p>
+      <w:pPr>
+        <w:spacing w:after="40"/>
+        <w:ind w:left="360"/>
+      </w:pPr>
+      <w:r>
+        <w:rPr>
+          <w:rFonts w:ascii="Arial" w:cs="Arial" w:eastAsia="Arial" w:hAnsi="Arial"/>
+          <w:sz w:val="22"/>
+          <w:szCs w:val="22"/>
+        </w:rPr>
+        <w:t xml:space="preserve">•    event_free: "Da das Event kostenlos war, keine weitere Aktion nötig"</w:t>
+      </w:r>
+    </w:p>
+    <w:p>
+      <w:pPr>
+        <w:spacing w:after="40"/>
+        <w:ind w:left="360"/>
+      </w:pPr>
+      <w:r>
+        <w:rPr>
+          <w:rFonts w:ascii="Arial" w:cs="Arial" w:eastAsia="Arial" w:hAnsi="Arial"/>
+          <w:sz w:val="22"/>
+          <w:szCs w:val="22"/>
+        </w:rPr>
+        <w:t xml:space="preserve">•    single: "Credits zurückgebucht"</w:t>
+      </w:r>
+    </w:p>
+    <w:p>
+      <w:pPr>
+        <w:spacing w:after="40"/>
+        <w:ind w:left="360"/>
+      </w:pPr>
+      <w:r>
+        <w:rPr>
+          <w:rFonts w:ascii="Arial" w:cs="Arial" w:eastAsia="Arial" w:hAnsi="Arial"/>
+          <w:sz w:val="22"/>
+          <w:szCs w:val="22"/>
+        </w:rPr>
+        <w:t xml:space="preserve">• Alle Yogis bekommen Email session_cancelled mit differenziertem Text je session_type — KEIN "Sobald Ersatzstunde…"-Hinweis bei Events/Singles</w:t>
+      </w:r>
+    </w:p>
+    <w:p>
+      <w:pPr>
+        <w:spacing w:after="40"/>
+        <w:ind w:left="360"/>
+      </w:pPr>
+      <w:r>
+        <w:rPr>
+          <w:rFonts w:ascii="Arial" w:cs="Arial" w:eastAsia="Arial" w:hAnsi="Arial"/>
+          <w:sz w:val="22"/>
+          <w:szCs w:val="22"/>
+        </w:rPr>
+        <w:t xml:space="preserve">• Session wandert in Sektion "Abgesagte Stunden &amp; Events" auf /admin/kurse (durchgestrichener Titel, rote Pille)</w:t>
+      </w:r>
+    </w:p>
+    <w:p>
+      <w:pPr>
+        <w:pStyle w:val="Heading2"/>
+      </w:pPr>
+      <w:r>
+        <w:rPr>
+          <w:rFonts w:ascii="Arial" w:cs="Arial" w:eastAsia="Arial" w:hAnsi="Arial"/>
+          <w:color w:val="2E74B5"/>
+          <w:sz w:val="26"/>
+          <w:szCs w:val="26"/>
+        </w:rPr>
+        <w:t xml:space="preserve">16.10 Audit-Log: neue Actions</w:t>
+      </w:r>
+    </w:p>
+    <w:p>
+      <w:pPr>
+        <w:spacing w:after="80"/>
+      </w:pPr>
+      <w:r>
+        <w:rPr>
+          <w:rFonts w:ascii="Arial" w:cs="Arial" w:eastAsia="Arial" w:hAnsi="Arial"/>
+          <w:sz w:val="22"/>
+          <w:szCs w:val="22"/>
+        </w:rPr>
+        <w:t xml:space="preserve">Folgende Actions wurden für Events/Einzelstunden ergänzt und sind in /admin/protokoll mit lesbaren Labels gemappt sowie im Yogi-Protokoll (/admin/yogis/[id]) mit Detail-Text:</w:t>
+      </w:r>
+    </w:p>
+    <w:tbl>
+      <w:tblPr>
+        <w:tblW w:type="auto" w:w="0"/>
+        <w:tblBorders>
+          <w:top w:val="single" w:sz="4" w:space="0" w:color="auto"/>
+          <w:left w:val="single" w:sz="4" w:space="0" w:color="auto"/>
+          <w:bottom w:val="single" w:sz="4" w:space="0" w:color="auto"/>
+          <w:right w:val="single" w:sz="4" w:space="0" w:color="auto"/>
+          <w:insideH w:val="single" w:sz="4" w:space="0" w:color="auto"/>
+          <w:insideV w:val="single" w:sz="4" w:space="0" w:color="auto"/>
+        </w:tblBorders>
+      </w:tblPr>
+      <w:tblGrid>
+        <w:gridCol w:w="3000"/>
+        <w:gridCol w:w="6000"/>
+      </w:tblGrid>
+      <w:tr>
+        <w:tc>
+          <w:tcPr>
+            <w:tcW w:type="dxa" w:w="3000"/>
+          </w:tcPr>
+          <w:p>
+            <w:pPr>
+              <w:spacing w:after="0"/>
+            </w:pPr>
+            <w:r>
+              <w:rPr>
+                <w:rFonts w:ascii="Arial" w:cs="Arial" w:eastAsia="Arial" w:hAnsi="Arial"/>
+                <w:b/>
+                <w:bCs/>
+                <w:sz w:val="22"/>
+                <w:szCs w:val="22"/>
+              </w:rPr>
+              <w:t xml:space="preserve">Action</w:t>
+            </w:r>
+          </w:p>
+        </w:tc>
+        <w:tc>
+          <w:tcPr>
+            <w:tcW w:type="dxa" w:w="6000"/>
+          </w:tcPr>
+          <w:p>
+            <w:pPr>
+              <w:spacing w:after="0"/>
+            </w:pPr>
+            <w:r>
+              <w:rPr>
+                <w:rFonts w:ascii="Arial" w:cs="Arial" w:eastAsia="Arial" w:hAnsi="Arial"/>
+                <w:b/>
+                <w:bCs/>
+                <w:sz w:val="22"/>
+                <w:szCs w:val="22"/>
+              </w:rPr>
+              <w:t xml:space="preserve">Bedeutung</w:t>
+            </w:r>
+          </w:p>
+        </w:tc>
+      </w:tr>
+      <w:tr>
+        <w:tc>
+          <w:tcPr>
+            <w:tcW w:type="dxa" w:w="3000"/>
+          </w:tcPr>
+          <w:p>
+            <w:pPr>
+              <w:spacing w:after="0"/>
+            </w:pPr>
+            <w:r>
+              <w:rPr>
+                <w:rFonts w:ascii="Arial" w:cs="Arial" w:eastAsia="Arial" w:hAnsi="Arial"/>
+                <w:sz w:val="22"/>
+                <w:szCs w:val="22"/>
+              </w:rPr>
+              <w:t xml:space="preserve">single_session_created</w:t>
+            </w:r>
+          </w:p>
+        </w:tc>
+        <w:tc>
+          <w:tcPr>
+            <w:tcW w:type="dxa" w:w="6000"/>
+          </w:tcPr>
+          <w:p>
+            <w:pPr>
+              <w:spacing w:after="0"/>
+            </w:pPr>
+            <w:r>
+              <w:rPr>
+                <w:rFonts w:ascii="Arial" w:cs="Arial" w:eastAsia="Arial" w:hAnsi="Arial"/>
+                <w:sz w:val="22"/>
+                <w:szCs w:val="22"/>
+              </w:rPr>
+              <w:t xml:space="preserve">Admin hat Einzelstunde angelegt</w:t>
+            </w:r>
+          </w:p>
+        </w:tc>
+      </w:tr>
+      <w:tr>
+        <w:tc>
+          <w:tcPr>
+            <w:tcW w:type="dxa" w:w="3000"/>
+          </w:tcPr>
+          <w:p>
+            <w:pPr>
+              <w:spacing w:after="0"/>
+            </w:pPr>
+            <w:r>
+              <w:rPr>
+                <w:rFonts w:ascii="Arial" w:cs="Arial" w:eastAsia="Arial" w:hAnsi="Arial"/>
+                <w:sz w:val="22"/>
+                <w:szCs w:val="22"/>
+              </w:rPr>
+              <w:t xml:space="preserve">single_session_updated</w:t>
+            </w:r>
+          </w:p>
+        </w:tc>
+        <w:tc>
+          <w:tcPr>
+            <w:tcW w:type="dxa" w:w="6000"/>
+          </w:tcPr>
+          <w:p>
+            <w:pPr>
+              <w:spacing w:after="0"/>
+            </w:pPr>
+            <w:r>
+              <w:rPr>
+                <w:rFonts w:ascii="Arial" w:cs="Arial" w:eastAsia="Arial" w:hAnsi="Arial"/>
+                <w:sz w:val="22"/>
+                <w:szCs w:val="22"/>
+              </w:rPr>
+              <w:t xml:space="preserve">Admin hat Einzelstunde bearbeitet</w:t>
+            </w:r>
+          </w:p>
+        </w:tc>
+      </w:tr>
+      <w:tr>
+        <w:tc>
+          <w:tcPr>
+            <w:tcW w:type="dxa" w:w="3000"/>
+          </w:tcPr>
+          <w:p>
+            <w:pPr>
+              <w:spacing w:after="0"/>
+            </w:pPr>
+            <w:r>
+              <w:rPr>
+                <w:rFonts w:ascii="Arial" w:cs="Arial" w:eastAsia="Arial" w:hAnsi="Arial"/>
+                <w:sz w:val="22"/>
+                <w:szCs w:val="22"/>
+              </w:rPr>
+              <w:t xml:space="preserve">event_created</w:t>
+            </w:r>
+          </w:p>
+        </w:tc>
+        <w:tc>
+          <w:tcPr>
+            <w:tcW w:type="dxa" w:w="6000"/>
+          </w:tcPr>
+          <w:p>
+            <w:pPr>
+              <w:spacing w:after="0"/>
+            </w:pPr>
+            <w:r>
+              <w:rPr>
+                <w:rFonts w:ascii="Arial" w:cs="Arial" w:eastAsia="Arial" w:hAnsi="Arial"/>
+                <w:sz w:val="22"/>
+                <w:szCs w:val="22"/>
+              </w:rPr>
+              <w:t xml:space="preserve">Admin hat Event angelegt (mit payment_type + price_eur)</w:t>
+            </w:r>
+          </w:p>
+        </w:tc>
+      </w:tr>
+      <w:tr>
+        <w:tc>
+          <w:tcPr>
+            <w:tcW w:type="dxa" w:w="3000"/>
+          </w:tcPr>
+          <w:p>
+            <w:pPr>
+              <w:spacing w:after="0"/>
+            </w:pPr>
+            <w:r>
+              <w:rPr>
+                <w:rFonts w:ascii="Arial" w:cs="Arial" w:eastAsia="Arial" w:hAnsi="Arial"/>
+                <w:sz w:val="22"/>
+                <w:szCs w:val="22"/>
+              </w:rPr>
+              <w:t xml:space="preserve">event_updated</w:t>
+            </w:r>
+          </w:p>
+        </w:tc>
+        <w:tc>
+          <w:tcPr>
+            <w:tcW w:type="dxa" w:w="6000"/>
+          </w:tcPr>
+          <w:p>
+            <w:pPr>
+              <w:spacing w:after="0"/>
+            </w:pPr>
+            <w:r>
+              <w:rPr>
+                <w:rFonts w:ascii="Arial" w:cs="Arial" w:eastAsia="Arial" w:hAnsi="Arial"/>
+                <w:sz w:val="22"/>
+                <w:szCs w:val="22"/>
+              </w:rPr>
+              <w:t xml:space="preserve">Admin hat Event bearbeitet</w:t>
+            </w:r>
+          </w:p>
+        </w:tc>
+      </w:tr>
+      <w:tr>
+        <w:tc>
+          <w:tcPr>
+            <w:tcW w:type="dxa" w:w="3000"/>
+          </w:tcPr>
+          <w:p>
+            <w:pPr>
+              <w:spacing w:after="0"/>
+            </w:pPr>
+            <w:r>
+              <w:rPr>
+                <w:rFonts w:ascii="Arial" w:cs="Arial" w:eastAsia="Arial" w:hAnsi="Arial"/>
+                <w:sz w:val="22"/>
+                <w:szCs w:val="22"/>
+              </w:rPr>
+              <w:t xml:space="preserve">single_or_event_deleted</w:t>
+            </w:r>
+          </w:p>
+        </w:tc>
+        <w:tc>
+          <w:tcPr>
+            <w:tcW w:type="dxa" w:w="6000"/>
+          </w:tcPr>
+          <w:p>
+            <w:pPr>
+              <w:spacing w:after="0"/>
+            </w:pPr>
+            <w:r>
+              <w:rPr>
+                <w:rFonts w:ascii="Arial" w:cs="Arial" w:eastAsia="Arial" w:hAnsi="Arial"/>
+                <w:sz w:val="22"/>
+                <w:szCs w:val="22"/>
+              </w:rPr>
+              <w:t xml:space="preserve">Einzelstunde / Event gelöscht</w:t>
+            </w:r>
+          </w:p>
+        </w:tc>
+      </w:tr>
+      <w:tr>
+        <w:tc>
+          <w:tcPr>
+            <w:tcW w:type="dxa" w:w="3000"/>
+          </w:tcPr>
+          <w:p>
+            <w:pPr>
+              <w:spacing w:after="0"/>
+            </w:pPr>
+            <w:r>
+              <w:rPr>
+                <w:rFonts w:ascii="Arial" w:cs="Arial" w:eastAsia="Arial" w:hAnsi="Arial"/>
+                <w:sz w:val="22"/>
+                <w:szCs w:val="22"/>
+              </w:rPr>
+              <w:t xml:space="preserve">single_or_event_updated</w:t>
+            </w:r>
+          </w:p>
+        </w:tc>
+        <w:tc>
+          <w:tcPr>
+            <w:tcW w:type="dxa" w:w="6000"/>
+          </w:tcPr>
+          <w:p>
+            <w:pPr>
+              <w:spacing w:after="0"/>
+            </w:pPr>
+            <w:r>
+              <w:rPr>
+                <w:rFonts w:ascii="Arial" w:cs="Arial" w:eastAsia="Arial" w:hAnsi="Arial"/>
+                <w:sz w:val="22"/>
+                <w:szCs w:val="22"/>
+              </w:rPr>
+              <w:t xml:space="preserve">Einzelstunde / Event geändert (z.B. is_open toggled)</w:t>
+            </w:r>
+          </w:p>
+        </w:tc>
+      </w:tr>
+      <w:tr>
+        <w:tc>
+          <w:tcPr>
+            <w:tcW w:type="dxa" w:w="3000"/>
+          </w:tcPr>
+          <w:p>
+            <w:pPr>
+              <w:spacing w:after="0"/>
+            </w:pPr>
+            <w:r>
+              <w:rPr>
+                <w:rFonts w:ascii="Arial" w:cs="Arial" w:eastAsia="Arial" w:hAnsi="Arial"/>
+                <w:sz w:val="22"/>
+                <w:szCs w:val="22"/>
+              </w:rPr>
+              <w:t xml:space="preserve">external_participants_changed</w:t>
+            </w:r>
+          </w:p>
+        </w:tc>
+        <w:tc>
+          <w:tcPr>
+            <w:tcW w:type="dxa" w:w="6000"/>
+          </w:tcPr>
+          <w:p>
+            <w:pPr>
+              <w:spacing w:after="0"/>
+            </w:pPr>
+            <w:r>
+              <w:rPr>
+                <w:rFonts w:ascii="Arial" w:cs="Arial" w:eastAsia="Arial" w:hAnsi="Arial"/>
+                <w:sz w:val="22"/>
+                <w:szCs w:val="22"/>
+              </w:rPr>
+              <w:t xml:space="preserve">Externe Teilnehmer-Zahl geändert (mit old/new)</w:t>
+            </w:r>
+          </w:p>
+        </w:tc>
+      </w:tr>
+      <w:tr>
+        <w:tc>
+          <w:tcPr>
+            <w:tcW w:type="dxa" w:w="3000"/>
+          </w:tcPr>
+          <w:p>
+            <w:pPr>
+              <w:spacing w:after="0"/>
+            </w:pPr>
+            <w:r>
+              <w:rPr>
+                <w:rFonts w:ascii="Arial" w:cs="Arial" w:eastAsia="Arial" w:hAnsi="Arial"/>
+                <w:sz w:val="22"/>
+                <w:szCs w:val="22"/>
+              </w:rPr>
+              <w:t xml:space="preserve">admin_added_yogi_to_event</w:t>
+            </w:r>
+          </w:p>
+        </w:tc>
+        <w:tc>
+          <w:tcPr>
+            <w:tcW w:type="dxa" w:w="6000"/>
+          </w:tcPr>
+          <w:p>
+            <w:pPr>
+              <w:spacing w:after="0"/>
+            </w:pPr>
+            <w:r>
+              <w:rPr>
+                <w:rFonts w:ascii="Arial" w:cs="Arial" w:eastAsia="Arial" w:hAnsi="Arial"/>
+                <w:sz w:val="22"/>
+                <w:szCs w:val="22"/>
+              </w:rPr>
+              <w:t xml:space="preserve">Admin hat Yogi zu Event hinzugefügt (credit_used=false, price_eur)</w:t>
+            </w:r>
+          </w:p>
+        </w:tc>
+      </w:tr>
+      <w:tr>
+        <w:tc>
+          <w:tcPr>
+            <w:tcW w:type="dxa" w:w="3000"/>
+          </w:tcPr>
+          <w:p>
+            <w:pPr>
+              <w:spacing w:after="0"/>
+            </w:pPr>
+            <w:r>
+              <w:rPr>
+                <w:rFonts w:ascii="Arial" w:cs="Arial" w:eastAsia="Arial" w:hAnsi="Arial"/>
+                <w:sz w:val="22"/>
+                <w:szCs w:val="22"/>
+              </w:rPr>
+              <w:t xml:space="preserve">session_open_toggled</w:t>
+            </w:r>
+          </w:p>
+        </w:tc>
+        <w:tc>
+          <w:tcPr>
+            <w:tcW w:type="dxa" w:w="6000"/>
+          </w:tcPr>
+          <w:p>
+            <w:pPr>
+              <w:spacing w:after="0"/>
+            </w:pPr>
+            <w:r>
+              <w:rPr>
+                <w:rFonts w:ascii="Arial" w:cs="Arial" w:eastAsia="Arial" w:hAnsi="Arial"/>
+                <w:sz w:val="22"/>
+                <w:szCs w:val="22"/>
+              </w:rPr>
+              <w:t xml:space="preserve">Stunde/Event freigegeben oder gesperrt</w:t>
+            </w:r>
+          </w:p>
+        </w:tc>
+      </w:tr>
+    </w:tbl>
+    <w:p>
+      <w:pPr>
+        <w:spacing w:after="80"/>
+      </w:pPr>
+    </w:p>
+    <w:p>
+      <w:pPr>
+        <w:pStyle w:val="Heading2"/>
+      </w:pPr>
+      <w:r>
+        <w:rPr>
+          <w:rFonts w:ascii="Arial" w:cs="Arial" w:eastAsia="Arial" w:hAnsi="Arial"/>
+          <w:color w:val="2E74B5"/>
+          <w:sz w:val="26"/>
+          <w:szCs w:val="26"/>
+        </w:rPr>
+        <w:t xml:space="preserve">16.11 BottomNav Yogi-Tab</w:t>
+      </w:r>
+    </w:p>
+    <w:p>
+      <w:pPr>
+        <w:spacing w:after="80"/>
+      </w:pPr>
+      <w:r>
+        <w:rPr>
+          <w:rFonts w:ascii="Arial" w:cs="Arial" w:eastAsia="Arial" w:hAnsi="Arial"/>
+          <w:sz w:val="22"/>
+          <w:szCs w:val="22"/>
+        </w:rPr>
+        <w:t xml:space="preserve">Sarah-Wunsch: der Tab heißt jetzt "Kalender" statt "Kurse", weil unter /kurse auch Events und Einzelstunden erscheinen — nicht nur Kurse. URL bleibt /kurse (keine Routing-Änderung).</w:t>
+      </w:r>
+    </w:p>
+    <w:p>
+      <w:pPr>
+        <w:pStyle w:val="Heading2"/>
+      </w:pPr>
+      <w:r>
+        <w:rPr>
+          <w:rFonts w:ascii="Arial" w:cs="Arial" w:eastAsia="Arial" w:hAnsi="Arial"/>
+          <w:color w:val="2E74B5"/>
+          <w:sz w:val="26"/>
+          <w:szCs w:val="26"/>
+        </w:rPr>
+        <w:t xml:space="preserve">16.12 DB-Trigger enforce_session_max_spots (COALESCE-Fix)</w:t>
+      </w:r>
+    </w:p>
+    <w:p>
+      <w:pPr>
+        <w:spacing w:after="80"/>
+      </w:pPr>
+      <w:r>
+        <w:rPr>
+          <w:rFonts w:ascii="Arial" w:cs="Arial" w:eastAsia="Arial" w:hAnsi="Arial"/>
+          <w:sz w:val="22"/>
+          <w:szCs w:val="22"/>
+        </w:rPr>
+        <w:t xml:space="preserve">Wichtiger Bugfix in Welle 2.11: Der Trigger las course.max_spots, was bei SYS-Container-Kursen 0 ist. Dadurch scheiterte JEDE Event-Buchung mit "Session ist ausgebucht (max_spots=0, aktiv=0)" obwohl Plätze frei waren.</w:t>
+      </w:r>
+    </w:p>
+    <w:p>
+      <w:pPr>
+        <w:spacing w:after="80"/>
+      </w:pPr>
+      <w:r>
+        <w:rPr>
+          <w:rFonts w:ascii="Arial" w:cs="Arial" w:eastAsia="Arial" w:hAnsi="Arial"/>
+          <w:b/>
+          <w:bCs/>
+          <w:sz w:val="22"/>
+          <w:szCs w:val="22"/>
+        </w:rPr>
+        <w:t xml:space="preserve">Fix: </w:t>
+      </w:r>
+      <w:r>
+        <w:rPr>
+          <w:rFonts w:ascii="Arial" w:cs="Arial" w:eastAsia="Arial" w:hAnsi="Arial"/>
+          <w:sz w:val="22"/>
+          <w:szCs w:val="22"/>
+        </w:rPr>
+        <w:t xml:space="preserve">COALESCE(session.max_spots, course.max_spots) — Session-eigene Kapazität hat Vorrang. Sowohl enforce_session_max_spots (Insert) als auch die _on_update-Variante als auch die available_spots()-RPC sind angepasst.</w:t>
+      </w:r>
+    </w:p>
+    <w:p>
+      <w:pPr>
+        <w:pStyle w:val="Heading2"/>
+      </w:pPr>
+      <w:r>
+        <w:rPr>
+          <w:rFonts w:ascii="Arial" w:cs="Arial" w:eastAsia="Arial" w:hAnsi="Arial"/>
+          <w:color w:val="2E74B5"/>
+          <w:sz w:val="26"/>
+          <w:szCs w:val="26"/>
+        </w:rPr>
+        <w:t xml:space="preserve">16.13 DB-Trigger enforce_event_paid_7d_cancel_block</w:t>
+      </w:r>
+    </w:p>
+    <w:p>
+      <w:pPr>
+        <w:spacing w:after="80"/>
+      </w:pPr>
+      <w:r>
+        <w:rPr>
+          <w:rFonts w:ascii="Arial" w:cs="Arial" w:eastAsia="Arial" w:hAnsi="Arial"/>
+          <w:sz w:val="22"/>
+          <w:szCs w:val="22"/>
+        </w:rPr>
+        <w:t xml:space="preserve">Welle 4.5: BEFORE-UPDATE-Trigger auf bookings:</w:t>
+      </w:r>
+    </w:p>
+    <w:p>
+      <w:pPr>
+        <w:spacing w:after="40"/>
+        <w:ind w:left="360"/>
+      </w:pPr>
+      <w:r>
+        <w:rPr>
+          <w:rFonts w:ascii="Arial" w:cs="Arial" w:eastAsia="Arial" w:hAnsi="Arial"/>
+          <w:sz w:val="22"/>
+          <w:szCs w:val="22"/>
+        </w:rPr>
+        <w:t xml:space="preserve">• Greift wenn OLD.status='active' AND NEW.status='cancelled'</w:t>
+      </w:r>
+    </w:p>
+    <w:p>
+      <w:pPr>
+        <w:spacing w:after="40"/>
+        <w:ind w:left="360"/>
+      </w:pPr>
+      <w:r>
+        <w:rPr>
+          <w:rFonts w:ascii="Arial" w:cs="Arial" w:eastAsia="Arial" w:hAnsi="Arial"/>
+          <w:sz w:val="22"/>
+          <w:szCs w:val="22"/>
+        </w:rPr>
+        <w:t xml:space="preserve">• Nur bei session_type='event_paid'</w:t>
+      </w:r>
+    </w:p>
+    <w:p>
+      <w:pPr>
+        <w:spacing w:after="40"/>
+        <w:ind w:left="360"/>
+      </w:pPr>
+      <w:r>
+        <w:rPr>
+          <w:rFonts w:ascii="Arial" w:cs="Arial" w:eastAsia="Arial" w:hAnsi="Arial"/>
+          <w:sz w:val="22"/>
+          <w:szCs w:val="22"/>
+        </w:rPr>
+        <w:t xml:space="preserve">• Nur wenn Sessionstart in weniger als 7 Tagen</w:t>
+      </w:r>
+    </w:p>
+    <w:p>
+      <w:pPr>
+        <w:spacing w:after="40"/>
+        <w:ind w:left="360"/>
+      </w:pPr>
+      <w:r>
+        <w:rPr>
+          <w:rFonts w:ascii="Arial" w:cs="Arial" w:eastAsia="Arial" w:hAnsi="Arial"/>
+          <w:sz w:val="22"/>
+          <w:szCs w:val="22"/>
+        </w:rPr>
+        <w:t xml:space="preserve">• Admin (is_admin=true im Profil) wird durchgelassen</w:t>
+      </w:r>
+    </w:p>
+    <w:p>
+      <w:pPr>
+        <w:spacing w:after="40"/>
+        <w:ind w:left="360"/>
+      </w:pPr>
+      <w:r>
+        <w:rPr>
+          <w:rFonts w:ascii="Arial" w:cs="Arial" w:eastAsia="Arial" w:hAnsi="Arial"/>
+          <w:sz w:val="22"/>
+          <w:szCs w:val="22"/>
+        </w:rPr>
+        <w:t xml:space="preserve">• Sonst: RAISE EXCEPTION mit Hinweis auf Sarah/Ersatzkandidat</w:t>
+      </w:r>
+    </w:p>
+    <w:p>
+      <w:pPr>
+        <w:spacing w:after="80"/>
+      </w:pPr>
+      <w:r>
+        <w:rPr>
+          <w:rFonts w:ascii="Arial" w:cs="Arial" w:eastAsia="Arial" w:hAnsi="Arial"/>
+          <w:sz w:val="22"/>
+          <w:szCs w:val="22"/>
+        </w:rPr>
+        <w:t xml:space="preserve">Damit ist die 7-Tage-Frist nicht nur UI-seitig (kein Button sichtbar) sondern auch auf DB-Ebene erzwungen.</w:t>
+      </w:r>
+    </w:p>
+    <w:p>
+      <w:pPr>
+        <w:pStyle w:val="Heading2"/>
+      </w:pPr>
+      <w:r>
+        <w:rPr>
+          <w:rFonts w:ascii="Arial" w:cs="Arial" w:eastAsia="Arial" w:hAnsi="Arial"/>
+          <w:color w:val="2E74B5"/>
+          <w:sz w:val="26"/>
+          <w:szCs w:val="26"/>
+        </w:rPr>
+        <w:t xml:space="preserve">16.14 Email-Differenzierung</w:t>
+      </w:r>
+    </w:p>
+    <w:p>
+      <w:pPr>
+        <w:spacing w:after="80"/>
+      </w:pPr>
+      <w:r>
+        <w:rPr>
+          <w:rFonts w:ascii="Arial" w:cs="Arial" w:eastAsia="Arial" w:hAnsi="Arial"/>
+          <w:sz w:val="22"/>
+          <w:szCs w:val="22"/>
+        </w:rPr>
+        <w:t xml:space="preserve">Die Edge Function send-email (v64) bekommt jetzt einen sessionType-Parameter und differenziert:</w:t>
+      </w:r>
+    </w:p>
+    <w:p>
+      <w:pPr>
+        <w:spacing w:after="80"/>
+      </w:pPr>
+      <w:r>
+        <w:rPr>
+          <w:rFonts w:ascii="Arial" w:cs="Arial" w:eastAsia="Arial" w:hAnsi="Arial"/>
+          <w:b/>
+          <w:bCs/>
+          <w:sz w:val="22"/>
+          <w:szCs w:val="22"/>
+        </w:rPr>
+        <w:t xml:space="preserve">booking_confirmed:</w:t>
+      </w:r>
+      <w:r>
+        <w:rPr>
+          <w:rFonts w:ascii="Arial" w:cs="Arial" w:eastAsia="Arial" w:hAnsi="Arial"/>
+          <w:sz w:val="22"/>
+          <w:szCs w:val="22"/>
+        </w:rPr>
+        <w:t xml:space="preserve"/>
+      </w:r>
+    </w:p>
+    <w:p>
+      <w:pPr>
+        <w:spacing w:after="40"/>
+        <w:ind w:left="360"/>
+      </w:pPr>
+      <w:r>
+        <w:rPr>
+          <w:rFonts w:ascii="Arial" w:cs="Arial" w:eastAsia="Arial" w:hAnsi="Arial"/>
+          <w:sz w:val="22"/>
+          <w:szCs w:val="22"/>
+        </w:rPr>
+        <w:t xml:space="preserve">• event_paid: Regeln-Block (Verbindlich, 7d, Ersatzkandidat)</w:t>
+      </w:r>
+    </w:p>
+    <w:p>
+      <w:pPr>
+        <w:spacing w:after="40"/>
+        <w:ind w:left="360"/>
+      </w:pPr>
+      <w:r>
+        <w:rPr>
+          <w:rFonts w:ascii="Arial" w:cs="Arial" w:eastAsia="Arial" w:hAnsi="Arial"/>
+          <w:sz w:val="22"/>
+          <w:szCs w:val="22"/>
+        </w:rPr>
+        <w:t xml:space="preserve">• event_free: "Gut zu wissen" (kostenlos)</w:t>
+      </w:r>
+    </w:p>
+    <w:p>
+      <w:pPr>
+        <w:spacing w:after="40"/>
+        <w:ind w:left="360"/>
+      </w:pPr>
+      <w:r>
+        <w:rPr>
+          <w:rFonts w:ascii="Arial" w:cs="Arial" w:eastAsia="Arial" w:hAnsi="Arial"/>
+          <w:sz w:val="22"/>
+          <w:szCs w:val="22"/>
+        </w:rPr>
+        <w:t xml:space="preserve">• single: "3h-Frist" (Credit)</w:t>
+      </w:r>
+    </w:p>
+    <w:p>
+      <w:pPr>
+        <w:spacing w:after="40"/>
+        <w:ind w:left="360"/>
+      </w:pPr>
+      <w:r>
+        <w:rPr>
+          <w:rFonts w:ascii="Arial" w:cs="Arial" w:eastAsia="Arial" w:hAnsi="Arial"/>
+          <w:sz w:val="22"/>
+          <w:szCs w:val="22"/>
+        </w:rPr>
+        <w:t xml:space="preserve">• course_session: Standard (Credit)</w:t>
+      </w:r>
+    </w:p>
+    <w:p>
+      <w:pPr>
+        <w:spacing w:after="80"/>
+      </w:pPr>
+      <w:r>
+        <w:rPr>
+          <w:rFonts w:ascii="Arial" w:cs="Arial" w:eastAsia="Arial" w:hAnsi="Arial"/>
+          <w:b/>
+          <w:bCs/>
+          <w:sz w:val="22"/>
+          <w:szCs w:val="22"/>
+        </w:rPr>
+        <w:t xml:space="preserve">booking_cancelled:</w:t>
+      </w:r>
+      <w:r>
+        <w:rPr>
+          <w:rFonts w:ascii="Arial" w:cs="Arial" w:eastAsia="Arial" w:hAnsi="Arial"/>
+          <w:sz w:val="22"/>
+          <w:szCs w:val="22"/>
+        </w:rPr>
+        <w:t xml:space="preserve"/>
+      </w:r>
+    </w:p>
+    <w:p>
+      <w:pPr>
+        <w:spacing w:after="40"/>
+        <w:ind w:left="360"/>
+      </w:pPr>
+      <w:r>
+        <w:rPr>
+          <w:rFonts w:ascii="Arial" w:cs="Arial" w:eastAsia="Arial" w:hAnsi="Arial"/>
+          <w:sz w:val="22"/>
+          <w:szCs w:val="22"/>
+        </w:rPr>
+        <w:t xml:space="preserve">• event_paid: "rechtzeitig vor 7d, kostenfrei"</w:t>
+      </w:r>
+    </w:p>
+    <w:p>
+      <w:pPr>
+        <w:spacing w:after="40"/>
+        <w:ind w:left="360"/>
+      </w:pPr>
+      <w:r>
+        <w:rPr>
+          <w:rFonts w:ascii="Arial" w:cs="Arial" w:eastAsia="Arial" w:hAnsi="Arial"/>
+          <w:sz w:val="22"/>
+          <w:szCs w:val="22"/>
+        </w:rPr>
+        <w:t xml:space="preserve">• event_free: "Vielleicht sehen wir uns beim nächsten Event"</w:t>
+      </w:r>
+    </w:p>
+    <w:p>
+      <w:pPr>
+        <w:spacing w:after="40"/>
+        <w:ind w:left="360"/>
+      </w:pPr>
+      <w:r>
+        <w:rPr>
+          <w:rFonts w:ascii="Arial" w:cs="Arial" w:eastAsia="Arial" w:hAnsi="Arial"/>
+          <w:sz w:val="22"/>
+          <w:szCs w:val="22"/>
+        </w:rPr>
+        <w:t xml:space="preserve">• single/course: Credit-Logik</w:t>
+      </w:r>
+    </w:p>
+    <w:p>
+      <w:pPr>
+        <w:spacing w:after="80"/>
+      </w:pPr>
+      <w:r>
+        <w:rPr>
+          <w:rFonts w:ascii="Arial" w:cs="Arial" w:eastAsia="Arial" w:hAnsi="Arial"/>
+          <w:b/>
+          <w:bCs/>
+          <w:sz w:val="22"/>
+          <w:szCs w:val="22"/>
+        </w:rPr>
+        <w:t xml:space="preserve">session_cancelled:</w:t>
+      </w:r>
+      <w:r>
+        <w:rPr>
+          <w:rFonts w:ascii="Arial" w:cs="Arial" w:eastAsia="Arial" w:hAnsi="Arial"/>
+          <w:sz w:val="22"/>
+          <w:szCs w:val="22"/>
+        </w:rPr>
+        <w:t xml:space="preserve"/>
+      </w:r>
+    </w:p>
+    <w:p>
+      <w:pPr>
+        <w:spacing w:after="40"/>
+        <w:ind w:left="360"/>
+      </w:pPr>
+      <w:r>
+        <w:rPr>
+          <w:rFonts w:ascii="Arial" w:cs="Arial" w:eastAsia="Arial" w:hAnsi="Arial"/>
+          <w:sz w:val="22"/>
+          <w:szCs w:val="22"/>
+        </w:rPr>
+        <w:t xml:space="preserve">• Subject: "Event abgesagt" / "Stunde abgesagt" / "Kursstunde abgesagt"</w:t>
+      </w:r>
+    </w:p>
+    <w:p>
+      <w:pPr>
+        <w:spacing w:after="40"/>
+        <w:ind w:left="360"/>
+      </w:pPr>
+      <w:r>
+        <w:rPr>
+          <w:rFonts w:ascii="Arial" w:cs="Arial" w:eastAsia="Arial" w:hAnsi="Arial"/>
+          <w:sz w:val="22"/>
+          <w:szCs w:val="22"/>
+        </w:rPr>
+        <w:t xml:space="preserve">• Body: bei event_free/event_paid/single KEIN "Sobald Ersatzstunde"-Satz</w:t>
+      </w:r>
+    </w:p>
+    <w:p>
+      <w:pPr>
+        <w:spacing w:after="40"/>
+        <w:ind w:left="360"/>
+      </w:pPr>
+      <w:r>
+        <w:rPr>
+          <w:rFonts w:ascii="Arial" w:cs="Arial" w:eastAsia="Arial" w:hAnsi="Arial"/>
+          <w:sz w:val="22"/>
+          <w:szCs w:val="22"/>
+        </w:rPr>
+        <w:t xml:space="preserve">• Nur course_session bekommt den Ersatzstunden-Workflow-Hinweis</w:t>
       </w:r>
     </w:p>
     <w:p>

</xml_diff>

<commit_message>
Doku 2026-06-03: System-Doku + Anwendungsfaelle-Word aktualisiert
SYSTEM_DOCUMENTATION.md: neuer Aenderungshistorie-Eintrag 2026-06-03 (Protokoll-Luecken+Haertung, Dashboard=Yogi-Aktivitaet, Banner manuell, Admin-Mail-Fix, Auth/Sidebar-Stabilitaet, Admin-Landing, Test 53, Play-Protect-Hinweis); 2 neue Audit-Actions im Katalog; Korrektur-Hinweis am alten Auto-Banner-Eintrag. Word: neuer Abschnitt Stand 2026-06-03 im Generator + neu erzeugt.

Co-Authored-By: Claude Opus 4.8 <noreply@anthropic.com>
</commit_message>
<xml_diff>
--- a/Yoga-mit-Sarah-Anwendungsfaelle.docx
+++ b/Yoga-mit-Sarah-Anwendungsfaelle.docx
@@ -61,7 +61,7 @@
           <w:sz w:val="22"/>
           <w:szCs w:val="22"/>
         </w:rPr>
-        <w:t xml:space="preserve">Stand: 29. Mai 2026</w:t>
+        <w:t xml:space="preserve">Stand: 3. Juni 2026</w:t>
       </w:r>
     </w:p>
     <w:p>
@@ -75,7 +75,7 @@
           <w:sz w:val="22"/>
           <w:szCs w:val="22"/>
         </w:rPr>
-        <w:t xml:space="preserve">Version 2.4 — Stand der App nach Welle A bis I (UI-Refresh, Credit-Banner, 3h-Modal, Quick-Credit-Form, Krankheits-Austragung, Click-Wrap, 2J-Auto-Refund, DSGVO-Confirm-Mail, Audit-Fixes 29.05.2026 inkl. DSGVO-Restdaten-Löschung) + Akteur-Logik der Storno-Labels (Abgemeldet / Ausgetragen / Abgesagt, einheitlich überall — 29.05.2026)</w:t>
+        <w:t xml:space="preserve">Version 2.7 — Stand der App nach Welle A bis J (UI-Refresh, Credit-Banner, 3h-Modal, Quick-Credit-Form, Krankheits-Austragung, Click-Wrap, 2J-Auto-Refund, DSGVO-Confirm-Mail, Audit-Fixes 29.05.2026 inkl. DSGVO-Restdaten-Löschung) + Akteur-Logik der Storno-Labels (Abgemeldet / Ausgetragen / Abgesagt, einheitlich überall — 29.05.2026) + Fristen-Audit (90-Min-Last-Minute bestätigt, Vorhol 10 Tage / Nachhol 8 Tage origin-bezogen, Krankheits-Guthaben-Lösch-Cron nach 10 Monaten + 4-Wochen-Kalender-Vorwarnung, Late-Offer-Text aktualisiert — 30.05.2026) + Late-Offer ohne Gnadenfrist (Annahme &lt; 90 Min ab Sekunde 1 verbindlich, kein promoted_at; Storno &lt; 3h verfällt — 30.05.2026) + Welle J: Live-Bugfixes (Einladung→Kurs-Auto-Einbuchung zuverlässig, echte Event-/Einzelstunden-Titel in Protokoll &amp; Kachel-Detail, Dashboard-Wochenkacheln) + Sicherheits-Härtung vor Go-Live (kein Self-Admin, keine Credit-Selbstgutschrift, 3-Std-Frist server-seitig erzwungen, robustes Inaktivitäts-Signal — 30.05.2026)</w:t>
       </w:r>
     </w:p>
     <w:p>
@@ -8854,7 +8854,7 @@
           <w:sz w:val="22"/>
           <w:szCs w:val="22"/>
         </w:rPr>
-        <w:t xml:space="preserve">Andere bekommen beim Klick die Meldung „Leider zu spät – jemand anderes war schneller".</w:t>
+        <w:t xml:space="preserve">Andere bekommen beim Klick die Meldung „Schade, ein anderer Yogi war schneller!".</w:t>
       </w:r>
     </w:p>
     <w:p>
@@ -8932,6 +8932,24 @@
           <w:szCs w:val="22"/>
         </w:rPr>
         <w:t xml:space="preserve">Klick nach Stundenbeginn: „Link abgelaufen".</w:t>
+      </w:r>
+    </w:p>
+    <w:p>
+      <w:pPr>
+        <w:pStyle w:val="ListParagraph"/>
+        <w:numPr>
+          <w:ilvl w:val="0"/>
+          <w:numId w:val="1"/>
+        </w:numPr>
+        <w:spacing w:after="40"/>
+      </w:pPr>
+      <w:r>
+        <w:rPr>
+          <w:rFonts w:ascii="Arial" w:cs="Arial" w:eastAsia="Arial" w:hAnsi="Arial"/>
+          <w:sz w:val="22"/>
+          <w:szCs w:val="22"/>
+        </w:rPr>
+        <w:t xml:space="preserve">KEINE 60-Minuten-Gnadenfrist: Wer ein Late-Offer aktiv per Link-Klick annimmt, ist AB SEKUNDE 1 verbindlich gebucht (anders als beim automatischen Nachrücken &gt; 90 Min). Eine Stornierung unter 3 Stunden vor Stundenbeginn gilt sofort als „spät storniert" — der Credit verfällt.</w:t>
       </w:r>
     </w:p>
     <w:p>
@@ -8988,7 +9006,7 @@
           <w:sz w:val="22"/>
           <w:szCs w:val="22"/>
         </w:rPr>
-        <w:t xml:space="preserve">„Leider zu spät – Jemand anderes war schneller"</w:t>
+        <w:t xml:space="preserve">„Schade, ein anderer Yogi war schneller!"</w:t>
       </w:r>
     </w:p>
     <w:p>
@@ -9027,50 +9045,19 @@
     </w:p>
     <w:p>
       <w:pPr>
-        <w:spacing w:after="80"/>
-      </w:pPr>
-      <w:r>
-        <w:rPr>
-          <w:rFonts w:ascii="Arial" w:cs="Arial" w:eastAsia="Arial" w:hAnsi="Arial"/>
-          <w:b/>
-          <w:bCs/>
-          <w:sz w:val="22"/>
-          <w:szCs w:val="22"/>
-        </w:rPr>
-        <w:t xml:space="preserve">E-Mails: </w:t>
-      </w:r>
-      <w:r>
-        <w:rPr>
-          <w:rFonts w:ascii="Arial" w:cs="Arial" w:eastAsia="Arial" w:hAnsi="Arial"/>
-          <w:sz w:val="22"/>
-          <w:szCs w:val="22"/>
-        </w:rPr>
-        <w:t xml:space="preserve"/>
-      </w:r>
-    </w:p>
-    <w:p>
-      <w:pPr>
-        <w:spacing w:after="80"/>
-      </w:pPr>
-      <w:r>
-        <w:rPr>
-          <w:rFonts w:ascii="Arial" w:cs="Arial" w:eastAsia="Arial" w:hAnsi="Arial"/>
-          <w:b/>
-          <w:bCs/>
-          <w:sz w:val="22"/>
-          <w:szCs w:val="22"/>
-        </w:rPr>
-        <w:t xml:space="preserve">Betreff: </w:t>
-      </w:r>
+        <w:spacing w:after="60"/>
+        <w:ind w:left="288"/>
+      </w:pPr>
       <w:r>
         <w:rPr>
           <w:rFonts w:ascii="Arial" w:cs="Arial" w:eastAsia="Arial" w:hAnsi="Arial"/>
           <w:i/>
           <w:iCs/>
-          <w:sz w:val="22"/>
-          <w:szCs w:val="22"/>
-        </w:rPr>
-        <w:t xml:space="preserve">„Letzte Chance: [Kursname] in Kürze"</w:t>
+          <w:color w:val="555555"/>
+          <w:sz w:val="22"/>
+          <w:szCs w:val="22"/>
+        </w:rPr>
+        <w:t xml:space="preserve">„Verbindliche Sofort-Buchung – kostenfreie Stornierung so kurzfristig nicht mehr möglich."</w:t>
       </w:r>
     </w:p>
     <w:p>
@@ -9085,15 +9072,15 @@
           <w:sz w:val="22"/>
           <w:szCs w:val="22"/>
         </w:rPr>
-        <w:t xml:space="preserve">Empfänger: </w:t>
-      </w:r>
-      <w:r>
-        <w:rPr>
-          <w:rFonts w:ascii="Arial" w:cs="Arial" w:eastAsia="Arial" w:hAnsi="Arial"/>
-          <w:sz w:val="22"/>
-          <w:szCs w:val="22"/>
-        </w:rPr>
-        <w:t xml:space="preserve">Alle Wartelisten-Yogis dieser Stunde</w:t>
+        <w:t xml:space="preserve">E-Mails: </w:t>
+      </w:r>
+      <w:r>
+        <w:rPr>
+          <w:rFonts w:ascii="Arial" w:cs="Arial" w:eastAsia="Arial" w:hAnsi="Arial"/>
+          <w:sz w:val="22"/>
+          <w:szCs w:val="22"/>
+        </w:rPr>
+        <w:t xml:space="preserve"/>
       </w:r>
     </w:p>
     <w:p>
@@ -9108,7 +9095,7 @@
           <w:sz w:val="22"/>
           <w:szCs w:val="22"/>
         </w:rPr>
-        <w:t xml:space="preserve">Kernaussage: </w:t>
+        <w:t xml:space="preserve">Betreff: </w:t>
       </w:r>
       <w:r>
         <w:rPr>
@@ -9118,7 +9105,55 @@
           <w:sz w:val="22"/>
           <w:szCs w:val="22"/>
         </w:rPr>
-        <w:t xml:space="preserve">„Hallo [Vorname], ein Platz wurde gerade frei — aber es ist weniger als 90 Minuten vor Stundenbeginn. [Datum, Uhrzeit]. Alle Wartelisten-Yogis bekommen diese Mail — wer zuerst klickt, bekommt den Platz. Wenn du nicht reagierst, passiert nichts — dein Wartelisten-Platz bleibt aber auch nicht erhalten für diese Stunde."</w:t>
+        <w:t xml:space="preserve">„Letzte Chance: [Kursname] in Kürze"</w:t>
+      </w:r>
+    </w:p>
+    <w:p>
+      <w:pPr>
+        <w:spacing w:after="80"/>
+      </w:pPr>
+      <w:r>
+        <w:rPr>
+          <w:rFonts w:ascii="Arial" w:cs="Arial" w:eastAsia="Arial" w:hAnsi="Arial"/>
+          <w:b/>
+          <w:bCs/>
+          <w:sz w:val="22"/>
+          <w:szCs w:val="22"/>
+        </w:rPr>
+        <w:t xml:space="preserve">Empfänger: </w:t>
+      </w:r>
+      <w:r>
+        <w:rPr>
+          <w:rFonts w:ascii="Arial" w:cs="Arial" w:eastAsia="Arial" w:hAnsi="Arial"/>
+          <w:sz w:val="22"/>
+          <w:szCs w:val="22"/>
+        </w:rPr>
+        <w:t xml:space="preserve">Alle Wartelisten-Yogis dieser Stunde</w:t>
+      </w:r>
+    </w:p>
+    <w:p>
+      <w:pPr>
+        <w:spacing w:after="80"/>
+      </w:pPr>
+      <w:r>
+        <w:rPr>
+          <w:rFonts w:ascii="Arial" w:cs="Arial" w:eastAsia="Arial" w:hAnsi="Arial"/>
+          <w:b/>
+          <w:bCs/>
+          <w:sz w:val="22"/>
+          <w:szCs w:val="22"/>
+        </w:rPr>
+        <w:t xml:space="preserve">Kernaussage: </w:t>
+      </w:r>
+      <w:r>
+        <w:rPr>
+          <w:rFonts w:ascii="Arial" w:cs="Arial" w:eastAsia="Arial" w:hAnsi="Arial"/>
+          <w:i/>
+          <w:iCs/>
+          <w:sz w:val="22"/>
+          <w:szCs w:val="22"/>
+        </w:rPr>
+        <w:t xml:space="preserve">„Hallo [Vorname], ein Platz wurde gerade frei — aber es ist weniger als 90 Minuten vor Stundenbeginn. [Datum, Uhrzeit]. Alle Wartelisten-Yogis bekommen diese Mail — wer zuerst klickt, bekommt den Platz. Verbindliche Sofort-Buchung – kostenfreie Stornierung so kurzfristig nicht mehr möglich. Wenn du nicht reagierst, passiert nichts — dein Wartelisten-Platz bleibt aber auch nicht erhalten für diese Stunde."</w:t>
       </w:r>
     </w:p>
     <w:p>
@@ -16606,7 +16641,7 @@
           <w:sz w:val="22"/>
           <w:szCs w:val="22"/>
         </w:rPr>
-        <w:t xml:space="preserve">„Hallo [Vorname], ich habe dich in einen Kurs eingetragen. Kurs: [Name]. 📅 [Wochentag] um [Uhrzeit]. [Dauer] Minuten pro Einheit. ✅ Du nimmst an allen [X] Stunden teil — du hast dafür [X] Credits in deinem Profil. Wichtige Regeln: Abmeldung kostenlos bis 3 Stunden vorher, Nachholen bis 8 Tage nach Kursende, Vorholen max. 10 Tage im Voraus, Rücktritt vom gesamten Kurs kostenlos bis 14 Tage vor Kursbeginn — danach Gebühr (30 € bis 7 Tage vorher, ab 6 Tagen volle Gebühr); Ersatzteilnehmer jederzeit möglich."</w:t>
+        <w:t xml:space="preserve">„Hallo [Vorname], ich habe dich in einen Kurs eingetragen. Kurs: [Name]. 📅 [Wochentag] um [Uhrzeit]. [Dauer] Minuten pro Einheit. ✅ Du nimmst an allen [X] Stunden teil — du hast dafür [X] Credits in deinem Profil. Wichtige Regeln: Abmeldung kostenlos bis 3 Stunden vorher, Nachholen bis 8 Tage nach Kursende, Vorholen max. 10 Tage im Voraus, Rücktritt vom gesamten Kurs kostenlos bis 14 Tage vor Kursbeginn — danach gilt: gebucht ist gebucht, die volle Kursgebühr fällt an; Ersatzteilnehmer jederzeit möglich. Danke für Dein Verständnis und deine Wertschätzung für meine Planung ❤️"</w:t>
       </w:r>
     </w:p>
     <w:p>
@@ -31495,7 +31530,7 @@
           <w:sz w:val="22"/>
           <w:szCs w:val="22"/>
         </w:rPr>
-        <w:t xml:space="preserve">Stornofrist auf 14 Tage erhöht + 30 € Bearbeitungsgebühr im Fenster 13–7 Tage.</w:t>
+        <w:t xml:space="preserve">Stornofrist vereinfacht: kostenfrei bis 14 Tage vor Kursbeginn, danach „gebucht ist gebucht" (volle Kursgebühr). Ersatzteilnehmer jederzeit möglich.</w:t>
       </w:r>
     </w:p>
     <w:p>
@@ -32023,7 +32058,7 @@
           <w:sz w:val="26"/>
           <w:szCs w:val="26"/>
         </w:rPr>
-        <w:t xml:space="preserve">Stornofrist neu: 14 Tage + 30 € Bearbeitungsgebühr (13–7 Tage)</w:t>
+        <w:t xml:space="preserve">Stornofrist: 14 Tage, danach „gebucht ist gebucht" (volle Kursgebühr)</w:t>
       </w:r>
     </w:p>
     <w:tbl>
@@ -32072,7 +32107,7 @@
                 <w:sz w:val="22"/>
                 <w:szCs w:val="22"/>
               </w:rPr>
-              <w:t xml:space="preserve">Die Stornofrist für komplette Kurse wurde von 7 auf 14 Tage erhöht; im Fenster 13–7 Tage vorher fällt eine Bearbeitungsgebühr von 30 € an. Unter 7 Tagen ist die volle Kursgebühr fällig. Ersatzteilnehmer sind jederzeit möglich.</w:t>
+              <w:t xml:space="preserve">Die Stornofrist für komplette Kurse: kostenfrei bis 14 Tage vor Kursbeginn. Danach gilt „gebucht ist gebucht" — die volle Kursgebühr ist fällig. Ersatzteilnehmer sind jederzeit möglich. (Die frühere 30-€-Zwischenstufe im Fenster 13–7 Tage entfällt.)</w:t>
             </w:r>
           </w:p>
         </w:tc>
@@ -32151,43 +32186,25 @@
           <w:sz w:val="22"/>
           <w:szCs w:val="22"/>
         </w:rPr>
-        <w:t xml:space="preserve">&gt; 14 Tage vor Kursbeginn: kostenfreie Stornierung.</w:t>
-      </w:r>
-    </w:p>
-    <w:p>
-      <w:pPr>
-        <w:pStyle w:val="ListParagraph"/>
-        <w:numPr>
-          <w:ilvl w:val="0"/>
-          <w:numId w:val="1"/>
-        </w:numPr>
-        <w:spacing w:after="40"/>
-      </w:pPr>
-      <w:r>
-        <w:rPr>
-          <w:rFonts w:ascii="Arial" w:cs="Arial" w:eastAsia="Arial" w:hAnsi="Arial"/>
-          <w:sz w:val="22"/>
-          <w:szCs w:val="22"/>
-        </w:rPr>
-        <w:t xml:space="preserve">13 bis 7 Tage vor Kursbeginn: 30 € Bearbeitungsgebühr, da der Platz kurzfristig neu vergeben werden muss.</w:t>
-      </w:r>
-    </w:p>
-    <w:p>
-      <w:pPr>
-        <w:pStyle w:val="ListParagraph"/>
-        <w:numPr>
-          <w:ilvl w:val="0"/>
-          <w:numId w:val="1"/>
-        </w:numPr>
-        <w:spacing w:after="40"/>
-      </w:pPr>
-      <w:r>
-        <w:rPr>
-          <w:rFonts w:ascii="Arial" w:cs="Arial" w:eastAsia="Arial" w:hAnsi="Arial"/>
-          <w:sz w:val="22"/>
-          <w:szCs w:val="22"/>
-        </w:rPr>
-        <w:t xml:space="preserve">&lt; 7 Tage vor Kursbeginn: volle Kursgebühr ist fällig — auch bei Nichterscheinen.</w:t>
+        <w:t xml:space="preserve">Bis 14 Tage vor Kursbeginn: kostenfreie Stornierung.</w:t>
+      </w:r>
+    </w:p>
+    <w:p>
+      <w:pPr>
+        <w:pStyle w:val="ListParagraph"/>
+        <w:numPr>
+          <w:ilvl w:val="0"/>
+          <w:numId w:val="1"/>
+        </w:numPr>
+        <w:spacing w:after="40"/>
+      </w:pPr>
+      <w:r>
+        <w:rPr>
+          <w:rFonts w:ascii="Arial" w:cs="Arial" w:eastAsia="Arial" w:hAnsi="Arial"/>
+          <w:sz w:val="22"/>
+          <w:szCs w:val="22"/>
+        </w:rPr>
+        <w:t xml:space="preserve">Ab 14 Tagen vor Kursbeginn: gebucht ist gebucht — die volle Kursgebühr ist fällig, auch bei Nichterscheinen.</w:t>
       </w:r>
     </w:p>
     <w:p>
@@ -32321,7 +32338,7 @@
           <w:sz w:val="22"/>
           <w:szCs w:val="22"/>
         </w:rPr>
-        <w:t xml:space="preserve">„30 € Bearbeitungsgebühr (13 bis 7 Tage vorher)"</w:t>
+        <w:t xml:space="preserve">„Danach: gebucht ist gebucht — volle Kursgebühr"</w:t>
       </w:r>
     </w:p>
     <w:p>
@@ -32338,7 +32355,7 @@
           <w:sz w:val="22"/>
           <w:szCs w:val="22"/>
         </w:rPr>
-        <w:t xml:space="preserve">„Volle Kursgebühr ab 6 Tagen vorher"</w:t>
+        <w:t xml:space="preserve">„Ersatzteilnehmer jederzeit möglich"</w:t>
       </w:r>
     </w:p>
     <w:p>
@@ -32355,7 +32372,7 @@
           <w:sz w:val="22"/>
           <w:szCs w:val="22"/>
         </w:rPr>
-        <w:t xml:space="preserve">„Ersatzteilnehmer jederzeit möglich"</w:t>
+        <w:t xml:space="preserve">„Danke für Dein Verständnis und deine Wertschätzung für meine Planung ❤️"</w:t>
       </w:r>
     </w:p>
     <w:p>
@@ -32685,7 +32702,7 @@
           <w:sz w:val="22"/>
           <w:szCs w:val="22"/>
         </w:rPr>
-        <w:t xml:space="preserve">Nur Kursabbruch-Guthaben (2 Jahre) betroffen — Krankheits-Guthaben (10 Monate, source=„illness") verfällt nach AGB ersatzlos und wird NICHT automatisch erstattet.</w:t>
+        <w:t xml:space="preserve">Nur Kursabbruch-Guthaben (2 Jahre) betroffen — Krankheits-Guthaben (10 Monate, source=„illness") verfällt nach AGB ersatzlos und wird NICHT erstattet, sondern durch den separaten Lösch-Cron fn_check_illness_credit_expiry hart gelöscht (siehe eigener Anwendungsfall direkt unten).</w:t>
       </w:r>
     </w:p>
     <w:p>
@@ -32986,7 +33003,7 @@
           <w:sz w:val="26"/>
           <w:szCs w:val="26"/>
         </w:rPr>
-        <w:t xml:space="preserve">Account-Lösch-Bestätigungs-E-Mail an Yogi (DSGVO Art. 12)</w:t>
+        <w:t xml:space="preserve">Cron-Job: Krankheits-Guthaben-Löschung nach 10 Monaten (+ 4-Wochen-Vorwarnung)</w:t>
       </w:r>
     </w:p>
     <w:tbl>
@@ -33035,7 +33052,7 @@
                 <w:sz w:val="22"/>
                 <w:szCs w:val="22"/>
               </w:rPr>
-              <w:t xml:space="preserve">Wenn ein Yogi seinen Account selbst löscht oder durch Sarah gelöscht wird, erhält der Yogi VOR dem finalen Auth-Delete eine Bestätigungs-Mail an seine bisherige E-Mail-Adresse. Diese E-Mail ist die letzte Nachricht der App an den Yogi.</w:t>
+              <w:t xml:space="preserve">Ein täglicher Cron-Job (fn_check_illness_credit_expiry) löscht abgelaufene Krankheits-Guthaben (credits.source=„illness", 10 Monate) hart und ersatzlos. Anders als beim Kursabbruch-Guthaben gibt es KEINE Auszahlung — Krankheits-Guthaben ist eine Kulanz. Vier Wochen vor Ablauf wird der Yogi im Kalender gewarnt.</w:t>
             </w:r>
           </w:p>
         </w:tc>
@@ -33070,7 +33087,7 @@
                 <w:sz w:val="22"/>
                 <w:szCs w:val="22"/>
               </w:rPr>
-              <w:t xml:space="preserve">System (lib/email.ts → Email.accountDeletedYogi)</w:t>
+              <w:t xml:space="preserve">System (DB-Function + pg_cron, täglich 05:00 Uhr) + Yogi (sieht Vorwarnung)</w:t>
             </w:r>
           </w:p>
         </w:tc>
@@ -33114,97 +33131,79 @@
           <w:sz w:val="22"/>
           <w:szCs w:val="22"/>
         </w:rPr>
-        <w:t xml:space="preserve">Yogi (oder Sarah als Admin) löst die Löschung aus.</w:t>
-      </w:r>
-    </w:p>
-    <w:p>
-      <w:pPr>
-        <w:pStyle w:val="ListParagraph"/>
-        <w:numPr>
-          <w:ilvl w:val="0"/>
-          <w:numId w:val="1"/>
-        </w:numPr>
-        <w:spacing w:after="40"/>
-      </w:pPr>
-      <w:r>
-        <w:rPr>
-          <w:rFonts w:ascii="Arial" w:cs="Arial" w:eastAsia="Arial" w:hAnsi="Arial"/>
-          <w:sz w:val="22"/>
-          <w:szCs w:val="22"/>
-        </w:rPr>
-        <w:t xml:space="preserve">Cascade läuft: Buchungen storniert, Wartelisten entfernt, Plätze freigegeben, PII anonymisiert, Credits/Guthaben verfallen.</w:t>
-      </w:r>
-    </w:p>
-    <w:p>
-      <w:pPr>
-        <w:pStyle w:val="ListParagraph"/>
-        <w:numPr>
-          <w:ilvl w:val="0"/>
-          <w:numId w:val="1"/>
-        </w:numPr>
-        <w:spacing w:after="40"/>
-      </w:pPr>
-      <w:r>
-        <w:rPr>
-          <w:rFonts w:ascii="Arial" w:cs="Arial" w:eastAsia="Arial" w:hAnsi="Arial"/>
-          <w:sz w:val="22"/>
-          <w:szCs w:val="22"/>
-        </w:rPr>
-        <w:t xml:space="preserve">BEVOR der Auth-User in Supabase Auth gelöscht wird: System ruft Email.accountDeletedYogi({email, firstName}) auf.</w:t>
-      </w:r>
-    </w:p>
-    <w:p>
-      <w:pPr>
-        <w:pStyle w:val="ListParagraph"/>
-        <w:numPr>
-          <w:ilvl w:val="0"/>
-          <w:numId w:val="1"/>
-        </w:numPr>
-        <w:spacing w:after="40"/>
-      </w:pPr>
-      <w:r>
-        <w:rPr>
-          <w:rFonts w:ascii="Arial" w:cs="Arial" w:eastAsia="Arial" w:hAnsi="Arial"/>
-          <w:sz w:val="22"/>
-          <w:szCs w:val="22"/>
-        </w:rPr>
-        <w:t xml:space="preserve">Yogi bekommt eine E-Mail mit Betreff „Dein Account bei Yoga mit Sarah wurde gelöscht".</w:t>
-      </w:r>
-    </w:p>
-    <w:p>
-      <w:pPr>
-        <w:pStyle w:val="ListParagraph"/>
-        <w:numPr>
-          <w:ilvl w:val="0"/>
-          <w:numId w:val="1"/>
-        </w:numPr>
-        <w:spacing w:after="40"/>
-      </w:pPr>
-      <w:r>
-        <w:rPr>
-          <w:rFonts w:ascii="Arial" w:cs="Arial" w:eastAsia="Arial" w:hAnsi="Arial"/>
-          <w:sz w:val="22"/>
-          <w:szCs w:val="22"/>
-        </w:rPr>
-        <w:t xml:space="preserve">Erst danach wird der Supabase-Auth-User entfernt und die E-Mail-Adresse aus der Datenbank gelöscht.</w:t>
-      </w:r>
-    </w:p>
-    <w:p>
-      <w:pPr>
-        <w:pStyle w:val="ListParagraph"/>
-        <w:numPr>
-          <w:ilvl w:val="0"/>
-          <w:numId w:val="1"/>
-        </w:numPr>
-        <w:spacing w:after="40"/>
-      </w:pPr>
-      <w:r>
-        <w:rPr>
-          <w:rFonts w:ascii="Arial" w:cs="Arial" w:eastAsia="Arial" w:hAnsi="Arial"/>
-          <w:sz w:val="22"/>
-          <w:szCs w:val="22"/>
-        </w:rPr>
-        <w:t xml:space="preserve">Parallel geht admin_dsgvo_deletion-Mail an Sarah (Hinweis auf manuelle PDF-Löschung).</w:t>
+        <w:t xml:space="preserve">4 Wochen (28 Tage) vor Ablauf zeigt der Yogi-Kalender (/kurse) oben einen Hinweis: „Dein Krankheits-Guthaben läuft in [Frist] ab (gültig bis [Datum]) und wird danach gelöscht."</w:t>
+      </w:r>
+    </w:p>
+    <w:p>
+      <w:pPr>
+        <w:pStyle w:val="ListParagraph"/>
+        <w:numPr>
+          <w:ilvl w:val="0"/>
+          <w:numId w:val="1"/>
+        </w:numPr>
+        <w:spacing w:after="40"/>
+      </w:pPr>
+      <w:r>
+        <w:rPr>
+          <w:rFonts w:ascii="Arial" w:cs="Arial" w:eastAsia="Arial" w:hAnsi="Arial"/>
+          <w:sz w:val="22"/>
+          <w:szCs w:val="22"/>
+        </w:rPr>
+        <w:t xml:space="preserve">Am Verfallstag wechselt der Hinweis zu „Dein Krankheits-Guthaben verfällt heute und wird gelöscht."</w:t>
+      </w:r>
+    </w:p>
+    <w:p>
+      <w:pPr>
+        <w:pStyle w:val="ListParagraph"/>
+        <w:numPr>
+          <w:ilvl w:val="0"/>
+          <w:numId w:val="1"/>
+        </w:numPr>
+        <w:spacing w:after="40"/>
+      </w:pPr>
+      <w:r>
+        <w:rPr>
+          <w:rFonts w:ascii="Arial" w:cs="Arial" w:eastAsia="Arial" w:hAnsi="Arial"/>
+          <w:sz w:val="22"/>
+          <w:szCs w:val="22"/>
+        </w:rPr>
+        <w:t xml:space="preserve">pg_cron ruft täglich um 05:00 Uhr die DB-Function public.fn_check_illness_credit_expiry(p_dry_run) auf.</w:t>
+      </w:r>
+    </w:p>
+    <w:p>
+      <w:pPr>
+        <w:pStyle w:val="ListParagraph"/>
+        <w:numPr>
+          <w:ilvl w:val="0"/>
+          <w:numId w:val="1"/>
+        </w:numPr>
+        <w:spacing w:after="40"/>
+      </w:pPr>
+      <w:r>
+        <w:rPr>
+          <w:rFonts w:ascii="Arial" w:cs="Arial" w:eastAsia="Arial" w:hAnsi="Arial"/>
+          <w:sz w:val="22"/>
+          <w:szCs w:val="22"/>
+        </w:rPr>
+        <w:t xml:space="preserve">Standardmäßig läuft der Cron als Trockenlauf (p_dry_run=true): er zählt nur die ablaufenden Guthaben und legt eine Info-Notification (illness_cleanup_dryrun) an — es wird NICHTS gelöscht.</w:t>
+      </w:r>
+    </w:p>
+    <w:p>
+      <w:pPr>
+        <w:pStyle w:val="ListParagraph"/>
+        <w:numPr>
+          <w:ilvl w:val="0"/>
+          <w:numId w:val="1"/>
+        </w:numPr>
+        <w:spacing w:after="40"/>
+      </w:pPr>
+      <w:r>
+        <w:rPr>
+          <w:rFonts w:ascii="Arial" w:cs="Arial" w:eastAsia="Arial" w:hAnsi="Arial"/>
+          <w:sz w:val="22"/>
+          <w:szCs w:val="22"/>
+        </w:rPr>
+        <w:t xml:space="preserve">Die echte Löschung erfolgt erst beim Aufruf mit p_dry_run=false: pro Treffer wird ein Audit-Log „illness_credit_expired" geschrieben und der Credit hart gelöscht (DELETE FROM credits).</w:t>
       </w:r>
     </w:p>
     <w:p>
@@ -33245,43 +33244,61 @@
           <w:sz w:val="22"/>
           <w:szCs w:val="22"/>
         </w:rPr>
-        <w:t xml:space="preserve">Rechtsgrundlage: DSGVO Art. 12 (Transparenz) — der Yogi muss über die Verarbeitung (hier: die Löschung) informiert werden.</w:t>
-      </w:r>
-    </w:p>
-    <w:p>
-      <w:pPr>
-        <w:pStyle w:val="ListParagraph"/>
-        <w:numPr>
-          <w:ilvl w:val="0"/>
-          <w:numId w:val="1"/>
-        </w:numPr>
-        <w:spacing w:after="40"/>
-      </w:pPr>
-      <w:r>
-        <w:rPr>
-          <w:rFonts w:ascii="Arial" w:cs="Arial" w:eastAsia="Arial" w:hAnsi="Arial"/>
-          <w:sz w:val="22"/>
-          <w:szCs w:val="22"/>
-        </w:rPr>
-        <w:t xml:space="preserve">E-Mail wird auch versandt, wenn Admin (Sarah) den Account löscht — nicht nur bei Selbstlöschung.</w:t>
-      </w:r>
-    </w:p>
-    <w:p>
-      <w:pPr>
-        <w:pStyle w:val="ListParagraph"/>
-        <w:numPr>
-          <w:ilvl w:val="0"/>
-          <w:numId w:val="1"/>
-        </w:numPr>
-        <w:spacing w:after="40"/>
-      </w:pPr>
-      <w:r>
-        <w:rPr>
-          <w:rFonts w:ascii="Arial" w:cs="Arial" w:eastAsia="Arial" w:hAnsi="Arial"/>
-          <w:sz w:val="22"/>
-          <w:szCs w:val="22"/>
-        </w:rPr>
-        <w:t xml:space="preserve">Direkter fetch zur Edge-Function send-email wurde aus app/profil/page.tsx und app/admin/yogis/[id]/page.tsx entfernt (fehlte x-function-secret → 401); jetzt ausschließlich über zentralen Email-Helper.</w:t>
+        <w:t xml:space="preserve">Nur Krankheits-Guthaben (source=„illness", 10 Monate) betroffen — Kursabbruch-Guthaben (2 Jahre) wird NICHT gelöscht, sondern ausgezahlt (siehe Cron oben).</w:t>
+      </w:r>
+    </w:p>
+    <w:p>
+      <w:pPr>
+        <w:pStyle w:val="ListParagraph"/>
+        <w:numPr>
+          <w:ilvl w:val="0"/>
+          <w:numId w:val="1"/>
+        </w:numPr>
+        <w:spacing w:after="40"/>
+      </w:pPr>
+      <w:r>
+        <w:rPr>
+          <w:rFonts w:ascii="Arial" w:cs="Arial" w:eastAsia="Arial" w:hAnsi="Arial"/>
+          <w:sz w:val="22"/>
+          <w:szCs w:val="22"/>
+        </w:rPr>
+        <w:t xml:space="preserve">Krankheits-Guthaben ist Kulanz (keine bezahlte Leistung) → es verfällt ersatzlos, ohne Geld-Erstattung.</w:t>
+      </w:r>
+    </w:p>
+    <w:p>
+      <w:pPr>
+        <w:pStyle w:val="ListParagraph"/>
+        <w:numPr>
+          <w:ilvl w:val="0"/>
+          <w:numId w:val="1"/>
+        </w:numPr>
+        <w:spacing w:after="40"/>
+      </w:pPr>
+      <w:r>
+        <w:rPr>
+          <w:rFonts w:ascii="Arial" w:cs="Arial" w:eastAsia="Arial" w:hAnsi="Arial"/>
+          <w:sz w:val="22"/>
+          <w:szCs w:val="22"/>
+        </w:rPr>
+        <w:t xml:space="preserve">Der Yogi wird 4 Wochen vorher im Kalender gewarnt — danach ist das Guthaben unwiederbringlich weg.</w:t>
+      </w:r>
+    </w:p>
+    <w:p>
+      <w:pPr>
+        <w:pStyle w:val="ListParagraph"/>
+        <w:numPr>
+          <w:ilvl w:val="0"/>
+          <w:numId w:val="1"/>
+        </w:numPr>
+        <w:spacing w:after="40"/>
+      </w:pPr>
+      <w:r>
+        <w:rPr>
+          <w:rFonts w:ascii="Arial" w:cs="Arial" w:eastAsia="Arial" w:hAnsi="Arial"/>
+          <w:sz w:val="22"/>
+          <w:szCs w:val="22"/>
+        </w:rPr>
+        <w:t xml:space="preserve">Im Yogi-Protokoll erscheint der Eintrag als „Krankheits-Guthaben nach 10 Monaten abgelaufen und gelöscht".</w:t>
       </w:r>
     </w:p>
     <w:p>
@@ -33296,7 +33313,7 @@
           <w:sz w:val="22"/>
           <w:szCs w:val="22"/>
         </w:rPr>
-        <w:t xml:space="preserve">E-Mails: </w:t>
+        <w:t xml:space="preserve">Angezeigte Texte: </w:t>
       </w:r>
       <w:r>
         <w:rPr>
@@ -33309,75 +33326,36 @@
     </w:p>
     <w:p>
       <w:pPr>
-        <w:spacing w:after="80"/>
-      </w:pPr>
-      <w:r>
-        <w:rPr>
-          <w:rFonts w:ascii="Arial" w:cs="Arial" w:eastAsia="Arial" w:hAnsi="Arial"/>
-          <w:b/>
-          <w:bCs/>
-          <w:sz w:val="22"/>
-          <w:szCs w:val="22"/>
-        </w:rPr>
-        <w:t xml:space="preserve">Betreff: </w:t>
-      </w:r>
+        <w:spacing w:after="60"/>
+        <w:ind w:left="288"/>
+      </w:pPr>
       <w:r>
         <w:rPr>
           <w:rFonts w:ascii="Arial" w:cs="Arial" w:eastAsia="Arial" w:hAnsi="Arial"/>
           <w:i/>
           <w:iCs/>
-          <w:sz w:val="22"/>
-          <w:szCs w:val="22"/>
-        </w:rPr>
-        <w:t xml:space="preserve">„Dein Account bei Yoga mit Sarah wurde gelöscht"</w:t>
-      </w:r>
-    </w:p>
-    <w:p>
-      <w:pPr>
-        <w:spacing w:after="80"/>
-      </w:pPr>
-      <w:r>
-        <w:rPr>
-          <w:rFonts w:ascii="Arial" w:cs="Arial" w:eastAsia="Arial" w:hAnsi="Arial"/>
-          <w:b/>
-          <w:bCs/>
-          <w:sz w:val="22"/>
-          <w:szCs w:val="22"/>
-        </w:rPr>
-        <w:t xml:space="preserve">Empfänger: </w:t>
-      </w:r>
-      <w:r>
-        <w:rPr>
-          <w:rFonts w:ascii="Arial" w:cs="Arial" w:eastAsia="Arial" w:hAnsi="Arial"/>
-          <w:sz w:val="22"/>
-          <w:szCs w:val="22"/>
-        </w:rPr>
-        <w:t xml:space="preserve">Yogi (an die noch existierende E-Mail-Adresse, letzte Nachricht)</w:t>
-      </w:r>
-    </w:p>
-    <w:p>
-      <w:pPr>
-        <w:spacing w:after="80"/>
-      </w:pPr>
-      <w:r>
-        <w:rPr>
-          <w:rFonts w:ascii="Arial" w:cs="Arial" w:eastAsia="Arial" w:hAnsi="Arial"/>
-          <w:b/>
-          <w:bCs/>
-          <w:sz w:val="22"/>
-          <w:szCs w:val="22"/>
-        </w:rPr>
-        <w:t xml:space="preserve">Kernaussage: </w:t>
-      </w:r>
+          <w:color w:val="555555"/>
+          <w:sz w:val="22"/>
+          <w:szCs w:val="22"/>
+        </w:rPr>
+        <w:t xml:space="preserve">„Dein Krankheits-Guthaben läuft in [Frist] ab (gültig bis [Datum]) und wird danach gelöscht."</w:t>
+      </w:r>
+    </w:p>
+    <w:p>
+      <w:pPr>
+        <w:spacing w:after="60"/>
+        <w:ind w:left="288"/>
+      </w:pPr>
       <w:r>
         <w:rPr>
           <w:rFonts w:ascii="Arial" w:cs="Arial" w:eastAsia="Arial" w:hAnsi="Arial"/>
           <w:i/>
           <w:iCs/>
-          <w:sz w:val="22"/>
-          <w:szCs w:val="22"/>
-        </w:rPr>
-        <w:t xml:space="preserve">„Hallo [Vorname], dein Account bei Yoga mit Sarah wurde gelöscht. Alle deine persönlichen Daten wurden entfernt bzw. anonymisiert, offene Buchungen storniert und etwaige Credits/Guthaben sind verfallen. Mit dieser E-Mail wird auch deine E-Mail-Adresse aus unserem System entfernt — du erhältst keine weiteren Nachrichten mehr. Solltest du irgendwann zurückkommen wollen, freue ich mich auf eine neue Registrierung. Alles Liebe, Sarah."</w:t>
+          <w:color w:val="555555"/>
+          <w:sz w:val="22"/>
+          <w:szCs w:val="22"/>
+        </w:rPr>
+        <w:t xml:space="preserve">„Dein Krankheits-Guthaben verfällt heute und wird gelöscht."</w:t>
       </w:r>
     </w:p>
     <w:p>
@@ -33392,79 +33370,6 @@
           <w:sz w:val="22"/>
           <w:szCs w:val="22"/>
         </w:rPr>
-        <w:t xml:space="preserve">Betreff: </w:t>
-      </w:r>
-      <w:r>
-        <w:rPr>
-          <w:rFonts w:ascii="Arial" w:cs="Arial" w:eastAsia="Arial" w:hAnsi="Arial"/>
-          <w:i/>
-          <w:iCs/>
-          <w:sz w:val="22"/>
-          <w:szCs w:val="22"/>
-        </w:rPr>
-        <w:t xml:space="preserve">„DSGVO: Account gelöscht – PDF bitte manuell löschen"</w:t>
-      </w:r>
-    </w:p>
-    <w:p>
-      <w:pPr>
-        <w:spacing w:after="80"/>
-      </w:pPr>
-      <w:r>
-        <w:rPr>
-          <w:rFonts w:ascii="Arial" w:cs="Arial" w:eastAsia="Arial" w:hAnsi="Arial"/>
-          <w:b/>
-          <w:bCs/>
-          <w:sz w:val="22"/>
-          <w:szCs w:val="22"/>
-        </w:rPr>
-        <w:t xml:space="preserve">Empfänger: </w:t>
-      </w:r>
-      <w:r>
-        <w:rPr>
-          <w:rFonts w:ascii="Arial" w:cs="Arial" w:eastAsia="Arial" w:hAnsi="Arial"/>
-          <w:sz w:val="22"/>
-          <w:szCs w:val="22"/>
-        </w:rPr>
-        <w:t xml:space="preserve">Admin (parallel zur Yogi-Mail)</w:t>
-      </w:r>
-    </w:p>
-    <w:p>
-      <w:pPr>
-        <w:spacing w:after="80"/>
-      </w:pPr>
-      <w:r>
-        <w:rPr>
-          <w:rFonts w:ascii="Arial" w:cs="Arial" w:eastAsia="Arial" w:hAnsi="Arial"/>
-          <w:b/>
-          <w:bCs/>
-          <w:sz w:val="22"/>
-          <w:szCs w:val="22"/>
-        </w:rPr>
-        <w:t xml:space="preserve">Kernaussage: </w:t>
-      </w:r>
-      <w:r>
-        <w:rPr>
-          <w:rFonts w:ascii="Arial" w:cs="Arial" w:eastAsia="Arial" w:hAnsi="Arial"/>
-          <w:i/>
-          <w:iCs/>
-          <w:sz w:val="22"/>
-          <w:szCs w:val="22"/>
-        </w:rPr>
-        <w:t xml:space="preserve">„Hallo Sarah, folgender Account wurde DSGVO-konform gelöscht: [Name], [E-Mail]. Bitte lösche die AGB-PDF im Google Drive manuell."</w:t>
-      </w:r>
-    </w:p>
-    <w:p>
-      <w:pPr>
-        <w:spacing w:after="80"/>
-      </w:pPr>
-      <w:r>
-        <w:rPr>
-          <w:rFonts w:ascii="Arial" w:cs="Arial" w:eastAsia="Arial" w:hAnsi="Arial"/>
-          <w:b/>
-          <w:bCs/>
-          <w:sz w:val="22"/>
-          <w:szCs w:val="22"/>
-        </w:rPr>
         <w:t xml:space="preserve">Sonderfälle &amp; Ausnahmen: </w:t>
       </w:r>
       <w:r>
@@ -33491,7 +33396,25 @@
           <w:sz w:val="22"/>
           <w:szCs w:val="22"/>
         </w:rPr>
-        <w:t xml:space="preserve">Verifiziert durch tests/e2e/14a-account-loeschung-source.spec.ts: Source-Smoke-Tests prüfen Vorhandensein von Email.accountDeletedYogi in beiden Lösch-Pfaden und das Fehlen direkter send-email-Fetches.</w:t>
+        <w:t xml:space="preserve">Bewusste Trennung: Kursabbruch-Guthaben = bezahlte, nicht erbrachte Leistung → Auszahlung. Krankheits-Guthaben = Kulanz → ersatzlose Löschung.</w:t>
+      </w:r>
+    </w:p>
+    <w:p>
+      <w:pPr>
+        <w:pStyle w:val="ListParagraph"/>
+        <w:numPr>
+          <w:ilvl w:val="0"/>
+          <w:numId w:val="1"/>
+        </w:numPr>
+        <w:spacing w:after="40"/>
+      </w:pPr>
+      <w:r>
+        <w:rPr>
+          <w:rFonts w:ascii="Arial" w:cs="Arial" w:eastAsia="Arial" w:hAnsi="Arial"/>
+          <w:sz w:val="22"/>
+          <w:szCs w:val="22"/>
+        </w:rPr>
+        <w:t xml:space="preserve">Beide Ablaufpfade sind in tests/e2e/55-fristen-audit.spec.ts E2E-abgesichert.</w:t>
       </w:r>
     </w:p>
     <w:p>
@@ -33549,131 +33472,6 @@
       </w:r>
     </w:p>
     <w:p>
-      <w:r>
-        <w:br w:type="page"/>
-      </w:r>
-    </w:p>
-    <w:p>
-      <w:pPr>
-        <w:pStyle w:val="Heading1"/>
-        <w:spacing w:after="160" w:before="360"/>
-      </w:pPr>
-      <w:r>
-        <w:rPr>
-          <w:rFonts w:ascii="Arial" w:cs="Arial" w:eastAsia="Arial" w:hAnsi="Arial"/>
-          <w:b/>
-          <w:bCs/>
-          <w:color w:val="3d3a39"/>
-          <w:sz w:val="32"/>
-          <w:szCs w:val="32"/>
-        </w:rPr>
-        <w:t xml:space="preserve">Welle I: Audit-Fixes (29.05.2026)</w:t>
-      </w:r>
-    </w:p>
-    <w:p>
-      <w:pPr>
-        <w:spacing w:after="80"/>
-      </w:pPr>
-      <w:r>
-        <w:rPr>
-          <w:rFonts w:ascii="Arial" w:cs="Arial" w:eastAsia="Arial" w:hAnsi="Arial"/>
-          <w:sz w:val="22"/>
-          <w:szCs w:val="22"/>
-        </w:rPr>
-        <w:t xml:space="preserve">Welle I bündelt fünf abgestimmte Klarstellungen und Härtungen, die bei einem Code-Audit aufgefallen sind. Fall 1 war nur eine Bestätigung (kein Code), Fall 2–5 sind echte Korrekturen.</w:t>
-      </w:r>
-    </w:p>
-    <w:p>
-      <w:pPr>
-        <w:pStyle w:val="ListParagraph"/>
-        <w:numPr>
-          <w:ilvl w:val="0"/>
-          <w:numId w:val="1"/>
-        </w:numPr>
-        <w:spacing w:after="40"/>
-      </w:pPr>
-      <w:r>
-        <w:rPr>
-          <w:rFonts w:ascii="Arial" w:cs="Arial" w:eastAsia="Arial" w:hAnsi="Arial"/>
-          <w:sz w:val="22"/>
-          <w:szCs w:val="22"/>
-        </w:rPr>
-        <w:t xml:space="preserve">Fall 1: Guthaben-Fristen bestätigt — Krankheits-Guthaben 10 Monate, Kursabbruch-Guthaben 2 Jahre mit Auszahl-Erinnerung (kein Code geändert).</w:t>
-      </w:r>
-    </w:p>
-    <w:p>
-      <w:pPr>
-        <w:pStyle w:val="ListParagraph"/>
-        <w:numPr>
-          <w:ilvl w:val="0"/>
-          <w:numId w:val="1"/>
-        </w:numPr>
-        <w:spacing w:after="40"/>
-      </w:pPr>
-      <w:r>
-        <w:rPr>
-          <w:rFonts w:ascii="Arial" w:cs="Arial" w:eastAsia="Arial" w:hAnsi="Arial"/>
-          <w:sz w:val="22"/>
-          <w:szCs w:val="22"/>
-        </w:rPr>
-        <w:t xml:space="preserve">Fall 2: Kursabbruch löscht versehentlich KEIN Guthaben mehr.</w:t>
-      </w:r>
-    </w:p>
-    <w:p>
-      <w:pPr>
-        <w:pStyle w:val="ListParagraph"/>
-        <w:numPr>
-          <w:ilvl w:val="0"/>
-          <w:numId w:val="1"/>
-        </w:numPr>
-        <w:spacing w:after="40"/>
-      </w:pPr>
-      <w:r>
-        <w:rPr>
-          <w:rFonts w:ascii="Arial" w:cs="Arial" w:eastAsia="Arial" w:hAnsi="Arial"/>
-          <w:sz w:val="22"/>
-          <w:szCs w:val="22"/>
-        </w:rPr>
-        <w:t xml:space="preserve">Fall 3: Warteliste-Vorgänge werden jetzt lückenlos im Protokoll mitgeschrieben.</w:t>
-      </w:r>
-    </w:p>
-    <w:p>
-      <w:pPr>
-        <w:pStyle w:val="ListParagraph"/>
-        <w:numPr>
-          <w:ilvl w:val="0"/>
-          <w:numId w:val="1"/>
-        </w:numPr>
-        <w:spacing w:after="40"/>
-      </w:pPr>
-      <w:r>
-        <w:rPr>
-          <w:rFonts w:ascii="Arial" w:cs="Arial" w:eastAsia="Arial" w:hAnsi="Arial"/>
-          <w:sz w:val="22"/>
-          <w:szCs w:val="22"/>
-        </w:rPr>
-        <w:t xml:space="preserve">Fall 4: Account-Selbstlöschung räumt alle Daten explizit + meldet Auth-Fehler ehrlich.</w:t>
-      </w:r>
-    </w:p>
-    <w:p>
-      <w:pPr>
-        <w:pStyle w:val="ListParagraph"/>
-        <w:numPr>
-          <w:ilvl w:val="0"/>
-          <w:numId w:val="1"/>
-        </w:numPr>
-        <w:spacing w:after="40"/>
-      </w:pPr>
-      <w:r>
-        <w:rPr>
-          <w:rFonts w:ascii="Arial" w:cs="Arial" w:eastAsia="Arial" w:hAnsi="Arial"/>
-          <w:sz w:val="22"/>
-          <w:szCs w:val="22"/>
-        </w:rPr>
-        <w:t xml:space="preserve">Fall 5: Absage-Fristen rechnen jetzt verlässlich in deutscher Zeit (Europe/Berlin).</w:t>
-      </w:r>
-    </w:p>
-    <w:p>
       <w:pPr>
         <w:pStyle w:val="Heading2"/>
         <w:spacing w:after="100" w:before="240"/>
@@ -33687,7 +33485,7 @@
           <w:sz w:val="26"/>
           <w:szCs w:val="26"/>
         </w:rPr>
-        <w:t xml:space="preserve">Fall 1: Guthaben-Fristen bestätigt (Krankheit 10 Monate / Kursabbruch 2 Jahre)</w:t>
+        <w:t xml:space="preserve">Account-Lösch-Bestätigungs-E-Mail an Yogi (DSGVO Art. 12)</w:t>
       </w:r>
     </w:p>
     <w:tbl>
@@ -33736,7 +33534,7 @@
                 <w:sz w:val="22"/>
                 <w:szCs w:val="22"/>
               </w:rPr>
-              <w:t xml:space="preserve">Bestätigung der zwei unterschiedlichen Guthaben-Fristen. Krankheits-Guthaben (source=„illness") ist 10 Monate ab Attest gültig; Kursabbruch-Guthaben (source=„cancellation_choice") ist 2 Jahre gültig und löst nach Ablauf eine Auszahl-Erinnerung an Sarah aus. Hier war nichts falsch — nur dokumentarisch verankert.</w:t>
+              <w:t xml:space="preserve">Wenn ein Yogi seinen Account selbst löscht oder durch Sarah gelöscht wird, erhält der Yogi VOR dem finalen Auth-Delete eine Bestätigungs-Mail an seine bisherige E-Mail-Adresse. Diese E-Mail ist die letzte Nachricht der App an den Yogi.</w:t>
             </w:r>
           </w:p>
         </w:tc>
@@ -33771,7 +33569,7 @@
                 <w:sz w:val="22"/>
                 <w:szCs w:val="22"/>
               </w:rPr>
-              <w:t xml:space="preserve">System / Dokumentation</w:t>
+              <w:t xml:space="preserve">System (lib/email.ts → Email.accountDeletedYogi)</w:t>
             </w:r>
           </w:p>
         </w:tc>
@@ -33815,43 +33613,97 @@
           <w:sz w:val="22"/>
           <w:szCs w:val="22"/>
         </w:rPr>
-        <w:t xml:space="preserve">Krankheits-Guthaben: gültig bis Attest-Datum + 10 Monate (Welle G).</w:t>
-      </w:r>
-    </w:p>
-    <w:p>
-      <w:pPr>
-        <w:pStyle w:val="ListParagraph"/>
-        <w:numPr>
-          <w:ilvl w:val="0"/>
-          <w:numId w:val="1"/>
-        </w:numPr>
-        <w:spacing w:after="40"/>
-      </w:pPr>
-      <w:r>
-        <w:rPr>
-          <w:rFonts w:ascii="Arial" w:cs="Arial" w:eastAsia="Arial" w:hAnsi="Arial"/>
-          <w:sz w:val="22"/>
-          <w:szCs w:val="22"/>
-        </w:rPr>
-        <w:t xml:space="preserve">Kursabbruch-Guthaben: gültig 2 Jahre ab Vergabe (Welle H).</w:t>
-      </w:r>
-    </w:p>
-    <w:p>
-      <w:pPr>
-        <w:pStyle w:val="ListParagraph"/>
-        <w:numPr>
-          <w:ilvl w:val="0"/>
-          <w:numId w:val="1"/>
-        </w:numPr>
-        <w:spacing w:after="40"/>
-      </w:pPr>
-      <w:r>
-        <w:rPr>
-          <w:rFonts w:ascii="Arial" w:cs="Arial" w:eastAsia="Arial" w:hAnsi="Arial"/>
-          <w:sz w:val="22"/>
-          <w:szCs w:val="22"/>
-        </w:rPr>
-        <w:t xml:space="preserve">Nach Ablauf des 2-Jahre-Guthabens läuft täglich um 04:00 Uhr der Cron fn_check_guthaben_2y_expiry → Dashboard-Notification + E-Mail „admin_guthaben_2y_expiry" an Sarah mit der Bitte, den Betrag manuell zu erstatten.</w:t>
+        <w:t xml:space="preserve">Yogi (oder Sarah als Admin) löst die Löschung aus.</w:t>
+      </w:r>
+    </w:p>
+    <w:p>
+      <w:pPr>
+        <w:pStyle w:val="ListParagraph"/>
+        <w:numPr>
+          <w:ilvl w:val="0"/>
+          <w:numId w:val="1"/>
+        </w:numPr>
+        <w:spacing w:after="40"/>
+      </w:pPr>
+      <w:r>
+        <w:rPr>
+          <w:rFonts w:ascii="Arial" w:cs="Arial" w:eastAsia="Arial" w:hAnsi="Arial"/>
+          <w:sz w:val="22"/>
+          <w:szCs w:val="22"/>
+        </w:rPr>
+        <w:t xml:space="preserve">Cascade läuft: Buchungen storniert, Wartelisten entfernt, Plätze freigegeben, PII anonymisiert, Credits/Guthaben verfallen.</w:t>
+      </w:r>
+    </w:p>
+    <w:p>
+      <w:pPr>
+        <w:pStyle w:val="ListParagraph"/>
+        <w:numPr>
+          <w:ilvl w:val="0"/>
+          <w:numId w:val="1"/>
+        </w:numPr>
+        <w:spacing w:after="40"/>
+      </w:pPr>
+      <w:r>
+        <w:rPr>
+          <w:rFonts w:ascii="Arial" w:cs="Arial" w:eastAsia="Arial" w:hAnsi="Arial"/>
+          <w:sz w:val="22"/>
+          <w:szCs w:val="22"/>
+        </w:rPr>
+        <w:t xml:space="preserve">BEVOR der Auth-User in Supabase Auth gelöscht wird: System ruft Email.accountDeletedYogi({email, firstName}) auf.</w:t>
+      </w:r>
+    </w:p>
+    <w:p>
+      <w:pPr>
+        <w:pStyle w:val="ListParagraph"/>
+        <w:numPr>
+          <w:ilvl w:val="0"/>
+          <w:numId w:val="1"/>
+        </w:numPr>
+        <w:spacing w:after="40"/>
+      </w:pPr>
+      <w:r>
+        <w:rPr>
+          <w:rFonts w:ascii="Arial" w:cs="Arial" w:eastAsia="Arial" w:hAnsi="Arial"/>
+          <w:sz w:val="22"/>
+          <w:szCs w:val="22"/>
+        </w:rPr>
+        <w:t xml:space="preserve">Yogi bekommt eine E-Mail mit Betreff „Dein Account bei Yoga mit Sarah wurde gelöscht".</w:t>
+      </w:r>
+    </w:p>
+    <w:p>
+      <w:pPr>
+        <w:pStyle w:val="ListParagraph"/>
+        <w:numPr>
+          <w:ilvl w:val="0"/>
+          <w:numId w:val="1"/>
+        </w:numPr>
+        <w:spacing w:after="40"/>
+      </w:pPr>
+      <w:r>
+        <w:rPr>
+          <w:rFonts w:ascii="Arial" w:cs="Arial" w:eastAsia="Arial" w:hAnsi="Arial"/>
+          <w:sz w:val="22"/>
+          <w:szCs w:val="22"/>
+        </w:rPr>
+        <w:t xml:space="preserve">Erst danach wird der Supabase-Auth-User entfernt und die E-Mail-Adresse aus der Datenbank gelöscht.</w:t>
+      </w:r>
+    </w:p>
+    <w:p>
+      <w:pPr>
+        <w:pStyle w:val="ListParagraph"/>
+        <w:numPr>
+          <w:ilvl w:val="0"/>
+          <w:numId w:val="1"/>
+        </w:numPr>
+        <w:spacing w:after="40"/>
+      </w:pPr>
+      <w:r>
+        <w:rPr>
+          <w:rFonts w:ascii="Arial" w:cs="Arial" w:eastAsia="Arial" w:hAnsi="Arial"/>
+          <w:sz w:val="22"/>
+          <w:szCs w:val="22"/>
+        </w:rPr>
+        <w:t xml:space="preserve">Parallel geht admin_dsgvo_deletion-Mail an Sarah (Hinweis auf manuelle PDF-Löschung).</w:t>
       </w:r>
     </w:p>
     <w:p>
@@ -33892,7 +33744,253 @@
           <w:sz w:val="22"/>
           <w:szCs w:val="22"/>
         </w:rPr>
-        <w:t xml:space="preserve">Beide Guthaben-Arten sind NUR mit einem neuen Kurs verrechenbar, nicht für Einzelstunden und nicht als Geld-Auszahlung (außer der manuellen 2-Jahre-Erstattung durch Sarah).</w:t>
+        <w:t xml:space="preserve">Rechtsgrundlage: DSGVO Art. 12 (Transparenz) — der Yogi muss über die Verarbeitung (hier: die Löschung) informiert werden.</w:t>
+      </w:r>
+    </w:p>
+    <w:p>
+      <w:pPr>
+        <w:pStyle w:val="ListParagraph"/>
+        <w:numPr>
+          <w:ilvl w:val="0"/>
+          <w:numId w:val="1"/>
+        </w:numPr>
+        <w:spacing w:after="40"/>
+      </w:pPr>
+      <w:r>
+        <w:rPr>
+          <w:rFonts w:ascii="Arial" w:cs="Arial" w:eastAsia="Arial" w:hAnsi="Arial"/>
+          <w:sz w:val="22"/>
+          <w:szCs w:val="22"/>
+        </w:rPr>
+        <w:t xml:space="preserve">E-Mail wird auch versandt, wenn Admin (Sarah) den Account löscht — nicht nur bei Selbstlöschung.</w:t>
+      </w:r>
+    </w:p>
+    <w:p>
+      <w:pPr>
+        <w:pStyle w:val="ListParagraph"/>
+        <w:numPr>
+          <w:ilvl w:val="0"/>
+          <w:numId w:val="1"/>
+        </w:numPr>
+        <w:spacing w:after="40"/>
+      </w:pPr>
+      <w:r>
+        <w:rPr>
+          <w:rFonts w:ascii="Arial" w:cs="Arial" w:eastAsia="Arial" w:hAnsi="Arial"/>
+          <w:sz w:val="22"/>
+          <w:szCs w:val="22"/>
+        </w:rPr>
+        <w:t xml:space="preserve">Direkter fetch zur Edge-Function send-email wurde aus app/profil/page.tsx und app/admin/yogis/[id]/page.tsx entfernt (fehlte x-function-secret → 401); jetzt ausschließlich über zentralen Email-Helper.</w:t>
+      </w:r>
+    </w:p>
+    <w:p>
+      <w:pPr>
+        <w:spacing w:after="80"/>
+      </w:pPr>
+      <w:r>
+        <w:rPr>
+          <w:rFonts w:ascii="Arial" w:cs="Arial" w:eastAsia="Arial" w:hAnsi="Arial"/>
+          <w:b/>
+          <w:bCs/>
+          <w:sz w:val="22"/>
+          <w:szCs w:val="22"/>
+        </w:rPr>
+        <w:t xml:space="preserve">E-Mails: </w:t>
+      </w:r>
+      <w:r>
+        <w:rPr>
+          <w:rFonts w:ascii="Arial" w:cs="Arial" w:eastAsia="Arial" w:hAnsi="Arial"/>
+          <w:sz w:val="22"/>
+          <w:szCs w:val="22"/>
+        </w:rPr>
+        <w:t xml:space="preserve"/>
+      </w:r>
+    </w:p>
+    <w:p>
+      <w:pPr>
+        <w:spacing w:after="80"/>
+      </w:pPr>
+      <w:r>
+        <w:rPr>
+          <w:rFonts w:ascii="Arial" w:cs="Arial" w:eastAsia="Arial" w:hAnsi="Arial"/>
+          <w:b/>
+          <w:bCs/>
+          <w:sz w:val="22"/>
+          <w:szCs w:val="22"/>
+        </w:rPr>
+        <w:t xml:space="preserve">Betreff: </w:t>
+      </w:r>
+      <w:r>
+        <w:rPr>
+          <w:rFonts w:ascii="Arial" w:cs="Arial" w:eastAsia="Arial" w:hAnsi="Arial"/>
+          <w:i/>
+          <w:iCs/>
+          <w:sz w:val="22"/>
+          <w:szCs w:val="22"/>
+        </w:rPr>
+        <w:t xml:space="preserve">„Dein Account bei Yoga mit Sarah wurde gelöscht"</w:t>
+      </w:r>
+    </w:p>
+    <w:p>
+      <w:pPr>
+        <w:spacing w:after="80"/>
+      </w:pPr>
+      <w:r>
+        <w:rPr>
+          <w:rFonts w:ascii="Arial" w:cs="Arial" w:eastAsia="Arial" w:hAnsi="Arial"/>
+          <w:b/>
+          <w:bCs/>
+          <w:sz w:val="22"/>
+          <w:szCs w:val="22"/>
+        </w:rPr>
+        <w:t xml:space="preserve">Empfänger: </w:t>
+      </w:r>
+      <w:r>
+        <w:rPr>
+          <w:rFonts w:ascii="Arial" w:cs="Arial" w:eastAsia="Arial" w:hAnsi="Arial"/>
+          <w:sz w:val="22"/>
+          <w:szCs w:val="22"/>
+        </w:rPr>
+        <w:t xml:space="preserve">Yogi (an die noch existierende E-Mail-Adresse, letzte Nachricht)</w:t>
+      </w:r>
+    </w:p>
+    <w:p>
+      <w:pPr>
+        <w:spacing w:after="80"/>
+      </w:pPr>
+      <w:r>
+        <w:rPr>
+          <w:rFonts w:ascii="Arial" w:cs="Arial" w:eastAsia="Arial" w:hAnsi="Arial"/>
+          <w:b/>
+          <w:bCs/>
+          <w:sz w:val="22"/>
+          <w:szCs w:val="22"/>
+        </w:rPr>
+        <w:t xml:space="preserve">Kernaussage: </w:t>
+      </w:r>
+      <w:r>
+        <w:rPr>
+          <w:rFonts w:ascii="Arial" w:cs="Arial" w:eastAsia="Arial" w:hAnsi="Arial"/>
+          <w:i/>
+          <w:iCs/>
+          <w:sz w:val="22"/>
+          <w:szCs w:val="22"/>
+        </w:rPr>
+        <w:t xml:space="preserve">„Hallo [Vorname], dein Account bei Yoga mit Sarah wurde gelöscht. Alle deine persönlichen Daten wurden entfernt bzw. anonymisiert, offene Buchungen storniert und etwaige Credits/Guthaben sind verfallen. Mit dieser E-Mail wird auch deine E-Mail-Adresse aus unserem System entfernt — du erhältst keine weiteren Nachrichten mehr. Solltest du irgendwann zurückkommen wollen, freue ich mich auf eine neue Registrierung. Alles Liebe, Sarah."</w:t>
+      </w:r>
+    </w:p>
+    <w:p>
+      <w:pPr>
+        <w:spacing w:after="80"/>
+      </w:pPr>
+      <w:r>
+        <w:rPr>
+          <w:rFonts w:ascii="Arial" w:cs="Arial" w:eastAsia="Arial" w:hAnsi="Arial"/>
+          <w:b/>
+          <w:bCs/>
+          <w:sz w:val="22"/>
+          <w:szCs w:val="22"/>
+        </w:rPr>
+        <w:t xml:space="preserve">Betreff: </w:t>
+      </w:r>
+      <w:r>
+        <w:rPr>
+          <w:rFonts w:ascii="Arial" w:cs="Arial" w:eastAsia="Arial" w:hAnsi="Arial"/>
+          <w:i/>
+          <w:iCs/>
+          <w:sz w:val="22"/>
+          <w:szCs w:val="22"/>
+        </w:rPr>
+        <w:t xml:space="preserve">„DSGVO: Account gelöscht – PDF bitte manuell löschen"</w:t>
+      </w:r>
+    </w:p>
+    <w:p>
+      <w:pPr>
+        <w:spacing w:after="80"/>
+      </w:pPr>
+      <w:r>
+        <w:rPr>
+          <w:rFonts w:ascii="Arial" w:cs="Arial" w:eastAsia="Arial" w:hAnsi="Arial"/>
+          <w:b/>
+          <w:bCs/>
+          <w:sz w:val="22"/>
+          <w:szCs w:val="22"/>
+        </w:rPr>
+        <w:t xml:space="preserve">Empfänger: </w:t>
+      </w:r>
+      <w:r>
+        <w:rPr>
+          <w:rFonts w:ascii="Arial" w:cs="Arial" w:eastAsia="Arial" w:hAnsi="Arial"/>
+          <w:sz w:val="22"/>
+          <w:szCs w:val="22"/>
+        </w:rPr>
+        <w:t xml:space="preserve">Admin (parallel zur Yogi-Mail)</w:t>
+      </w:r>
+    </w:p>
+    <w:p>
+      <w:pPr>
+        <w:spacing w:after="80"/>
+      </w:pPr>
+      <w:r>
+        <w:rPr>
+          <w:rFonts w:ascii="Arial" w:cs="Arial" w:eastAsia="Arial" w:hAnsi="Arial"/>
+          <w:b/>
+          <w:bCs/>
+          <w:sz w:val="22"/>
+          <w:szCs w:val="22"/>
+        </w:rPr>
+        <w:t xml:space="preserve">Kernaussage: </w:t>
+      </w:r>
+      <w:r>
+        <w:rPr>
+          <w:rFonts w:ascii="Arial" w:cs="Arial" w:eastAsia="Arial" w:hAnsi="Arial"/>
+          <w:i/>
+          <w:iCs/>
+          <w:sz w:val="22"/>
+          <w:szCs w:val="22"/>
+        </w:rPr>
+        <w:t xml:space="preserve">„Hallo Sarah, folgender Account wurde DSGVO-konform gelöscht: [Name], [E-Mail]. Bitte lösche die AGB-PDF im Google Drive manuell."</w:t>
+      </w:r>
+    </w:p>
+    <w:p>
+      <w:pPr>
+        <w:spacing w:after="80"/>
+      </w:pPr>
+      <w:r>
+        <w:rPr>
+          <w:rFonts w:ascii="Arial" w:cs="Arial" w:eastAsia="Arial" w:hAnsi="Arial"/>
+          <w:b/>
+          <w:bCs/>
+          <w:sz w:val="22"/>
+          <w:szCs w:val="22"/>
+        </w:rPr>
+        <w:t xml:space="preserve">Sonderfälle &amp; Ausnahmen: </w:t>
+      </w:r>
+      <w:r>
+        <w:rPr>
+          <w:rFonts w:ascii="Arial" w:cs="Arial" w:eastAsia="Arial" w:hAnsi="Arial"/>
+          <w:sz w:val="22"/>
+          <w:szCs w:val="22"/>
+        </w:rPr>
+        <w:t xml:space="preserve"/>
+      </w:r>
+    </w:p>
+    <w:p>
+      <w:pPr>
+        <w:pStyle w:val="ListParagraph"/>
+        <w:numPr>
+          <w:ilvl w:val="0"/>
+          <w:numId w:val="1"/>
+        </w:numPr>
+        <w:spacing w:after="40"/>
+      </w:pPr>
+      <w:r>
+        <w:rPr>
+          <w:rFonts w:ascii="Arial" w:cs="Arial" w:eastAsia="Arial" w:hAnsi="Arial"/>
+          <w:sz w:val="22"/>
+          <w:szCs w:val="22"/>
+        </w:rPr>
+        <w:t xml:space="preserve">Verifiziert durch tests/e2e/14a-account-loeschung-source.spec.ts: Source-Smoke-Tests prüfen Vorhandensein von Email.accountDeletedYogi in beiden Lösch-Pfaden und das Fehlen direkter send-email-Fetches.</w:t>
       </w:r>
     </w:p>
     <w:p>
@@ -33950,6 +34048,131 @@
       </w:r>
     </w:p>
     <w:p>
+      <w:r>
+        <w:br w:type="page"/>
+      </w:r>
+    </w:p>
+    <w:p>
+      <w:pPr>
+        <w:pStyle w:val="Heading1"/>
+        <w:spacing w:after="160" w:before="360"/>
+      </w:pPr>
+      <w:r>
+        <w:rPr>
+          <w:rFonts w:ascii="Arial" w:cs="Arial" w:eastAsia="Arial" w:hAnsi="Arial"/>
+          <w:b/>
+          <w:bCs/>
+          <w:color w:val="3d3a39"/>
+          <w:sz w:val="32"/>
+          <w:szCs w:val="32"/>
+        </w:rPr>
+        <w:t xml:space="preserve">Welle I: Audit-Fixes (29.05.2026)</w:t>
+      </w:r>
+    </w:p>
+    <w:p>
+      <w:pPr>
+        <w:spacing w:after="80"/>
+      </w:pPr>
+      <w:r>
+        <w:rPr>
+          <w:rFonts w:ascii="Arial" w:cs="Arial" w:eastAsia="Arial" w:hAnsi="Arial"/>
+          <w:sz w:val="22"/>
+          <w:szCs w:val="22"/>
+        </w:rPr>
+        <w:t xml:space="preserve">Welle I bündelt fünf abgestimmte Klarstellungen und Härtungen, die bei einem Code-Audit aufgefallen sind. Fall 1 war nur eine Bestätigung (kein Code), Fall 2–5 sind echte Korrekturen.</w:t>
+      </w:r>
+    </w:p>
+    <w:p>
+      <w:pPr>
+        <w:pStyle w:val="ListParagraph"/>
+        <w:numPr>
+          <w:ilvl w:val="0"/>
+          <w:numId w:val="1"/>
+        </w:numPr>
+        <w:spacing w:after="40"/>
+      </w:pPr>
+      <w:r>
+        <w:rPr>
+          <w:rFonts w:ascii="Arial" w:cs="Arial" w:eastAsia="Arial" w:hAnsi="Arial"/>
+          <w:sz w:val="22"/>
+          <w:szCs w:val="22"/>
+        </w:rPr>
+        <w:t xml:space="preserve">Fall 1: Guthaben-Fristen bestätigt — Krankheits-Guthaben 10 Monate, Kursabbruch-Guthaben 2 Jahre mit Auszahl-Erinnerung (kein Code geändert).</w:t>
+      </w:r>
+    </w:p>
+    <w:p>
+      <w:pPr>
+        <w:pStyle w:val="ListParagraph"/>
+        <w:numPr>
+          <w:ilvl w:val="0"/>
+          <w:numId w:val="1"/>
+        </w:numPr>
+        <w:spacing w:after="40"/>
+      </w:pPr>
+      <w:r>
+        <w:rPr>
+          <w:rFonts w:ascii="Arial" w:cs="Arial" w:eastAsia="Arial" w:hAnsi="Arial"/>
+          <w:sz w:val="22"/>
+          <w:szCs w:val="22"/>
+        </w:rPr>
+        <w:t xml:space="preserve">Fall 2: Kursabbruch löscht versehentlich KEIN Guthaben mehr.</w:t>
+      </w:r>
+    </w:p>
+    <w:p>
+      <w:pPr>
+        <w:pStyle w:val="ListParagraph"/>
+        <w:numPr>
+          <w:ilvl w:val="0"/>
+          <w:numId w:val="1"/>
+        </w:numPr>
+        <w:spacing w:after="40"/>
+      </w:pPr>
+      <w:r>
+        <w:rPr>
+          <w:rFonts w:ascii="Arial" w:cs="Arial" w:eastAsia="Arial" w:hAnsi="Arial"/>
+          <w:sz w:val="22"/>
+          <w:szCs w:val="22"/>
+        </w:rPr>
+        <w:t xml:space="preserve">Fall 3: Warteliste-Vorgänge werden jetzt lückenlos im Protokoll mitgeschrieben.</w:t>
+      </w:r>
+    </w:p>
+    <w:p>
+      <w:pPr>
+        <w:pStyle w:val="ListParagraph"/>
+        <w:numPr>
+          <w:ilvl w:val="0"/>
+          <w:numId w:val="1"/>
+        </w:numPr>
+        <w:spacing w:after="40"/>
+      </w:pPr>
+      <w:r>
+        <w:rPr>
+          <w:rFonts w:ascii="Arial" w:cs="Arial" w:eastAsia="Arial" w:hAnsi="Arial"/>
+          <w:sz w:val="22"/>
+          <w:szCs w:val="22"/>
+        </w:rPr>
+        <w:t xml:space="preserve">Fall 4: Account-Selbstlöschung räumt alle Daten explizit + meldet Auth-Fehler ehrlich.</w:t>
+      </w:r>
+    </w:p>
+    <w:p>
+      <w:pPr>
+        <w:pStyle w:val="ListParagraph"/>
+        <w:numPr>
+          <w:ilvl w:val="0"/>
+          <w:numId w:val="1"/>
+        </w:numPr>
+        <w:spacing w:after="40"/>
+      </w:pPr>
+      <w:r>
+        <w:rPr>
+          <w:rFonts w:ascii="Arial" w:cs="Arial" w:eastAsia="Arial" w:hAnsi="Arial"/>
+          <w:sz w:val="22"/>
+          <w:szCs w:val="22"/>
+        </w:rPr>
+        <w:t xml:space="preserve">Fall 5: Absage-Fristen rechnen jetzt verlässlich in deutscher Zeit (Europe/Berlin).</w:t>
+      </w:r>
+    </w:p>
+    <w:p>
       <w:pPr>
         <w:pStyle w:val="Heading2"/>
         <w:spacing w:after="100" w:before="240"/>
@@ -33963,7 +34186,7 @@
           <w:sz w:val="26"/>
           <w:szCs w:val="26"/>
         </w:rPr>
-        <w:t xml:space="preserve">Fall 2: Kursabbruch schützt Guthaben vor versehentlicher Löschung</w:t>
+        <w:t xml:space="preserve">Fall 1: Guthaben-Fristen bestätigt (Krankheit 10 Monate / Kursabbruch 2 Jahre)</w:t>
       </w:r>
     </w:p>
     <w:tbl>
@@ -34012,7 +34235,7 @@
                 <w:sz w:val="22"/>
                 <w:szCs w:val="22"/>
               </w:rPr>
-              <w:t xml:space="preserve">Beim kompletten Abbrechen eines Kurses (Admin) wurde bisher beim Aufräumen der Credits zu viel gelöscht — auch bereits vergebenes Guthaben hätte verschwinden können. Jetzt gilt dasselbe Schutzmuster wie beim Kurs-Löschen: Guthaben wird vom Kurs entkoppelt statt gelöscht.</w:t>
+              <w:t xml:space="preserve">Bestätigung der zwei unterschiedlichen Guthaben-Fristen. Krankheits-Guthaben (source=„illness") ist 10 Monate ab Attest gültig; Kursabbruch-Guthaben (source=„cancellation_choice") ist 2 Jahre gültig und löst nach Ablauf eine Auszahl-Erinnerung an Sarah aus. Hier war nichts falsch — nur dokumentarisch verankert.</w:t>
             </w:r>
           </w:p>
         </w:tc>
@@ -34047,7 +34270,7 @@
                 <w:sz w:val="22"/>
                 <w:szCs w:val="22"/>
               </w:rPr>
-              <w:t xml:space="preserve">Admin (Kursabbruch unter /admin/kurse)</w:t>
+              <w:t xml:space="preserve">System / Dokumentation</w:t>
             </w:r>
           </w:p>
         </w:tc>
@@ -34091,43 +34314,43 @@
           <w:sz w:val="22"/>
           <w:szCs w:val="22"/>
         </w:rPr>
-        <w:t xml:space="preserve">Sarah bricht einen Kurs ab.</w:t>
-      </w:r>
-    </w:p>
-    <w:p>
-      <w:pPr>
-        <w:pStyle w:val="ListParagraph"/>
-        <w:numPr>
-          <w:ilvl w:val="0"/>
-          <w:numId w:val="1"/>
-        </w:numPr>
-        <w:spacing w:after="40"/>
-      </w:pPr>
-      <w:r>
-        <w:rPr>
-          <w:rFonts w:ascii="Arial" w:cs="Arial" w:eastAsia="Arial" w:hAnsi="Arial"/>
-          <w:sz w:val="22"/>
-          <w:szCs w:val="22"/>
-        </w:rPr>
-        <w:t xml:space="preserve">Guthaben-Credits (model=„guthaben") werden vom Kurs gelöst (course_id wird geleert) und bleiben im Profil des Yogis erhalten.</w:t>
-      </w:r>
-    </w:p>
-    <w:p>
-      <w:pPr>
-        <w:pStyle w:val="ListParagraph"/>
-        <w:numPr>
-          <w:ilvl w:val="0"/>
-          <w:numId w:val="1"/>
-        </w:numPr>
-        <w:spacing w:after="40"/>
-      </w:pPr>
-      <w:r>
-        <w:rPr>
-          <w:rFonts w:ascii="Arial" w:cs="Arial" w:eastAsia="Arial" w:hAnsi="Arial"/>
-          <w:sz w:val="22"/>
-          <w:szCs w:val="22"/>
-        </w:rPr>
-        <w:t xml:space="preserve">Nur die normalen Kurs-Credits (nicht-Guthaben) dieses Kurses werden gelöscht.</w:t>
+        <w:t xml:space="preserve">Krankheits-Guthaben: gültig bis Attest-Datum + 10 Monate (Welle G).</w:t>
+      </w:r>
+    </w:p>
+    <w:p>
+      <w:pPr>
+        <w:pStyle w:val="ListParagraph"/>
+        <w:numPr>
+          <w:ilvl w:val="0"/>
+          <w:numId w:val="1"/>
+        </w:numPr>
+        <w:spacing w:after="40"/>
+      </w:pPr>
+      <w:r>
+        <w:rPr>
+          <w:rFonts w:ascii="Arial" w:cs="Arial" w:eastAsia="Arial" w:hAnsi="Arial"/>
+          <w:sz w:val="22"/>
+          <w:szCs w:val="22"/>
+        </w:rPr>
+        <w:t xml:space="preserve">Kursabbruch-Guthaben: gültig 2 Jahre ab Vergabe (Welle H).</w:t>
+      </w:r>
+    </w:p>
+    <w:p>
+      <w:pPr>
+        <w:pStyle w:val="ListParagraph"/>
+        <w:numPr>
+          <w:ilvl w:val="0"/>
+          <w:numId w:val="1"/>
+        </w:numPr>
+        <w:spacing w:after="40"/>
+      </w:pPr>
+      <w:r>
+        <w:rPr>
+          <w:rFonts w:ascii="Arial" w:cs="Arial" w:eastAsia="Arial" w:hAnsi="Arial"/>
+          <w:sz w:val="22"/>
+          <w:szCs w:val="22"/>
+        </w:rPr>
+        <w:t xml:space="preserve">Nach Ablauf des 2-Jahre-Guthabens läuft täglich um 04:00 Uhr der Cron fn_check_guthaben_2y_expiry → Dashboard-Notification + E-Mail „admin_guthaben_2y_expiry" an Sarah mit der Bitte, den Betrag manuell zu erstatten.</w:t>
       </w:r>
     </w:p>
     <w:p>
@@ -34168,25 +34391,7 @@
           <w:sz w:val="22"/>
           <w:szCs w:val="22"/>
         </w:rPr>
-        <w:t xml:space="preserve">Identisches Verhalten wie beim Kurs-Löschen (deleteCourse) — die beiden Pfade sind jetzt konsistent.</w:t>
-      </w:r>
-    </w:p>
-    <w:p>
-      <w:pPr>
-        <w:pStyle w:val="ListParagraph"/>
-        <w:numPr>
-          <w:ilvl w:val="0"/>
-          <w:numId w:val="1"/>
-        </w:numPr>
-        <w:spacing w:after="40"/>
-      </w:pPr>
-      <w:r>
-        <w:rPr>
-          <w:rFonts w:ascii="Arial" w:cs="Arial" w:eastAsia="Arial" w:hAnsi="Arial"/>
-          <w:sz w:val="22"/>
-          <w:szCs w:val="22"/>
-        </w:rPr>
-        <w:t xml:space="preserve">Vergebenes Guthaben eines Yogis kann durch einen Kursabbruch nicht mehr verloren gehen.</w:t>
+        <w:t xml:space="preserve">Beide Guthaben-Arten sind NUR mit einem neuen Kurs verrechenbar, nicht für Einzelstunden und nicht als Geld-Auszahlung (außer der manuellen 2-Jahre-Erstattung durch Sarah).</w:t>
       </w:r>
     </w:p>
     <w:p>
@@ -34257,7 +34462,7 @@
           <w:sz w:val="26"/>
           <w:szCs w:val="26"/>
         </w:rPr>
-        <w:t xml:space="preserve">Fall 3: Warteliste-Vorgänge vollständig im Protokoll</w:t>
+        <w:t xml:space="preserve">Fall 2: Kursabbruch schützt Guthaben vor versehentlicher Löschung</w:t>
       </w:r>
     </w:p>
     <w:tbl>
@@ -34306,7 +34511,7 @@
                 <w:sz w:val="22"/>
                 <w:szCs w:val="22"/>
               </w:rPr>
-              <w:t xml:space="preserve">Bisher tauchten manche Warteliste-Vorgänge nur als E-Mail auf, aber nicht im Protokoll bzw. in der Yogi-Historie. Jetzt werden drei Vorgänge lückenlos protokolliert — jeweils mit Name, Stundentitel und Datum/Uhrzeit, sichtbar im zentralen Protokoll und in der Historie des einzelnen Yogis.</w:t>
+              <w:t xml:space="preserve">Beim kompletten Abbrechen eines Kurses (Admin) wurde bisher beim Aufräumen der Credits zu viel gelöscht — auch bereits vergebenes Guthaben hätte verschwinden können. Jetzt gilt dasselbe Schutzmuster wie beim Kurs-Löschen: Guthaben wird vom Kurs entkoppelt statt gelöscht.</w:t>
             </w:r>
           </w:p>
         </w:tc>
@@ -34341,7 +34546,7 @@
                 <w:sz w:val="22"/>
                 <w:szCs w:val="22"/>
               </w:rPr>
-              <w:t xml:space="preserve">System (Warteliste-Automatik) + Yogi (Beitritt)</w:t>
+              <w:t xml:space="preserve">Admin (Kursabbruch unter /admin/kurse)</w:t>
             </w:r>
           </w:p>
         </w:tc>
@@ -34385,43 +34590,43 @@
           <w:sz w:val="22"/>
           <w:szCs w:val="22"/>
         </w:rPr>
-        <w:t xml:space="preserve">Warteliste-Beitritt: Trägt sich ein Yogi auf eine Warteliste ein, wird das protokolliert („Auf Warteliste eingetragen").</w:t>
-      </w:r>
-    </w:p>
-    <w:p>
-      <w:pPr>
-        <w:pStyle w:val="ListParagraph"/>
-        <w:numPr>
-          <w:ilvl w:val="0"/>
-          <w:numId w:val="1"/>
-        </w:numPr>
-        <w:spacing w:after="40"/>
-      </w:pPr>
-      <w:r>
-        <w:rPr>
-          <w:rFonts w:ascii="Arial" w:cs="Arial" w:eastAsia="Arial" w:hAnsi="Arial"/>
-          <w:sz w:val="22"/>
-          <w:szCs w:val="22"/>
-        </w:rPr>
-        <w:t xml:space="preserve">Automatisches Nachrücken: Wird ein Yogi automatisch von der Warteliste eingebucht, wird das protokolliert („Von Warteliste nachgerückt") — in beiden Nachrück-Wegen der App.</w:t>
-      </w:r>
-    </w:p>
-    <w:p>
-      <w:pPr>
-        <w:pStyle w:val="ListParagraph"/>
-        <w:numPr>
-          <w:ilvl w:val="0"/>
-          <w:numId w:val="1"/>
-        </w:numPr>
-        <w:spacing w:after="40"/>
-      </w:pPr>
-      <w:r>
-        <w:rPr>
-          <w:rFonts w:ascii="Arial" w:cs="Arial" w:eastAsia="Arial" w:hAnsi="Arial"/>
-          <w:sz w:val="22"/>
-          <w:szCs w:val="22"/>
-        </w:rPr>
-        <w:t xml:space="preserve">Automatische Entfernung: Verbraucht ein Yogi durch das Nachrücken seinen letzten Credit, wird seine Entfernung von anderen Wartelisten protokolliert („Von Warteliste entfernt — letzter Credit verbraucht").</w:t>
+        <w:t xml:space="preserve">Sarah bricht einen Kurs ab.</w:t>
+      </w:r>
+    </w:p>
+    <w:p>
+      <w:pPr>
+        <w:pStyle w:val="ListParagraph"/>
+        <w:numPr>
+          <w:ilvl w:val="0"/>
+          <w:numId w:val="1"/>
+        </w:numPr>
+        <w:spacing w:after="40"/>
+      </w:pPr>
+      <w:r>
+        <w:rPr>
+          <w:rFonts w:ascii="Arial" w:cs="Arial" w:eastAsia="Arial" w:hAnsi="Arial"/>
+          <w:sz w:val="22"/>
+          <w:szCs w:val="22"/>
+        </w:rPr>
+        <w:t xml:space="preserve">Guthaben-Credits (model=„guthaben") werden vom Kurs gelöst (course_id wird geleert) und bleiben im Profil des Yogis erhalten.</w:t>
+      </w:r>
+    </w:p>
+    <w:p>
+      <w:pPr>
+        <w:pStyle w:val="ListParagraph"/>
+        <w:numPr>
+          <w:ilvl w:val="0"/>
+          <w:numId w:val="1"/>
+        </w:numPr>
+        <w:spacing w:after="40"/>
+      </w:pPr>
+      <w:r>
+        <w:rPr>
+          <w:rFonts w:ascii="Arial" w:cs="Arial" w:eastAsia="Arial" w:hAnsi="Arial"/>
+          <w:sz w:val="22"/>
+          <w:szCs w:val="22"/>
+        </w:rPr>
+        <w:t xml:space="preserve">Nur die normalen Kurs-Credits (nicht-Guthaben) dieses Kurses werden gelöscht.</w:t>
       </w:r>
     </w:p>
     <w:p>
@@ -34462,25 +34667,25 @@
           <w:sz w:val="22"/>
           <w:szCs w:val="22"/>
         </w:rPr>
-        <w:t xml:space="preserve">Das Protokoll-Schreiben ist so abgesichert, dass ein Fehler beim Protokollieren das eigentliche Nachrücken nie abbricht.</w:t>
-      </w:r>
-    </w:p>
-    <w:p>
-      <w:pPr>
-        <w:pStyle w:val="ListParagraph"/>
-        <w:numPr>
-          <w:ilvl w:val="0"/>
-          <w:numId w:val="1"/>
-        </w:numPr>
-        <w:spacing w:after="40"/>
-      </w:pPr>
-      <w:r>
-        <w:rPr>
-          <w:rFonts w:ascii="Arial" w:cs="Arial" w:eastAsia="Arial" w:hAnsi="Arial"/>
-          <w:sz w:val="22"/>
-          <w:szCs w:val="22"/>
-        </w:rPr>
-        <w:t xml:space="preserve">Alle drei Vorgänge erscheinen sowohl im zentralen Protokoll als auch in der aufklappbaren Historie auf der Yogi-Detail-Seite.</w:t>
+        <w:t xml:space="preserve">Identisches Verhalten wie beim Kurs-Löschen (deleteCourse) — die beiden Pfade sind jetzt konsistent.</w:t>
+      </w:r>
+    </w:p>
+    <w:p>
+      <w:pPr>
+        <w:pStyle w:val="ListParagraph"/>
+        <w:numPr>
+          <w:ilvl w:val="0"/>
+          <w:numId w:val="1"/>
+        </w:numPr>
+        <w:spacing w:after="40"/>
+      </w:pPr>
+      <w:r>
+        <w:rPr>
+          <w:rFonts w:ascii="Arial" w:cs="Arial" w:eastAsia="Arial" w:hAnsi="Arial"/>
+          <w:sz w:val="22"/>
+          <w:szCs w:val="22"/>
+        </w:rPr>
+        <w:t xml:space="preserve">Vergebenes Guthaben eines Yogis kann durch einen Kursabbruch nicht mehr verloren gehen.</w:t>
       </w:r>
     </w:p>
     <w:p>
@@ -34551,7 +34756,7 @@
           <w:sz w:val="26"/>
           <w:szCs w:val="26"/>
         </w:rPr>
-        <w:t xml:space="preserve">Fall 4: Account-Selbstlöschung voll abgesichert</w:t>
+        <w:t xml:space="preserve">Fall 3: Warteliste-Vorgänge vollständig im Protokoll</w:t>
       </w:r>
     </w:p>
     <w:tbl>
@@ -34600,7 +34805,7 @@
                 <w:sz w:val="22"/>
                 <w:szCs w:val="22"/>
               </w:rPr>
-              <w:t xml:space="preserve">Beim Löschen des eigenen Accounts werden jetzt alle Yogi-Daten ausdrücklich entfernt (nicht nur über automatische Datenbank-Verknüpfungen). Schlägt die endgültige Zugangs-Löschung fehl, meldet das System das ehrlich und benachrichtigt Sarah — statt fälschlich „erfolgreich" zu melden.</w:t>
+              <w:t xml:space="preserve">Bisher tauchten manche Warteliste-Vorgänge nur als E-Mail auf, aber nicht im Protokoll bzw. in der Yogi-Historie. Jetzt werden drei Vorgänge lückenlos protokolliert — jeweils mit Name, Stundentitel und Datum/Uhrzeit, sichtbar im zentralen Protokoll und in der Historie des einzelnen Yogis.</w:t>
             </w:r>
           </w:p>
         </w:tc>
@@ -34635,7 +34840,7 @@
                 <w:sz w:val="22"/>
                 <w:szCs w:val="22"/>
               </w:rPr>
-              <w:t xml:space="preserve">Yogi (Profil → Account löschen)</w:t>
+              <w:t xml:space="preserve">System (Warteliste-Automatik) + Yogi (Beitritt)</w:t>
             </w:r>
           </w:p>
         </w:tc>
@@ -34679,43 +34884,43 @@
           <w:sz w:val="22"/>
           <w:szCs w:val="22"/>
         </w:rPr>
-        <w:t xml:space="preserve">Vor der eigentlichen Zugangs-Löschung werden Buchungen, Credits, Benachrichtigungs-Protokoll und Wartelisten-Angebote des Yogis ausdrücklich gelöscht.</w:t>
-      </w:r>
-    </w:p>
-    <w:p>
-      <w:pPr>
-        <w:pStyle w:val="ListParagraph"/>
-        <w:numPr>
-          <w:ilvl w:val="0"/>
-          <w:numId w:val="1"/>
-        </w:numPr>
-        <w:spacing w:after="40"/>
-      </w:pPr>
-      <w:r>
-        <w:rPr>
-          <w:rFonts w:ascii="Arial" w:cs="Arial" w:eastAsia="Arial" w:hAnsi="Arial"/>
-          <w:sz w:val="22"/>
-          <w:szCs w:val="22"/>
-        </w:rPr>
-        <w:t xml:space="preserve">Erst danach wird der Auth-Zugang entfernt.</w:t>
-      </w:r>
-    </w:p>
-    <w:p>
-      <w:pPr>
-        <w:pStyle w:val="ListParagraph"/>
-        <w:numPr>
-          <w:ilvl w:val="0"/>
-          <w:numId w:val="1"/>
-        </w:numPr>
-        <w:spacing w:after="40"/>
-      </w:pPr>
-      <w:r>
-        <w:rPr>
-          <w:rFonts w:ascii="Arial" w:cs="Arial" w:eastAsia="Arial" w:hAnsi="Arial"/>
-          <w:sz w:val="22"/>
-          <w:szCs w:val="22"/>
-        </w:rPr>
-        <w:t xml:space="preserve">Schlägt die Auth-Löschung fehl, meldet die Route einen ehrlichen Fehler (kein „success") und legt eine Admin-Benachrichtigung „auth_delete_failed" an, damit Sarah nachfassen kann.</w:t>
+        <w:t xml:space="preserve">Warteliste-Beitritt: Trägt sich ein Yogi auf eine Warteliste ein, wird das protokolliert („Auf Warteliste eingetragen").</w:t>
+      </w:r>
+    </w:p>
+    <w:p>
+      <w:pPr>
+        <w:pStyle w:val="ListParagraph"/>
+        <w:numPr>
+          <w:ilvl w:val="0"/>
+          <w:numId w:val="1"/>
+        </w:numPr>
+        <w:spacing w:after="40"/>
+      </w:pPr>
+      <w:r>
+        <w:rPr>
+          <w:rFonts w:ascii="Arial" w:cs="Arial" w:eastAsia="Arial" w:hAnsi="Arial"/>
+          <w:sz w:val="22"/>
+          <w:szCs w:val="22"/>
+        </w:rPr>
+        <w:t xml:space="preserve">Automatisches Nachrücken: Wird ein Yogi automatisch von der Warteliste eingebucht, wird das protokolliert („Von Warteliste nachgerückt") — in beiden Nachrück-Wegen der App.</w:t>
+      </w:r>
+    </w:p>
+    <w:p>
+      <w:pPr>
+        <w:pStyle w:val="ListParagraph"/>
+        <w:numPr>
+          <w:ilvl w:val="0"/>
+          <w:numId w:val="1"/>
+        </w:numPr>
+        <w:spacing w:after="40"/>
+      </w:pPr>
+      <w:r>
+        <w:rPr>
+          <w:rFonts w:ascii="Arial" w:cs="Arial" w:eastAsia="Arial" w:hAnsi="Arial"/>
+          <w:sz w:val="22"/>
+          <w:szCs w:val="22"/>
+        </w:rPr>
+        <w:t xml:space="preserve">Automatische Entfernung: Verbraucht ein Yogi durch das Nachrücken seinen letzten Credit, wird seine Entfernung von anderen Wartelisten protokolliert („Von Warteliste entfernt — letzter Credit verbraucht").</w:t>
       </w:r>
     </w:p>
     <w:p>
@@ -34756,7 +34961,25 @@
           <w:sz w:val="22"/>
           <w:szCs w:val="22"/>
         </w:rPr>
-        <w:t xml:space="preserve">Die Dashboard-Benachrichtigung „Account DSGVO-gelöscht" (mit Name + E-Mail) bleibt bewusst bestehen — sie wird für Sarahs manuelles Löschen der AGB-PDF im Google Drive gebraucht.</w:t>
+        <w:t xml:space="preserve">Das Protokoll-Schreiben ist so abgesichert, dass ein Fehler beim Protokollieren das eigentliche Nachrücken nie abbricht.</w:t>
+      </w:r>
+    </w:p>
+    <w:p>
+      <w:pPr>
+        <w:pStyle w:val="ListParagraph"/>
+        <w:numPr>
+          <w:ilvl w:val="0"/>
+          <w:numId w:val="1"/>
+        </w:numPr>
+        <w:spacing w:after="40"/>
+      </w:pPr>
+      <w:r>
+        <w:rPr>
+          <w:rFonts w:ascii="Arial" w:cs="Arial" w:eastAsia="Arial" w:hAnsi="Arial"/>
+          <w:sz w:val="22"/>
+          <w:szCs w:val="22"/>
+        </w:rPr>
+        <w:t xml:space="preserve">Alle drei Vorgänge erscheinen sowohl im zentralen Protokoll als auch in der aufklappbaren Historie auf der Yogi-Detail-Seite.</w:t>
       </w:r>
     </w:p>
     <w:p>
@@ -34827,7 +35050,7 @@
           <w:sz w:val="26"/>
           <w:szCs w:val="26"/>
         </w:rPr>
-        <w:t xml:space="preserve">Fall 5: Absage-Fristen in deutscher Zeit (Europe/Berlin)</w:t>
+        <w:t xml:space="preserve">Fall 4: Account-Selbstlöschung voll abgesichert</w:t>
       </w:r>
     </w:p>
     <w:tbl>
@@ -34876,7 +35099,7 @@
                 <w:sz w:val="22"/>
                 <w:szCs w:val="22"/>
               </w:rPr>
-              <w:t xml:space="preserve">Die Stornofristen (z.B. 3 Stunden vor Stundenbeginn, 90-Minuten-Grenze) werden jetzt verlässlich in deutscher Zeitzone berechnet — unabhängig davon, welche Zeitzone das Gerät des Yogis eingestellt hat. Am Absage-Button steht ein klarer Hinweis dazu.</w:t>
+              <w:t xml:space="preserve">Beim Löschen des eigenen Accounts werden jetzt alle Yogi-Daten ausdrücklich entfernt (nicht nur über automatische Datenbank-Verknüpfungen). Schlägt die endgültige Zugangs-Löschung fehl, meldet das System das ehrlich und benachrichtigt Sarah — statt fälschlich „erfolgreich" zu melden.</w:t>
             </w:r>
           </w:p>
         </w:tc>
@@ -34911,7 +35134,7 @@
                 <w:sz w:val="22"/>
                 <w:szCs w:val="22"/>
               </w:rPr>
-              <w:t xml:space="preserve">Yogi (Abmeldung von einer Stunde)</w:t>
+              <w:t xml:space="preserve">Yogi (Profil → Account löschen)</w:t>
             </w:r>
           </w:p>
         </w:tc>
@@ -34955,25 +35178,43 @@
           <w:sz w:val="22"/>
           <w:szCs w:val="22"/>
         </w:rPr>
-        <w:t xml:space="preserve">Stundenbeginn und die 3-Stunden- bzw. 90-Minuten-Grenze werden anhand der deutschen Wand-Uhrzeit (Europe/Berlin) berechnet.</w:t>
-      </w:r>
-    </w:p>
-    <w:p>
-      <w:pPr>
-        <w:pStyle w:val="ListParagraph"/>
-        <w:numPr>
-          <w:ilvl w:val="0"/>
-          <w:numId w:val="1"/>
-        </w:numPr>
-        <w:spacing w:after="40"/>
-      </w:pPr>
-      <w:r>
-        <w:rPr>
-          <w:rFonts w:ascii="Arial" w:cs="Arial" w:eastAsia="Arial" w:hAnsi="Arial"/>
-          <w:sz w:val="22"/>
-          <w:szCs w:val="22"/>
-        </w:rPr>
-        <w:t xml:space="preserve">Am „Ja, abmelden"-Button erscheint der Hinweis „Für alle Fristen gilt die deutsche Zeitzone (Europe/Berlin)."</w:t>
+        <w:t xml:space="preserve">Vor der eigentlichen Zugangs-Löschung werden Buchungen, Credits, Benachrichtigungs-Protokoll und Wartelisten-Angebote des Yogis ausdrücklich gelöscht.</w:t>
+      </w:r>
+    </w:p>
+    <w:p>
+      <w:pPr>
+        <w:pStyle w:val="ListParagraph"/>
+        <w:numPr>
+          <w:ilvl w:val="0"/>
+          <w:numId w:val="1"/>
+        </w:numPr>
+        <w:spacing w:after="40"/>
+      </w:pPr>
+      <w:r>
+        <w:rPr>
+          <w:rFonts w:ascii="Arial" w:cs="Arial" w:eastAsia="Arial" w:hAnsi="Arial"/>
+          <w:sz w:val="22"/>
+          <w:szCs w:val="22"/>
+        </w:rPr>
+        <w:t xml:space="preserve">Erst danach wird der Auth-Zugang entfernt.</w:t>
+      </w:r>
+    </w:p>
+    <w:p>
+      <w:pPr>
+        <w:pStyle w:val="ListParagraph"/>
+        <w:numPr>
+          <w:ilvl w:val="0"/>
+          <w:numId w:val="1"/>
+        </w:numPr>
+        <w:spacing w:after="40"/>
+      </w:pPr>
+      <w:r>
+        <w:rPr>
+          <w:rFonts w:ascii="Arial" w:cs="Arial" w:eastAsia="Arial" w:hAnsi="Arial"/>
+          <w:sz w:val="22"/>
+          <w:szCs w:val="22"/>
+        </w:rPr>
+        <w:t xml:space="preserve">Schlägt die Auth-Löschung fehl, meldet die Route einen ehrlichen Fehler (kein „success") und legt eine Admin-Benachrichtigung „auth_delete_failed" an, damit Sarah nachfassen kann.</w:t>
       </w:r>
     </w:p>
     <w:p>
@@ -35014,65 +35255,7 @@
           <w:sz w:val="22"/>
           <w:szCs w:val="22"/>
         </w:rPr>
-        <w:t xml:space="preserve">Falls die Berlin-Berechnung einmal nicht möglich ist, greift als Rückfall die bisherige Geräte-Zeit — die Frist wird also nie komplett umgangen.</w:t>
-      </w:r>
-    </w:p>
-    <w:p>
-      <w:pPr>
-        <w:pStyle w:val="ListParagraph"/>
-        <w:numPr>
-          <w:ilvl w:val="0"/>
-          <w:numId w:val="1"/>
-        </w:numPr>
-        <w:spacing w:after="40"/>
-      </w:pPr>
-      <w:r>
-        <w:rPr>
-          <w:rFonts w:ascii="Arial" w:cs="Arial" w:eastAsia="Arial" w:hAnsi="Arial"/>
-          <w:sz w:val="22"/>
-          <w:szCs w:val="22"/>
-        </w:rPr>
-        <w:t xml:space="preserve">Bei kostenlosen (Charity-)Stunden gibt es weiterhin keine Frist und keinen Credit-Verlust; der Hinweis erscheint dort nicht.</w:t>
-      </w:r>
-    </w:p>
-    <w:p>
-      <w:pPr>
-        <w:spacing w:after="80"/>
-      </w:pPr>
-      <w:r>
-        <w:rPr>
-          <w:rFonts w:ascii="Arial" w:cs="Arial" w:eastAsia="Arial" w:hAnsi="Arial"/>
-          <w:b/>
-          <w:bCs/>
-          <w:sz w:val="22"/>
-          <w:szCs w:val="22"/>
-        </w:rPr>
-        <w:t xml:space="preserve">Angezeigte Texte: </w:t>
-      </w:r>
-      <w:r>
-        <w:rPr>
-          <w:rFonts w:ascii="Arial" w:cs="Arial" w:eastAsia="Arial" w:hAnsi="Arial"/>
-          <w:sz w:val="22"/>
-          <w:szCs w:val="22"/>
-        </w:rPr>
-        <w:t xml:space="preserve"/>
-      </w:r>
-    </w:p>
-    <w:p>
-      <w:pPr>
-        <w:spacing w:after="60"/>
-        <w:ind w:left="288"/>
-      </w:pPr>
-      <w:r>
-        <w:rPr>
-          <w:rFonts w:ascii="Arial" w:cs="Arial" w:eastAsia="Arial" w:hAnsi="Arial"/>
-          <w:i/>
-          <w:iCs/>
-          <w:color w:val="555555"/>
-          <w:sz w:val="22"/>
-          <w:szCs w:val="22"/>
-        </w:rPr>
-        <w:t xml:space="preserve">„Für alle Fristen gilt die deutsche Zeitzone (Europe/Berlin)."</w:t>
+        <w:t xml:space="preserve">Die Dashboard-Benachrichtigung „Account DSGVO-gelöscht" (mit Name + E-Mail) bleibt bewusst bestehen — sie wird für Sarahs manuelles Löschen der AGB-PDF im Google Drive gebraucht.</w:t>
       </w:r>
     </w:p>
     <w:p>
@@ -35130,6 +35313,327 @@
       </w:r>
     </w:p>
     <w:p>
+      <w:pPr>
+        <w:pStyle w:val="Heading2"/>
+        <w:spacing w:after="100" w:before="240"/>
+      </w:pPr>
+      <w:r>
+        <w:rPr>
+          <w:rFonts w:ascii="Arial" w:cs="Arial" w:eastAsia="Arial" w:hAnsi="Arial"/>
+          <w:b/>
+          <w:bCs/>
+          <w:color w:val="8a6020"/>
+          <w:sz w:val="26"/>
+          <w:szCs w:val="26"/>
+        </w:rPr>
+        <w:t xml:space="preserve">Fall 5: Absage-Fristen in deutscher Zeit (Europe/Berlin)</w:t>
+      </w:r>
+    </w:p>
+    <w:tbl>
+      <w:tblPr>
+        <w:tblW w:type="pct" w:w="100%"/>
+        <w:tblBorders>
+          <w:top w:val="single" w:color="auto" w:sz="4"/>
+          <w:left w:val="single" w:color="auto" w:sz="4"/>
+          <w:bottom w:val="single" w:color="auto" w:sz="4"/>
+          <w:right w:val="single" w:color="auto" w:sz="4"/>
+          <w:insideH w:val="single" w:color="auto" w:sz="4"/>
+          <w:insideV w:val="single" w:color="auto" w:sz="4"/>
+        </w:tblBorders>
+      </w:tblPr>
+      <w:tblGrid>
+        <w:gridCol w:w="100"/>
+        <w:gridCol w:w="100"/>
+      </w:tblGrid>
+      <w:tr>
+        <w:tc>
+          <w:tcPr>
+            <w:tcW w:type="pct" w:w="28%"/>
+            <w:shd w:fill="f5f2f0" w:color="f5f2f0" w:val="solid"/>
+          </w:tcPr>
+          <w:p>
+            <w:r>
+              <w:rPr>
+                <w:rFonts w:ascii="Arial" w:cs="Arial" w:eastAsia="Arial" w:hAnsi="Arial"/>
+                <w:b/>
+                <w:bCs/>
+                <w:sz w:val="22"/>
+                <w:szCs w:val="22"/>
+              </w:rPr>
+              <w:t xml:space="preserve">Was</w:t>
+            </w:r>
+          </w:p>
+        </w:tc>
+        <w:tc>
+          <w:tcPr>
+            <w:tcW w:type="pct" w:w="72%"/>
+          </w:tcPr>
+          <w:p>
+            <w:r>
+              <w:rPr>
+                <w:rFonts w:ascii="Arial" w:cs="Arial" w:eastAsia="Arial" w:hAnsi="Arial"/>
+                <w:sz w:val="22"/>
+                <w:szCs w:val="22"/>
+              </w:rPr>
+              <w:t xml:space="preserve">Die Stornofristen (z.B. 3 Stunden vor Stundenbeginn, 90-Minuten-Grenze) werden jetzt verlässlich in deutscher Zeitzone berechnet — unabhängig davon, welche Zeitzone das Gerät des Yogis eingestellt hat. Am Absage-Button steht ein klarer Hinweis dazu.</w:t>
+            </w:r>
+          </w:p>
+        </w:tc>
+      </w:tr>
+      <w:tr>
+        <w:tc>
+          <w:tcPr>
+            <w:tcW w:type="pct" w:w="28%"/>
+            <w:shd w:fill="f5f2f0" w:color="f5f2f0" w:val="solid"/>
+          </w:tcPr>
+          <w:p>
+            <w:r>
+              <w:rPr>
+                <w:rFonts w:ascii="Arial" w:cs="Arial" w:eastAsia="Arial" w:hAnsi="Arial"/>
+                <w:b/>
+                <w:bCs/>
+                <w:sz w:val="22"/>
+                <w:szCs w:val="22"/>
+              </w:rPr>
+              <w:t xml:space="preserve">Wer</w:t>
+            </w:r>
+          </w:p>
+        </w:tc>
+        <w:tc>
+          <w:tcPr>
+            <w:tcW w:type="pct" w:w="72%"/>
+          </w:tcPr>
+          <w:p>
+            <w:r>
+              <w:rPr>
+                <w:rFonts w:ascii="Arial" w:cs="Arial" w:eastAsia="Arial" w:hAnsi="Arial"/>
+                <w:sz w:val="22"/>
+                <w:szCs w:val="22"/>
+              </w:rPr>
+              <w:t xml:space="preserve">Yogi (Abmeldung von einer Stunde)</w:t>
+            </w:r>
+          </w:p>
+        </w:tc>
+      </w:tr>
+    </w:tbl>
+    <w:p>
+      <w:pPr>
+        <w:spacing w:after="80"/>
+      </w:pPr>
+      <w:r>
+        <w:rPr>
+          <w:rFonts w:ascii="Arial" w:cs="Arial" w:eastAsia="Arial" w:hAnsi="Arial"/>
+          <w:b/>
+          <w:bCs/>
+          <w:sz w:val="22"/>
+          <w:szCs w:val="22"/>
+        </w:rPr>
+        <w:t xml:space="preserve">Ablauf: </w:t>
+      </w:r>
+      <w:r>
+        <w:rPr>
+          <w:rFonts w:ascii="Arial" w:cs="Arial" w:eastAsia="Arial" w:hAnsi="Arial"/>
+          <w:sz w:val="22"/>
+          <w:szCs w:val="22"/>
+        </w:rPr>
+        <w:t xml:space="preserve"/>
+      </w:r>
+    </w:p>
+    <w:p>
+      <w:pPr>
+        <w:pStyle w:val="ListParagraph"/>
+        <w:numPr>
+          <w:ilvl w:val="0"/>
+          <w:numId w:val="1"/>
+        </w:numPr>
+        <w:spacing w:after="40"/>
+      </w:pPr>
+      <w:r>
+        <w:rPr>
+          <w:rFonts w:ascii="Arial" w:cs="Arial" w:eastAsia="Arial" w:hAnsi="Arial"/>
+          <w:sz w:val="22"/>
+          <w:szCs w:val="22"/>
+        </w:rPr>
+        <w:t xml:space="preserve">Stundenbeginn und die 3-Stunden- bzw. 90-Minuten-Grenze werden anhand der deutschen Wand-Uhrzeit (Europe/Berlin) berechnet.</w:t>
+      </w:r>
+    </w:p>
+    <w:p>
+      <w:pPr>
+        <w:pStyle w:val="ListParagraph"/>
+        <w:numPr>
+          <w:ilvl w:val="0"/>
+          <w:numId w:val="1"/>
+        </w:numPr>
+        <w:spacing w:after="40"/>
+      </w:pPr>
+      <w:r>
+        <w:rPr>
+          <w:rFonts w:ascii="Arial" w:cs="Arial" w:eastAsia="Arial" w:hAnsi="Arial"/>
+          <w:sz w:val="22"/>
+          <w:szCs w:val="22"/>
+        </w:rPr>
+        <w:t xml:space="preserve">Am „Ja, abmelden"-Button erscheint der Hinweis „Für alle Fristen gilt die deutsche Zeitzone (Europe/Berlin)."</w:t>
+      </w:r>
+    </w:p>
+    <w:p>
+      <w:pPr>
+        <w:spacing w:after="80"/>
+      </w:pPr>
+      <w:r>
+        <w:rPr>
+          <w:rFonts w:ascii="Arial" w:cs="Arial" w:eastAsia="Arial" w:hAnsi="Arial"/>
+          <w:b/>
+          <w:bCs/>
+          <w:sz w:val="22"/>
+          <w:szCs w:val="22"/>
+        </w:rPr>
+        <w:t xml:space="preserve">Regeln &amp; Grenzen: </w:t>
+      </w:r>
+      <w:r>
+        <w:rPr>
+          <w:rFonts w:ascii="Arial" w:cs="Arial" w:eastAsia="Arial" w:hAnsi="Arial"/>
+          <w:sz w:val="22"/>
+          <w:szCs w:val="22"/>
+        </w:rPr>
+        <w:t xml:space="preserve"/>
+      </w:r>
+    </w:p>
+    <w:p>
+      <w:pPr>
+        <w:pStyle w:val="ListParagraph"/>
+        <w:numPr>
+          <w:ilvl w:val="0"/>
+          <w:numId w:val="1"/>
+        </w:numPr>
+        <w:spacing w:after="40"/>
+      </w:pPr>
+      <w:r>
+        <w:rPr>
+          <w:rFonts w:ascii="Arial" w:cs="Arial" w:eastAsia="Arial" w:hAnsi="Arial"/>
+          <w:sz w:val="22"/>
+          <w:szCs w:val="22"/>
+        </w:rPr>
+        <w:t xml:space="preserve">Falls die Berlin-Berechnung einmal nicht möglich ist, greift als Rückfall die bisherige Geräte-Zeit — die Frist wird also nie komplett umgangen.</w:t>
+      </w:r>
+    </w:p>
+    <w:p>
+      <w:pPr>
+        <w:pStyle w:val="ListParagraph"/>
+        <w:numPr>
+          <w:ilvl w:val="0"/>
+          <w:numId w:val="1"/>
+        </w:numPr>
+        <w:spacing w:after="40"/>
+      </w:pPr>
+      <w:r>
+        <w:rPr>
+          <w:rFonts w:ascii="Arial" w:cs="Arial" w:eastAsia="Arial" w:hAnsi="Arial"/>
+          <w:sz w:val="22"/>
+          <w:szCs w:val="22"/>
+        </w:rPr>
+        <w:t xml:space="preserve">Bei kostenlosen (Charity-)Stunden gibt es weiterhin keine Frist und keinen Credit-Verlust; der Hinweis erscheint dort nicht.</w:t>
+      </w:r>
+    </w:p>
+    <w:p>
+      <w:pPr>
+        <w:spacing w:after="80"/>
+      </w:pPr>
+      <w:r>
+        <w:rPr>
+          <w:rFonts w:ascii="Arial" w:cs="Arial" w:eastAsia="Arial" w:hAnsi="Arial"/>
+          <w:b/>
+          <w:bCs/>
+          <w:sz w:val="22"/>
+          <w:szCs w:val="22"/>
+        </w:rPr>
+        <w:t xml:space="preserve">Angezeigte Texte: </w:t>
+      </w:r>
+      <w:r>
+        <w:rPr>
+          <w:rFonts w:ascii="Arial" w:cs="Arial" w:eastAsia="Arial" w:hAnsi="Arial"/>
+          <w:sz w:val="22"/>
+          <w:szCs w:val="22"/>
+        </w:rPr>
+        <w:t xml:space="preserve"/>
+      </w:r>
+    </w:p>
+    <w:p>
+      <w:pPr>
+        <w:spacing w:after="60"/>
+        <w:ind w:left="288"/>
+      </w:pPr>
+      <w:r>
+        <w:rPr>
+          <w:rFonts w:ascii="Arial" w:cs="Arial" w:eastAsia="Arial" w:hAnsi="Arial"/>
+          <w:i/>
+          <w:iCs/>
+          <w:color w:val="555555"/>
+          <w:sz w:val="22"/>
+          <w:szCs w:val="22"/>
+        </w:rPr>
+        <w:t xml:space="preserve">„Für alle Fristen gilt die deutsche Zeitzone (Europe/Berlin)."</w:t>
+      </w:r>
+    </w:p>
+    <w:p>
+      <w:pPr>
+        <w:pBdr>
+          <w:top w:val="single" w:color="cccccc" w:sz="4"/>
+        </w:pBdr>
+        <w:spacing w:after="240" w:before="120"/>
+      </w:pPr>
+      <w:sdt>
+        <w:sdtPr>
+          <w:alias w:val="Verhalten OK"/>
+          <w14:checkbox>
+            <w14:checked w14:val="0"/>
+            <w14:checkedState w14:val="2612" w14:font="MS Gothic"/>
+            <w14:uncheckedState w14:val="2610" w14:font="MS Gothic"/>
+          </w14:checkbox>
+        </w:sdtPr>
+        <w:sdtContent>
+          <w:r>
+            <w:sym w:char="2610" w:font="MS Gothic"/>
+          </w:r>
+        </w:sdtContent>
+      </w:sdt>
+      <w:r>
+        <w:rPr>
+          <w:rFonts w:ascii="Arial" w:cs="Arial" w:eastAsia="Arial" w:hAnsi="Arial"/>
+          <w:sz w:val="22"/>
+          <w:szCs w:val="22"/>
+        </w:rPr>
+        <w:t xml:space="preserve"> Verhalten entspricht meiner Vorstellung     </w:t>
+      </w:r>
+      <w:sdt>
+        <w:sdtPr>
+          <w:alias w:val="Anpassung"/>
+          <w14:checkbox>
+            <w14:checked w14:val="0"/>
+            <w14:checkedState w14:val="2612" w14:font="MS Gothic"/>
+            <w14:uncheckedState w14:val="2610" w14:font="MS Gothic"/>
+          </w14:checkbox>
+        </w:sdtPr>
+        <w:sdtContent>
+          <w:r>
+            <w:sym w:char="2610" w:font="MS Gothic"/>
+          </w:r>
+        </w:sdtContent>
+      </w:sdt>
+      <w:r>
+        <w:rPr>
+          <w:rFonts w:ascii="Arial" w:cs="Arial" w:eastAsia="Arial" w:hAnsi="Arial"/>
+          <w:sz w:val="22"/>
+          <w:szCs w:val="22"/>
+        </w:rPr>
+        <w:t xml:space="preserve"> Anpassung nötig: ___________________________</w:t>
+      </w:r>
+    </w:p>
+    <w:p>
+      <w:r>
+        <w:br w:type="page"/>
+      </w:r>
+    </w:p>
+    <w:p>
       <w:r>
         <w:br w:type="page"/>
       </w:r>
@@ -35148,6 +35652,209 @@
           <w:sz w:val="32"/>
           <w:szCs w:val="32"/>
         </w:rPr>
+        <w:t xml:space="preserve">Welle J: Live-Bugfixes &amp; Sicherheits-Härtung (30.05.2026)</w:t>
+      </w:r>
+    </w:p>
+    <w:p>
+      <w:pPr>
+        <w:spacing w:after="80"/>
+      </w:pPr>
+      <w:r>
+        <w:rPr>
+          <w:rFonts w:ascii="Arial" w:cs="Arial" w:eastAsia="Arial" w:hAnsi="Arial"/>
+          <w:sz w:val="22"/>
+          <w:szCs w:val="22"/>
+        </w:rPr>
+        <w:t xml:space="preserve">Nach einem Live-Test und einem Sicherheits-Audit vor dem Go-Live wurden mehrere Fehler behoben und die App im Hintergrund gehärtet. Für dich als Nutzerin ändert sich am Ablauf NICHTS — die bestehenden Regeln (3-Std-Frist, Einladungs-Einbuchung, Warteliste usw.) gelten unverändert; sie werden jetzt nur zuverlässiger und manipulationssicher durchgesetzt.</w:t>
+      </w:r>
+    </w:p>
+    <w:p>
+      <w:pPr>
+        <w:pStyle w:val="Heading2"/>
+        <w:spacing w:after="100" w:before="240"/>
+      </w:pPr>
+      <w:r>
+        <w:rPr>
+          <w:rFonts w:ascii="Arial" w:cs="Arial" w:eastAsia="Arial" w:hAnsi="Arial"/>
+          <w:b/>
+          <w:bCs/>
+          <w:color w:val="8a6020"/>
+          <w:sz w:val="26"/>
+          <w:szCs w:val="26"/>
+        </w:rPr>
+        <w:t xml:space="preserve">Behobene Fehler aus dem Live-Test</w:t>
+      </w:r>
+    </w:p>
+    <w:p>
+      <w:pPr>
+        <w:pStyle w:val="ListParagraph"/>
+        <w:numPr>
+          <w:ilvl w:val="0"/>
+          <w:numId w:val="1"/>
+        </w:numPr>
+        <w:spacing w:after="40"/>
+      </w:pPr>
+      <w:r>
+        <w:rPr>
+          <w:rFonts w:ascii="Arial" w:cs="Arial" w:eastAsia="Arial" w:hAnsi="Arial"/>
+          <w:sz w:val="22"/>
+          <w:szCs w:val="22"/>
+        </w:rPr>
+        <w:t xml:space="preserve">Einladung mit Kurs: Wer sich über einen Einladungslink registriert, wird jetzt zuverlässig automatisch in alle Kursstunden eingebucht (vorher wurde die Einbuchung in seltenen Fällen still übersprungen, und Sarah musste manuell nachbuchen).</w:t>
+      </w:r>
+    </w:p>
+    <w:p>
+      <w:pPr>
+        <w:pStyle w:val="ListParagraph"/>
+        <w:numPr>
+          <w:ilvl w:val="0"/>
+          <w:numId w:val="1"/>
+        </w:numPr>
+        <w:spacing w:after="40"/>
+      </w:pPr>
+      <w:r>
+        <w:rPr>
+          <w:rFonts w:ascii="Arial" w:cs="Arial" w:eastAsia="Arial" w:hAnsi="Arial"/>
+          <w:sz w:val="22"/>
+          <w:szCs w:val="22"/>
+        </w:rPr>
+        <w:t xml:space="preserve">Protokoll &amp; Statistik-Kacheln: Bei Events und Einzelstunden steht jetzt der ECHTE Titel (z. B. „Charity Yoga") statt eines internen Container-Namens; Wartelisten-Einträge im Protokoll zeigen die konkrete Stunde (Datum/Uhrzeit).</w:t>
+      </w:r>
+    </w:p>
+    <w:p>
+      <w:pPr>
+        <w:pStyle w:val="ListParagraph"/>
+        <w:numPr>
+          <w:ilvl w:val="0"/>
+          <w:numId w:val="1"/>
+        </w:numPr>
+        <w:spacing w:after="40"/>
+      </w:pPr>
+      <w:r>
+        <w:rPr>
+          <w:rFonts w:ascii="Arial" w:cs="Arial" w:eastAsia="Arial" w:hAnsi="Arial"/>
+          <w:sz w:val="22"/>
+          <w:szCs w:val="22"/>
+        </w:rPr>
+        <w:t xml:space="preserve">Dashboard-Kacheln: „Buchungen / Abmeldungen / Warteliste" zählen jetzt den Stand der Stunden DIESER Woche (statt einer globalen bzw. anlagedatum-basierten Zahl).</w:t>
+      </w:r>
+    </w:p>
+    <w:p>
+      <w:pPr>
+        <w:pStyle w:val="Heading2"/>
+        <w:spacing w:after="100" w:before="240"/>
+      </w:pPr>
+      <w:r>
+        <w:rPr>
+          <w:rFonts w:ascii="Arial" w:cs="Arial" w:eastAsia="Arial" w:hAnsi="Arial"/>
+          <w:b/>
+          <w:bCs/>
+          <w:color w:val="8a6020"/>
+          <w:sz w:val="26"/>
+          <w:szCs w:val="26"/>
+        </w:rPr>
+        <w:t xml:space="preserve">Datenschutz &amp; Sicherheit (Schutzmechanik im Hintergrund)</w:t>
+      </w:r>
+    </w:p>
+    <w:p>
+      <w:pPr>
+        <w:spacing w:after="80"/>
+      </w:pPr>
+      <w:r>
+        <w:rPr>
+          <w:rFonts w:ascii="Arial" w:cs="Arial" w:eastAsia="Arial" w:hAnsi="Arial"/>
+          <w:sz w:val="22"/>
+          <w:szCs w:val="22"/>
+        </w:rPr>
+        <w:t xml:space="preserve">Diese Punkte sind keine Klick-Abläufe, sondern Schutzmaßnahmen auf dem Server. Sie stellen sicher, dass niemand die App-Regeln über technische Umwege aushebeln kann — auch nicht jemand mit Programmierkenntnissen:</w:t>
+      </w:r>
+    </w:p>
+    <w:p>
+      <w:pPr>
+        <w:pStyle w:val="ListParagraph"/>
+        <w:numPr>
+          <w:ilvl w:val="0"/>
+          <w:numId w:val="1"/>
+        </w:numPr>
+        <w:spacing w:after="40"/>
+      </w:pPr>
+      <w:r>
+        <w:rPr>
+          <w:rFonts w:ascii="Arial" w:cs="Arial" w:eastAsia="Arial" w:hAnsi="Arial"/>
+          <w:sz w:val="22"/>
+          <w:szCs w:val="22"/>
+        </w:rPr>
+        <w:t xml:space="preserve">Nur Sarah ist Admin: Ein normaler Yogi kann sich KEINE Admin-Rechte verschaffen — das ist server-seitig gesperrt (nicht nur in der Oberfläche).</w:t>
+      </w:r>
+    </w:p>
+    <w:p>
+      <w:pPr>
+        <w:pStyle w:val="ListParagraph"/>
+        <w:numPr>
+          <w:ilvl w:val="0"/>
+          <w:numId w:val="1"/>
+        </w:numPr>
+        <w:spacing w:after="40"/>
+      </w:pPr>
+      <w:r>
+        <w:rPr>
+          <w:rFonts w:ascii="Arial" w:cs="Arial" w:eastAsia="Arial" w:hAnsi="Arial"/>
+          <w:sz w:val="22"/>
+          <w:szCs w:val="22"/>
+        </w:rPr>
+        <w:t xml:space="preserve">Credits nur durch Sarah/System: Niemand kann sich selbst Gratis-Stunden gutschreiben. Die automatische Einbuchung über eine Einladung läuft server-validiert mit der von Sarah vorgegebenen Stundenzahl.</w:t>
+      </w:r>
+    </w:p>
+    <w:p>
+      <w:pPr>
+        <w:pStyle w:val="ListParagraph"/>
+        <w:numPr>
+          <w:ilvl w:val="0"/>
+          <w:numId w:val="1"/>
+        </w:numPr>
+        <w:spacing w:after="40"/>
+      </w:pPr>
+      <w:r>
+        <w:rPr>
+          <w:rFonts w:ascii="Arial" w:cs="Arial" w:eastAsia="Arial" w:hAnsi="Arial"/>
+          <w:sz w:val="22"/>
+          <w:szCs w:val="22"/>
+        </w:rPr>
+        <w:t xml:space="preserve">3-Stunden-Frist verbindlich: Eine Abmeldung unter 3 Stunden vor Stundenbeginn gilt server-seitig als „spät" (der Credit verfällt) — das lässt sich technisch nicht als „pünktlich" ausgeben.</w:t>
+      </w:r>
+    </w:p>
+    <w:p>
+      <w:pPr>
+        <w:pStyle w:val="ListParagraph"/>
+        <w:numPr>
+          <w:ilvl w:val="0"/>
+          <w:numId w:val="1"/>
+        </w:numPr>
+        <w:spacing w:after="40"/>
+      </w:pPr>
+      <w:r>
+        <w:rPr>
+          <w:rFonts w:ascii="Arial" w:cs="Arial" w:eastAsia="Arial" w:hAnsi="Arial"/>
+          <w:sz w:val="22"/>
+          <w:szCs w:val="22"/>
+        </w:rPr>
+        <w:t xml:space="preserve">Inaktive Konten: Die geplante 24-Monats-Inaktivitäts-Löschung misst „aktiv" jetzt robust (spätester Zeitpunkt aus letztem Login UND letzter App-Aktion), damit aktive Dauer-Nutzer (z. B. installierte App ohne erneuten Login) nie versehentlich erfasst werden. Läuft weiterhin nur als Trockenlauf — es wird nichts gelöscht.</w:t>
+      </w:r>
+    </w:p>
+    <w:p>
+      <w:pPr>
+        <w:pStyle w:val="Heading1"/>
+        <w:spacing w:after="160" w:before="360"/>
+      </w:pPr>
+      <w:r>
+        <w:rPr>
+          <w:rFonts w:ascii="Arial" w:cs="Arial" w:eastAsia="Arial" w:hAnsi="Arial"/>
+          <w:b/>
+          <w:bCs/>
+          <w:color w:val="3d3a39"/>
+          <w:sz w:val="32"/>
+          <w:szCs w:val="32"/>
+        </w:rPr>
         <w:t xml:space="preserve">Anhang: Begriffsklärung</w:t>
       </w:r>
     </w:p>
@@ -35807,15 +36514,15 @@
           <w:sz w:val="22"/>
           <w:szCs w:val="22"/>
         </w:rPr>
-        <w:t xml:space="preserve">Stornofrist 14 Tage (Welle H): </w:t>
-      </w:r>
-      <w:r>
-        <w:rPr>
-          <w:rFonts w:ascii="Arial" w:cs="Arial" w:eastAsia="Arial" w:hAnsi="Arial"/>
-          <w:sz w:val="22"/>
-          <w:szCs w:val="22"/>
-        </w:rPr>
-        <w:t xml:space="preserve">Neue Frist seit 25.05.2026 — kostenfreier Rücktritt bis 14 Tage vor Kursbeginn, danach 30 € Bearbeitungsgebühr bis 7 Tage vorher, danach volle Kursgebühr.</w:t>
+        <w:t xml:space="preserve">Stornofrist 14 Tage: </w:t>
+      </w:r>
+      <w:r>
+        <w:rPr>
+          <w:rFonts w:ascii="Arial" w:cs="Arial" w:eastAsia="Arial" w:hAnsi="Arial"/>
+          <w:sz w:val="22"/>
+          <w:szCs w:val="22"/>
+        </w:rPr>
+        <w:t xml:space="preserve">Kostenfreier Rücktritt bis 14 Tage vor Kursbeginn, danach „gebucht ist gebucht" (volle Kursgebühr). Ersatzteilnehmer jederzeit möglich. (Frühere 30-€-Zwischenstufe entfällt seit 31.05.2026.)</w:t>
       </w:r>
     </w:p>
     <w:p>
@@ -35908,6 +36615,425 @@
           <w:szCs w:val="22"/>
         </w:rPr>
         <w:t xml:space="preserve">Seit 25.05.2026 ist die Geld-Erstattung (§ 326 BGB) der Default bei Kursabbruch ohne Yogi-Antwort. Bisher war es „Guthaben" — bewusst umgestellt.</w:t>
+      </w:r>
+    </w:p>
+    <w:p>
+      <w:r>
+        <w:br w:type="page"/>
+      </w:r>
+    </w:p>
+    <w:p>
+      <w:pPr>
+        <w:pStyle w:val="Heading1"/>
+        <w:spacing w:after="160" w:before="360"/>
+      </w:pPr>
+      <w:r>
+        <w:rPr>
+          <w:rFonts w:ascii="Arial" w:cs="Arial" w:eastAsia="Arial" w:hAnsi="Arial"/>
+          <w:b/>
+          <w:bCs/>
+          <w:color w:val="3d3a39"/>
+          <w:sz w:val="32"/>
+          <w:szCs w:val="32"/>
+        </w:rPr>
+        <w:t xml:space="preserve">Stand 2026-06-03 — Live-Stabilisierung, lückenloses Protokoll &amp; Admin-Ansicht</w:t>
+      </w:r>
+    </w:p>
+    <w:p>
+      <w:pPr>
+        <w:spacing w:after="80"/>
+      </w:pPr>
+      <w:r>
+        <w:rPr>
+          <w:rFonts w:ascii="Arial" w:cs="Arial" w:eastAsia="Arial" w:hAnsi="Arial"/>
+          <w:sz w:val="22"/>
+          <w:szCs w:val="22"/>
+        </w:rPr>
+        <w:t xml:space="preserve">Mit den ersten echten Nutzern auf der Live-App wurden mehrere Dinge nachgezogen. Alles wurde zuerst auf einer Test-Umgebung (Staging) gebaut und geprüft und erst nach Freigabe auf die Live-App übernommen.</w:t>
+      </w:r>
+    </w:p>
+    <w:p>
+      <w:pPr>
+        <w:pStyle w:val="Heading2"/>
+        <w:spacing w:after="100" w:before="240"/>
+      </w:pPr>
+      <w:r>
+        <w:rPr>
+          <w:rFonts w:ascii="Arial" w:cs="Arial" w:eastAsia="Arial" w:hAnsi="Arial"/>
+          <w:b/>
+          <w:bCs/>
+          <w:color w:val="8a6020"/>
+          <w:sz w:val="26"/>
+          <w:szCs w:val="26"/>
+        </w:rPr>
+        <w:t xml:space="preserve">1. Protokoll: zwei bisher fehlende Vorgänge werden jetzt erfasst</w:t>
+      </w:r>
+    </w:p>
+    <w:p>
+      <w:pPr>
+        <w:pStyle w:val="ListParagraph"/>
+        <w:numPr>
+          <w:ilvl w:val="0"/>
+          <w:numId w:val="1"/>
+        </w:numPr>
+        <w:spacing w:after="40"/>
+      </w:pPr>
+      <w:r>
+        <w:rPr>
+          <w:rFonts w:ascii="Arial" w:cs="Arial" w:eastAsia="Arial" w:hAnsi="Arial"/>
+          <w:sz w:val="22"/>
+          <w:szCs w:val="22"/>
+        </w:rPr>
+        <w:t xml:space="preserve">Registriert sich ein Yogi über einen Einladungslink und wird dadurch in einen Kurs eingebucht, steht das jetzt im Protokoll und in der Yogi-Historie („Per Einladung eingetragen") — inklusive Kurs und Stundenzahl.</w:t>
+      </w:r>
+    </w:p>
+    <w:p>
+      <w:pPr>
+        <w:pStyle w:val="ListParagraph"/>
+        <w:numPr>
+          <w:ilvl w:val="0"/>
+          <w:numId w:val="1"/>
+        </w:numPr>
+        <w:spacing w:after="40"/>
+      </w:pPr>
+      <w:r>
+        <w:rPr>
+          <w:rFonts w:ascii="Arial" w:cs="Arial" w:eastAsia="Arial" w:hAnsi="Arial"/>
+          <w:sz w:val="22"/>
+          <w:szCs w:val="22"/>
+        </w:rPr>
+        <w:t xml:space="preserve">Trägt sich ein Yogi über den Abmelde-Link selbst von der Warteliste aus, steht auch das jetzt im Protokoll („Warteliste verlassen (selbst)").</w:t>
+      </w:r>
+    </w:p>
+    <w:p>
+      <w:pPr>
+        <w:pStyle w:val="ListParagraph"/>
+        <w:numPr>
+          <w:ilvl w:val="0"/>
+          <w:numId w:val="1"/>
+        </w:numPr>
+        <w:spacing w:after="40"/>
+      </w:pPr>
+      <w:r>
+        <w:rPr>
+          <w:rFonts w:ascii="Arial" w:cs="Arial" w:eastAsia="Arial" w:hAnsi="Arial"/>
+          <w:sz w:val="22"/>
+          <w:szCs w:val="22"/>
+        </w:rPr>
+        <w:t xml:space="preserve">Technisch abgesichert: Selbst wenn das Schreiben des Protokoll-Eintrags einmal scheitern würde, läuft die eigentliche Aktion (Einbuchung bzw. Austragen) trotzdem normal durch.</w:t>
+      </w:r>
+    </w:p>
+    <w:p>
+      <w:pPr>
+        <w:pStyle w:val="ListParagraph"/>
+        <w:numPr>
+          <w:ilvl w:val="0"/>
+          <w:numId w:val="1"/>
+        </w:numPr>
+        <w:spacing w:after="40"/>
+      </w:pPr>
+      <w:r>
+        <w:rPr>
+          <w:rFonts w:ascii="Arial" w:cs="Arial" w:eastAsia="Arial" w:hAnsi="Arial"/>
+          <w:sz w:val="22"/>
+          <w:szCs w:val="22"/>
+        </w:rPr>
+        <w:t xml:space="preserve">Hinweis: Normale Yogi-Selbstbuchungen und -Stornierungen wurden schon immer protokolliert — die waren nie betroffen.</w:t>
+      </w:r>
+    </w:p>
+    <w:p>
+      <w:pPr>
+        <w:pStyle w:val="Heading2"/>
+        <w:spacing w:after="100" w:before="240"/>
+      </w:pPr>
+      <w:r>
+        <w:rPr>
+          <w:rFonts w:ascii="Arial" w:cs="Arial" w:eastAsia="Arial" w:hAnsi="Arial"/>
+          <w:b/>
+          <w:bCs/>
+          <w:color w:val="8a6020"/>
+          <w:sz w:val="26"/>
+          <w:szCs w:val="26"/>
+        </w:rPr>
+        <w:t xml:space="preserve">2. Admin-Dashboard: die 3 Kacheln zeigen die Yogi-Aktivität der Woche</w:t>
+      </w:r>
+    </w:p>
+    <w:p>
+      <w:pPr>
+        <w:pStyle w:val="ListParagraph"/>
+        <w:numPr>
+          <w:ilvl w:val="0"/>
+          <w:numId w:val="1"/>
+        </w:numPr>
+        <w:spacing w:after="40"/>
+      </w:pPr>
+      <w:r>
+        <w:rPr>
+          <w:rFonts w:ascii="Arial" w:cs="Arial" w:eastAsia="Arial" w:hAnsi="Arial"/>
+          <w:sz w:val="22"/>
+          <w:szCs w:val="22"/>
+        </w:rPr>
+        <w:t xml:space="preserve">Die drei Kacheln zählen jetzt, wie oft in der jeweiligen Woche Yogis selbst gebucht, sich selbst ausgetragen oder sich auf die Warteliste gesetzt haben.</w:t>
+      </w:r>
+    </w:p>
+    <w:p>
+      <w:pPr>
+        <w:pStyle w:val="ListParagraph"/>
+        <w:numPr>
+          <w:ilvl w:val="0"/>
+          <w:numId w:val="1"/>
+        </w:numPr>
+        <w:spacing w:after="40"/>
+      </w:pPr>
+      <w:r>
+        <w:rPr>
+          <w:rFonts w:ascii="Arial" w:cs="Arial" w:eastAsia="Arial" w:hAnsi="Arial"/>
+          <w:sz w:val="22"/>
+          <w:szCs w:val="22"/>
+        </w:rPr>
+        <w:t xml:space="preserve">Ein Klick auf eine Kachel zeigt genau diese Einträge (vorher kam beim Klick nichts).</w:t>
+      </w:r>
+    </w:p>
+    <w:p>
+      <w:pPr>
+        <w:pStyle w:val="Heading2"/>
+        <w:spacing w:after="100" w:before="240"/>
+      </w:pPr>
+      <w:r>
+        <w:rPr>
+          <w:rFonts w:ascii="Arial" w:cs="Arial" w:eastAsia="Arial" w:hAnsi="Arial"/>
+          <w:b/>
+          <w:bCs/>
+          <w:color w:val="8a6020"/>
+          <w:sz w:val="26"/>
+          <w:szCs w:val="26"/>
+        </w:rPr>
+        <w:t xml:space="preserve">3. „Neue Version verfügbar"-Banner nur noch auf Knopfdruck</w:t>
+      </w:r>
+    </w:p>
+    <w:p>
+      <w:pPr>
+        <w:pStyle w:val="ListParagraph"/>
+        <w:numPr>
+          <w:ilvl w:val="0"/>
+          <w:numId w:val="1"/>
+        </w:numPr>
+        <w:spacing w:after="40"/>
+      </w:pPr>
+      <w:r>
+        <w:rPr>
+          <w:rFonts w:ascii="Arial" w:cs="Arial" w:eastAsia="Arial" w:hAnsi="Arial"/>
+          <w:sz w:val="22"/>
+          <w:szCs w:val="22"/>
+        </w:rPr>
+        <w:t xml:space="preserve">Das Banner erscheint nur noch, wenn du es im Admin-Profil aktiv auslöst — nicht mehr automatisch bei jedem Update.</w:t>
+      </w:r>
+    </w:p>
+    <w:p>
+      <w:pPr>
+        <w:pStyle w:val="Heading2"/>
+        <w:spacing w:after="100" w:before="240"/>
+      </w:pPr>
+      <w:r>
+        <w:rPr>
+          <w:rFonts w:ascii="Arial" w:cs="Arial" w:eastAsia="Arial" w:hAnsi="Arial"/>
+          <w:b/>
+          <w:bCs/>
+          <w:color w:val="8a6020"/>
+          <w:sz w:val="26"/>
+          <w:szCs w:val="26"/>
+        </w:rPr>
+        <w:t xml:space="preserve">4. Admin-Benachrichtigung bei Neu-Registrierung kommt wieder an</w:t>
+      </w:r>
+    </w:p>
+    <w:p>
+      <w:pPr>
+        <w:pStyle w:val="ListParagraph"/>
+        <w:numPr>
+          <w:ilvl w:val="0"/>
+          <w:numId w:val="1"/>
+        </w:numPr>
+        <w:spacing w:after="40"/>
+      </w:pPr>
+      <w:r>
+        <w:rPr>
+          <w:rFonts w:ascii="Arial" w:cs="Arial" w:eastAsia="Arial" w:hAnsi="Arial"/>
+          <w:sz w:val="22"/>
+          <w:szCs w:val="22"/>
+        </w:rPr>
+        <w:t xml:space="preserve">Bei jeder Yogi-Registrierung geht wieder eine E-Mail an Mail@yogamitsarah.me. Eine interne Schutzregel hatte diese Mail bisher fälschlich unterdrückt.</w:t>
+      </w:r>
+    </w:p>
+    <w:p>
+      <w:pPr>
+        <w:pStyle w:val="Heading2"/>
+        <w:spacing w:after="100" w:before="240"/>
+      </w:pPr>
+      <w:r>
+        <w:rPr>
+          <w:rFonts w:ascii="Arial" w:cs="Arial" w:eastAsia="Arial" w:hAnsi="Arial"/>
+          <w:b/>
+          <w:bCs/>
+          <w:color w:val="8a6020"/>
+          <w:sz w:val="26"/>
+          <w:szCs w:val="26"/>
+        </w:rPr>
+        <w:t xml:space="preserve">5. Stabiler Admin-Zugang (kein „Rauswurf" mehr in die Yogi-Ansicht)</w:t>
+      </w:r>
+    </w:p>
+    <w:p>
+      <w:pPr>
+        <w:pStyle w:val="ListParagraph"/>
+        <w:numPr>
+          <w:ilvl w:val="0"/>
+          <w:numId w:val="1"/>
+        </w:numPr>
+        <w:spacing w:after="40"/>
+      </w:pPr>
+      <w:r>
+        <w:rPr>
+          <w:rFonts w:ascii="Arial" w:cs="Arial" w:eastAsia="Arial" w:hAnsi="Arial"/>
+          <w:sz w:val="22"/>
+          <w:szCs w:val="22"/>
+        </w:rPr>
+        <w:t xml:space="preserve">Früher konnte ein kurzer Verbindungs-Hänger den Admin ohne Seitenmenü in die Yogi-Ansicht werfen — ohne Weg zum Logout. Das passiert nicht mehr.</w:t>
+      </w:r>
+    </w:p>
+    <w:p>
+      <w:pPr>
+        <w:pStyle w:val="ListParagraph"/>
+        <w:numPr>
+          <w:ilvl w:val="0"/>
+          <w:numId w:val="1"/>
+        </w:numPr>
+        <w:spacing w:after="40"/>
+      </w:pPr>
+      <w:r>
+        <w:rPr>
+          <w:rFonts w:ascii="Arial" w:cs="Arial" w:eastAsia="Arial" w:hAnsi="Arial"/>
+          <w:sz w:val="22"/>
+          <w:szCs w:val="22"/>
+        </w:rPr>
+        <w:t xml:space="preserve">Bei einem kurzen Hänger erscheint jetzt ein klarer Hinweis „Sitzung konnte nicht geladen werden — Neu laden / Neu anmelden" statt einer Sackgasse.</w:t>
+      </w:r>
+    </w:p>
+    <w:p>
+      <w:pPr>
+        <w:pStyle w:val="Heading2"/>
+        <w:spacing w:after="100" w:before="240"/>
+      </w:pPr>
+      <w:r>
+        <w:rPr>
+          <w:rFonts w:ascii="Arial" w:cs="Arial" w:eastAsia="Arial" w:hAnsi="Arial"/>
+          <w:b/>
+          <w:bCs/>
+          <w:color w:val="8a6020"/>
+          <w:sz w:val="26"/>
+          <w:szCs w:val="26"/>
+        </w:rPr>
+        <w:t xml:space="preserve">6. Admin landet immer im Admin-Bereich</w:t>
+      </w:r>
+    </w:p>
+    <w:p>
+      <w:pPr>
+        <w:pStyle w:val="ListParagraph"/>
+        <w:numPr>
+          <w:ilvl w:val="0"/>
+          <w:numId w:val="1"/>
+        </w:numPr>
+        <w:spacing w:after="40"/>
+      </w:pPr>
+      <w:r>
+        <w:rPr>
+          <w:rFonts w:ascii="Arial" w:cs="Arial" w:eastAsia="Arial" w:hAnsi="Arial"/>
+          <w:sz w:val="22"/>
+          <w:szCs w:val="22"/>
+        </w:rPr>
+        <w:t xml:space="preserve">Als Admin landest du automatisch im Admin-Dashboard mit Seitenmenü (Sidebar) — nie auf der Yogi-Startseite, egal über welchen Link du hereinkommst.</w:t>
+      </w:r>
+    </w:p>
+    <w:p>
+      <w:pPr>
+        <w:pStyle w:val="ListParagraph"/>
+        <w:numPr>
+          <w:ilvl w:val="0"/>
+          <w:numId w:val="1"/>
+        </w:numPr>
+        <w:spacing w:after="40"/>
+      </w:pPr>
+      <w:r>
+        <w:rPr>
+          <w:rFonts w:ascii="Arial" w:cs="Arial" w:eastAsia="Arial" w:hAnsi="Arial"/>
+          <w:sz w:val="22"/>
+          <w:szCs w:val="22"/>
+        </w:rPr>
+        <w:t xml:space="preserve">Am Laptop gilt für Admins immer die Sidebar (kein unteres Menü).</w:t>
+      </w:r>
+    </w:p>
+    <w:p>
+      <w:pPr>
+        <w:pStyle w:val="Heading2"/>
+        <w:spacing w:after="100" w:before="240"/>
+      </w:pPr>
+      <w:r>
+        <w:rPr>
+          <w:rFonts w:ascii="Arial" w:cs="Arial" w:eastAsia="Arial" w:hAnsi="Arial"/>
+          <w:b/>
+          <w:bCs/>
+          <w:color w:val="8a6020"/>
+          <w:sz w:val="26"/>
+          <w:szCs w:val="26"/>
+        </w:rPr>
+        <w:t xml:space="preserve">7. Hinweis für Yogis: „Unsichere App"-Warnung bei der Installation (Android)</w:t>
+      </w:r>
+    </w:p>
+    <w:p>
+      <w:pPr>
+        <w:spacing w:after="80"/>
+      </w:pPr>
+      <w:r>
+        <w:rPr>
+          <w:rFonts w:ascii="Arial" w:cs="Arial" w:eastAsia="Arial" w:hAnsi="Arial"/>
+          <w:sz w:val="22"/>
+          <w:szCs w:val="22"/>
+        </w:rPr>
+        <w:t xml:space="preserve">Beim Installieren auf manchen Android-Handys (vor allem über den Samsung-Browser) zeigt Google Play Protect manchmal „Unsichere App / für ältere Android-Version". Das ist harmlos und kein Fehler der App.</w:t>
+      </w:r>
+    </w:p>
+    <w:p>
+      <w:pPr>
+        <w:pStyle w:val="ListParagraph"/>
+        <w:numPr>
+          <w:ilvl w:val="0"/>
+          <w:numId w:val="1"/>
+        </w:numPr>
+        <w:spacing w:after="40"/>
+      </w:pPr>
+      <w:r>
+        <w:rPr>
+          <w:rFonts w:ascii="Arial" w:cs="Arial" w:eastAsia="Arial" w:hAnsi="Arial"/>
+          <w:sz w:val="22"/>
+          <w:szCs w:val="22"/>
+        </w:rPr>
+        <w:t xml:space="preserve">Empfehlung: Installation über Chrome (Android) bzw. Safari (Apple).</w:t>
+      </w:r>
+    </w:p>
+    <w:p>
+      <w:pPr>
+        <w:pStyle w:val="ListParagraph"/>
+        <w:numPr>
+          <w:ilvl w:val="0"/>
+          <w:numId w:val="1"/>
+        </w:numPr>
+        <w:spacing w:after="40"/>
+      </w:pPr>
+      <w:r>
+        <w:rPr>
+          <w:rFonts w:ascii="Arial" w:cs="Arial" w:eastAsia="Arial" w:hAnsi="Arial"/>
+          <w:sz w:val="22"/>
+          <w:szCs w:val="22"/>
+        </w:rPr>
+        <w:t xml:space="preserve">Die Warnung lässt sich mit „Trotzdem installieren" gefahrlos bestätigen.</w:t>
       </w:r>
     </w:p>
     <w:sectPr>

</xml_diff>